<commit_message>
Upload ExcelDataDriven project with exercises using sheets of execel to manege data driven testing
</commit_message>
<xml_diff>
--- a/Selenium Tutorial.docx
+++ b/Selenium Tutorial.docx
@@ -23,7 +23,6 @@
       </w:r>
     </w:p>
     <w:p>
-      <w:proofErr w:type="spellStart"/>
       <w:r>
         <w:rPr>
           <w:b/>
@@ -31,41 +30,19 @@
         </w:rPr>
         <w:t>SelectorHub</w:t>
       </w:r>
-      <w:proofErr w:type="spellEnd"/>
       <w:r>
         <w:t xml:space="preserve"> is a plugin that helps us verify when a CSS selector is used — use only one in the code or more.</w:t>
       </w:r>
     </w:p>
     <w:p>
       <w:r>
-        <w:t xml:space="preserve">I can validate the identifier to use in locators </w:t>
-      </w:r>
-      <w:proofErr w:type="spellStart"/>
-      <w:r>
-        <w:t>cssSelector</w:t>
-      </w:r>
-      <w:proofErr w:type="spellEnd"/>
-      <w:r>
-        <w:t xml:space="preserve"> or </w:t>
-      </w:r>
-      <w:proofErr w:type="spellStart"/>
-      <w:r>
-        <w:t>xpath</w:t>
-      </w:r>
-      <w:proofErr w:type="spellEnd"/>
-      <w:r>
-        <w:t xml:space="preserve"> through the next two ways:</w:t>
-      </w:r>
-    </w:p>
-    <w:p>
-      <w:r>
-        <w:t xml:space="preserve">• Using the plugin </w:t>
-      </w:r>
-      <w:proofErr w:type="spellStart"/>
-      <w:r>
-        <w:t>SelectorHub</w:t>
-      </w:r>
-      <w:proofErr w:type="spellEnd"/>
+        <w:t>I can validate the identifier to use in locators cssSelector or xpath through the next two ways:</w:t>
+      </w:r>
+    </w:p>
+    <w:p>
+      <w:r>
+        <w:t>• Using the plugin SelectorHub</w:t>
+      </w:r>
     </w:p>
     <w:p>
       <w:r>
@@ -84,7 +61,6 @@
         </w:rPr>
         <w:t>o $('</w:t>
       </w:r>
-      <w:proofErr w:type="spellStart"/>
       <w:proofErr w:type="gramStart"/>
       <w:r>
         <w:rPr>
@@ -92,482 +68,349 @@
         </w:rPr>
         <w:t>p.error</w:t>
       </w:r>
-      <w:proofErr w:type="spellEnd"/>
       <w:proofErr w:type="gramEnd"/>
       <w:r>
         <w:rPr>
           <w:lang w:val="es-CR"/>
         </w:rPr>
-        <w:t xml:space="preserve">') → </w:t>
-      </w:r>
-      <w:proofErr w:type="spellStart"/>
-      <w:r>
+        <w:t>') → cssSelector</w:t>
+      </w:r>
+    </w:p>
+    <w:p>
+      <w:pPr>
         <w:rPr>
           <w:lang w:val="es-CR"/>
         </w:rPr>
-        <w:t>cssSelector</w:t>
-      </w:r>
-      <w:proofErr w:type="spellEnd"/>
-    </w:p>
-    <w:p>
-      <w:pPr>
+      </w:pPr>
+      <w:r>
         <w:rPr>
           <w:lang w:val="es-CR"/>
         </w:rPr>
-      </w:pPr>
-      <w:r>
+        <w:t>o $x('//tagname[@attribute="name"]')</w:t>
+      </w:r>
+    </w:p>
+    <w:p>
+      <w:pPr>
+        <w:rPr>
+          <w:b/>
+          <w:bCs/>
+        </w:rPr>
+      </w:pPr>
+      <w:r>
+        <w:rPr>
+          <w:b/>
+          <w:bCs/>
+        </w:rPr>
+        <w:t>Waits in Selenium</w:t>
+      </w:r>
+      <w:r>
+        <w:rPr>
+          <w:b/>
+          <w:bCs/>
+        </w:rPr>
+        <w:t>:</w:t>
+      </w:r>
+    </w:p>
+    <w:p>
+      <w:r>
+        <w:t xml:space="preserve">• Implicit </w:t>
+      </w:r>
+      <w:proofErr w:type="gramStart"/>
+      <w:r>
+        <w:t>wait(</w:t>
+      </w:r>
+      <w:proofErr w:type="gramEnd"/>
+      <w:r>
+        <w:t>): Is used to configure a wait in all call types findElement or findElements in the Selenium framework. The program only waits until the element appears, not for all the time configured.</w:t>
+      </w:r>
+    </w:p>
+    <w:p>
+      <w:r>
+        <w:t xml:space="preserve">• Explicit </w:t>
+      </w:r>
+      <w:proofErr w:type="gramStart"/>
+      <w:r>
+        <w:t>wait(</w:t>
+      </w:r>
+      <w:proofErr w:type="gramEnd"/>
+      <w:r>
+        <w:t>): Is used to manage manual waits in selected sections of a Selenium program. For example, you can configure a wait in the section of code that opens a new window. I can use this to force the program to wait until the view render appears, not for all the time configured.</w:t>
+      </w:r>
+    </w:p>
+    <w:p>
+      <w:r>
+        <w:t>• Fluent wait(): Is used when I need to configure not only the wait time and the specific element to wait for, but also how often Selenium checks whether the condition has been successfully met, and which exceptions can be ignored.</w:t>
+      </w:r>
+    </w:p>
+    <w:p>
+      <w:r>
+        <w:t>• Thread.sleep(): Is not the best option because it forces the program to wait the exact time — no more, no less.</w:t>
+      </w:r>
+    </w:p>
+    <w:p>
+      <w:pPr>
+        <w:rPr>
+          <w:b/>
+          <w:bCs/>
+        </w:rPr>
+      </w:pPr>
+      <w:r>
+        <w:rPr>
+          <w:b/>
+          <w:bCs/>
+        </w:rPr>
+        <w:t>Siblings and XPath traverse:</w:t>
+      </w:r>
+    </w:p>
+    <w:p>
+      <w:r>
+        <w:t>• parent::</w:t>
+      </w:r>
+    </w:p>
+    <w:p>
+      <w:r>
+        <w:t>• child::</w:t>
+      </w:r>
+    </w:p>
+    <w:p>
+      <w:r>
+        <w:t>• following-sibling::</w:t>
+      </w:r>
+    </w:p>
+    <w:p>
+      <w:r>
+        <w:t>• preceding-sibling::</w:t>
+      </w:r>
+    </w:p>
+    <w:p>
+      <w:pPr>
+        <w:rPr>
+          <w:b/>
+          <w:bCs/>
+        </w:rPr>
+      </w:pPr>
+      <w:r>
+        <w:rPr>
+          <w:b/>
+          <w:bCs/>
+        </w:rPr>
+        <w:t>Handle dynamic dropdowns:</w:t>
+      </w:r>
+    </w:p>
+    <w:p>
+      <w:r>
+        <w:t>• size(): Used to obtain the length of a list.</w:t>
+      </w:r>
+    </w:p>
+    <w:p>
+      <w:r>
+        <w:t>• length(): Used to obtain the size of an array.</w:t>
+      </w:r>
+    </w:p>
+    <w:p>
+      <w:r>
+        <w:t>• When we have two elements located within only one XPath, I can use this to differentiate: ('xpath')[index]</w:t>
+      </w:r>
+    </w:p>
+    <w:p>
+      <w:r>
+        <w:t>• normalize-space(): Trims white spaces.</w:t>
+      </w:r>
+    </w:p>
+    <w:p>
+      <w:pPr>
+        <w:rPr>
+          <w:b/>
+          <w:bCs/>
+        </w:rPr>
+      </w:pPr>
+      <w:r>
+        <w:rPr>
+          <w:b/>
+          <w:bCs/>
+        </w:rPr>
+        <w:t>Handle scroll:</w:t>
+      </w:r>
+    </w:p>
+    <w:p>
+      <w:r>
+        <w:t>First, cast the driver to JavascriptExecutor to access additional functions, then use executeScript.</w:t>
+      </w:r>
+    </w:p>
+    <w:p>
+      <w:r>
+        <w:t>Downcasting is from child to parent; upcasting is from parent to child.</w:t>
+      </w:r>
+    </w:p>
+    <w:p>
+      <w:r>
+        <w:t>Common configurations of Selenium:</w:t>
+      </w:r>
+    </w:p>
+    <w:p>
+      <w:r>
+        <w:t>• Set a proxy</w:t>
+      </w:r>
+    </w:p>
+    <w:p>
+      <w:pPr>
         <w:rPr>
           <w:lang w:val="es-CR"/>
         </w:rPr>
-        <w:t>o $x('//</w:t>
-      </w:r>
-      <w:proofErr w:type="spellStart"/>
+      </w:pPr>
+      <w:r>
+        <w:rPr>
+          <w:rFonts w:ascii="Segoe UI Emoji" w:hAnsi="Segoe UI Emoji" w:cs="Segoe UI Emoji"/>
+        </w:rPr>
+        <w:t>🔹</w:t>
+      </w:r>
       <w:r>
         <w:rPr>
           <w:lang w:val="es-CR"/>
         </w:rPr>
-        <w:t>tagname</w:t>
-      </w:r>
-      <w:proofErr w:type="spellEnd"/>
-      <w:r>
+        <w:t xml:space="preserve"> 1. ¿Para qué es útil un proxy en pruebas?</w:t>
+      </w:r>
+    </w:p>
+    <w:p>
+      <w:pPr>
         <w:rPr>
           <w:lang w:val="es-CR"/>
         </w:rPr>
-        <w:t>[@attribute="name"]')</w:t>
-      </w:r>
-    </w:p>
-    <w:p>
-      <w:pPr>
-        <w:rPr>
-          <w:b/>
-          <w:bCs/>
-        </w:rPr>
-      </w:pPr>
-      <w:r>
-        <w:rPr>
-          <w:b/>
-          <w:bCs/>
-        </w:rPr>
-        <w:t>Waits in Selenium</w:t>
-      </w:r>
-      <w:r>
-        <w:rPr>
-          <w:b/>
-          <w:bCs/>
-        </w:rPr>
-        <w:t>:</w:t>
-      </w:r>
-    </w:p>
-    <w:p>
-      <w:r>
-        <w:t xml:space="preserve">• Implicit </w:t>
-      </w:r>
-      <w:proofErr w:type="gramStart"/>
-      <w:r>
-        <w:t>wait(</w:t>
-      </w:r>
-      <w:proofErr w:type="gramEnd"/>
-      <w:r>
-        <w:t xml:space="preserve">): Is used to configure a wait in all call types </w:t>
-      </w:r>
-      <w:proofErr w:type="spellStart"/>
-      <w:r>
-        <w:t>findElement</w:t>
-      </w:r>
-      <w:proofErr w:type="spellEnd"/>
-      <w:r>
-        <w:t xml:space="preserve"> or </w:t>
-      </w:r>
-      <w:proofErr w:type="spellStart"/>
-      <w:r>
-        <w:t>findElements</w:t>
-      </w:r>
-      <w:proofErr w:type="spellEnd"/>
-      <w:r>
-        <w:t xml:space="preserve"> in the Selenium framework. The program only waits until the element appears, not for all the time configured.</w:t>
-      </w:r>
-    </w:p>
-    <w:p>
-      <w:r>
-        <w:t xml:space="preserve">• Explicit </w:t>
-      </w:r>
-      <w:proofErr w:type="gramStart"/>
-      <w:r>
-        <w:t>wait(</w:t>
-      </w:r>
-      <w:proofErr w:type="gramEnd"/>
-      <w:r>
-        <w:t>): Is used to manage manual waits in selected sections of a Selenium program. For example, you can configure a wait in the section of code that opens a new window. I can use this to force the program to wait until the view render appears, not for all the time configured.</w:t>
-      </w:r>
-    </w:p>
-    <w:p>
-      <w:r>
-        <w:t>• Fluent wait(): Is used when I need to configure not only the wait time and the specific element to wait for, but also how often Selenium checks whether the condition has been successfully met, and which exceptions can be ignored.</w:t>
-      </w:r>
-    </w:p>
-    <w:p>
-      <w:r>
-        <w:t xml:space="preserve">• </w:t>
-      </w:r>
-      <w:proofErr w:type="spellStart"/>
-      <w:r>
-        <w:t>Thread.sleep</w:t>
-      </w:r>
-      <w:proofErr w:type="spellEnd"/>
-      <w:r>
-        <w:t>(): Is not the best option because it forces the program to wait the exact time — no more, no less.</w:t>
-      </w:r>
-    </w:p>
-    <w:p>
-      <w:pPr>
-        <w:rPr>
-          <w:b/>
-          <w:bCs/>
-        </w:rPr>
-      </w:pPr>
-      <w:r>
-        <w:rPr>
-          <w:b/>
-          <w:bCs/>
-        </w:rPr>
-        <w:t>Siblings and XPath traverse:</w:t>
-      </w:r>
-    </w:p>
-    <w:p>
-      <w:r>
-        <w:t>• parent::</w:t>
-      </w:r>
-    </w:p>
-    <w:p>
-      <w:r>
-        <w:t>• child::</w:t>
-      </w:r>
-    </w:p>
-    <w:p>
-      <w:r>
-        <w:t>• following-sibling::</w:t>
-      </w:r>
-    </w:p>
-    <w:p>
-      <w:r>
-        <w:t>• preceding-sibling::</w:t>
-      </w:r>
-    </w:p>
-    <w:p>
-      <w:pPr>
-        <w:rPr>
-          <w:b/>
-          <w:bCs/>
-        </w:rPr>
-      </w:pPr>
-      <w:r>
-        <w:rPr>
-          <w:b/>
-          <w:bCs/>
-        </w:rPr>
-        <w:lastRenderedPageBreak/>
-        <w:t>Handle dynamic dropdowns:</w:t>
-      </w:r>
-    </w:p>
-    <w:p>
-      <w:r>
-        <w:t>• size(): Used to obtain the length of a list.</w:t>
-      </w:r>
-    </w:p>
-    <w:p>
-      <w:r>
-        <w:t>• length(): Used to obtain the size of an array.</w:t>
-      </w:r>
-    </w:p>
-    <w:p>
-      <w:r>
-        <w:t>• When we have two elements located within only one XPath, I can use this to differentiate: ('</w:t>
-      </w:r>
-      <w:proofErr w:type="spellStart"/>
-      <w:r>
-        <w:t>xpath</w:t>
-      </w:r>
-      <w:proofErr w:type="spellEnd"/>
-      <w:r>
-        <w:t>')[index]</w:t>
-      </w:r>
-    </w:p>
-    <w:p>
-      <w:r>
-        <w:t>• normalize-space(): Trims white spaces.</w:t>
-      </w:r>
-    </w:p>
-    <w:p>
-      <w:pPr>
-        <w:rPr>
-          <w:b/>
-          <w:bCs/>
-        </w:rPr>
-      </w:pPr>
-      <w:r>
-        <w:rPr>
-          <w:b/>
-          <w:bCs/>
-        </w:rPr>
-        <w:t>Handle scroll:</w:t>
-      </w:r>
-    </w:p>
-    <w:p>
-      <w:r>
-        <w:t xml:space="preserve">First, cast the driver to </w:t>
-      </w:r>
-      <w:proofErr w:type="spellStart"/>
-      <w:r>
-        <w:t>JavascriptExecutor</w:t>
-      </w:r>
-      <w:proofErr w:type="spellEnd"/>
-      <w:r>
-        <w:t xml:space="preserve"> to access additional functions, then use </w:t>
-      </w:r>
-      <w:proofErr w:type="spellStart"/>
-      <w:r>
-        <w:t>executeScript</w:t>
-      </w:r>
-      <w:proofErr w:type="spellEnd"/>
-      <w:r>
-        <w:t>.</w:t>
-      </w:r>
-    </w:p>
-    <w:p>
-      <w:proofErr w:type="spellStart"/>
-      <w:r>
-        <w:t>Downcasting</w:t>
-      </w:r>
-      <w:proofErr w:type="spellEnd"/>
-      <w:r>
-        <w:t xml:space="preserve"> is from child to parent; upcasting is from parent to child.</w:t>
-      </w:r>
-    </w:p>
-    <w:p>
-      <w:r>
-        <w:t>Common configurations of Selenium:</w:t>
-      </w:r>
-    </w:p>
-    <w:p>
-      <w:r>
-        <w:t>• Set a proxy</w:t>
-      </w:r>
-    </w:p>
-    <w:p>
-      <w:pPr>
+      </w:pPr>
+      <w:r>
         <w:rPr>
           <w:lang w:val="es-CR"/>
         </w:rPr>
-      </w:pPr>
-      <w:r>
-        <w:rPr>
-          <w:rFonts w:ascii="Segoe UI Emoji" w:hAnsi="Segoe UI Emoji" w:cs="Segoe UI Emoji"/>
-        </w:rPr>
-        <w:t>🔹</w:t>
-      </w:r>
-      <w:r>
+        <w:t>Un proxy es un intermediario entre tu navegador (o cliente) y el servidor. En pruebas, se usa principalmente para:</w:t>
+      </w:r>
+    </w:p>
+    <w:p>
+      <w:pPr>
         <w:rPr>
           <w:lang w:val="es-CR"/>
         </w:rPr>
-        <w:t xml:space="preserve"> 1. ¿Para qué es útil un proxy en pruebas?</w:t>
-      </w:r>
-    </w:p>
-    <w:p>
-      <w:pPr>
+      </w:pPr>
+      <w:r>
         <w:rPr>
           <w:lang w:val="es-CR"/>
         </w:rPr>
-      </w:pPr>
-      <w:r>
+        <w:t>• Redirección de tráfico:</w:t>
+      </w:r>
+    </w:p>
+    <w:p>
+      <w:pPr>
         <w:rPr>
           <w:lang w:val="es-CR"/>
         </w:rPr>
-        <w:t>Un proxy es un intermediario entre tu navegador (o cliente) y el servidor. En pruebas, se usa principalmente para:</w:t>
-      </w:r>
-    </w:p>
-    <w:p>
-      <w:pPr>
+      </w:pPr>
+      <w:r>
         <w:rPr>
           <w:lang w:val="es-CR"/>
         </w:rPr>
-      </w:pPr>
-      <w:r>
+        <w:t>o Simulas que el navegador se conecta desde otra red o país.</w:t>
+      </w:r>
+    </w:p>
+    <w:p>
+      <w:pPr>
         <w:rPr>
           <w:lang w:val="es-CR"/>
         </w:rPr>
-        <w:t>• Redirección de tráfico:</w:t>
-      </w:r>
-    </w:p>
-    <w:p>
-      <w:pPr>
+      </w:pPr>
+      <w:r>
         <w:rPr>
           <w:lang w:val="es-CR"/>
         </w:rPr>
-      </w:pPr>
-      <w:r>
+        <w:t>o Ejemplo: probar cómo responde un sitio con restricciones geográficas.</w:t>
+      </w:r>
+    </w:p>
+    <w:p>
+      <w:pPr>
         <w:rPr>
           <w:lang w:val="es-CR"/>
         </w:rPr>
-        <w:t>o Simulas que el navegador se conecta desde otra red o país.</w:t>
-      </w:r>
-    </w:p>
-    <w:p>
-      <w:pPr>
+      </w:pPr>
+      <w:r>
         <w:rPr>
           <w:lang w:val="es-CR"/>
         </w:rPr>
-      </w:pPr>
-      <w:r>
+        <w:t>• Interceptar y analizar requests/responses:</w:t>
+      </w:r>
+    </w:p>
+    <w:p>
+      <w:pPr>
         <w:rPr>
           <w:lang w:val="es-CR"/>
         </w:rPr>
-        <w:t>o Ejemplo: probar cómo responde un sitio con restricciones geográficas.</w:t>
-      </w:r>
-    </w:p>
-    <w:p>
-      <w:pPr>
+      </w:pPr>
+      <w:r>
         <w:rPr>
           <w:lang w:val="es-CR"/>
         </w:rPr>
-      </w:pPr>
-      <w:r>
+        <w:t>o Puedes ver qué encabezados manda la app, si se envían cookies, tokens, etc.</w:t>
+      </w:r>
+    </w:p>
+    <w:p>
+      <w:pPr>
         <w:rPr>
           <w:lang w:val="es-CR"/>
         </w:rPr>
-        <w:t xml:space="preserve">• Interceptar y analizar </w:t>
-      </w:r>
-      <w:proofErr w:type="spellStart"/>
+      </w:pPr>
       <w:r>
         <w:rPr>
           <w:lang w:val="es-CR"/>
         </w:rPr>
-        <w:t>requests</w:t>
-      </w:r>
-      <w:proofErr w:type="spellEnd"/>
-      <w:r>
+        <w:t>o Útil en QA para validar seguridad, autenticación, performance o que los requests cumplan con los estándares.</w:t>
+      </w:r>
+    </w:p>
+    <w:p>
+      <w:pPr>
         <w:rPr>
           <w:lang w:val="es-CR"/>
         </w:rPr>
-        <w:t>/responses:</w:t>
-      </w:r>
-    </w:p>
-    <w:p>
-      <w:pPr>
+      </w:pPr>
+      <w:r>
         <w:rPr>
           <w:lang w:val="es-CR"/>
         </w:rPr>
-      </w:pPr>
-      <w:r>
+        <w:t>• Pruebas en entornos restringidos:</w:t>
+      </w:r>
+    </w:p>
+    <w:p>
+      <w:pPr>
         <w:rPr>
           <w:lang w:val="es-CR"/>
         </w:rPr>
-        <w:t>o Puedes ver qué encabezados manda la app, si se envían cookies, tokens, etc.</w:t>
-      </w:r>
-    </w:p>
-    <w:p>
-      <w:pPr>
+      </w:pPr>
+      <w:r>
         <w:rPr>
           <w:lang w:val="es-CR"/>
         </w:rPr>
-      </w:pPr>
-      <w:r>
+        <w:t>o Cuando la red corporativa solo permite salir a internet mediante un proxy.</w:t>
+      </w:r>
+    </w:p>
+    <w:p>
+      <w:pPr>
         <w:rPr>
           <w:lang w:val="es-CR"/>
         </w:rPr>
-        <w:t xml:space="preserve">o Útil en QA para validar seguridad, autenticación, performance o que los </w:t>
-      </w:r>
-      <w:proofErr w:type="spellStart"/>
+      </w:pPr>
       <w:r>
         <w:rPr>
           <w:lang w:val="es-CR"/>
         </w:rPr>
-        <w:t>requests</w:t>
-      </w:r>
-      <w:proofErr w:type="spellEnd"/>
-      <w:r>
+        <w:t>• Rotación de IPs / pruebas anti-bot:</w:t>
+      </w:r>
+    </w:p>
+    <w:p>
+      <w:pPr>
         <w:rPr>
           <w:lang w:val="es-CR"/>
         </w:rPr>
-        <w:t xml:space="preserve"> cumplan con los estándares.</w:t>
-      </w:r>
-    </w:p>
-    <w:p>
-      <w:pPr>
+      </w:pPr>
+      <w:r>
         <w:rPr>
           <w:lang w:val="es-CR"/>
         </w:rPr>
-      </w:pPr>
-      <w:r>
-        <w:rPr>
-          <w:lang w:val="es-CR"/>
-        </w:rPr>
-        <w:t>• Pruebas en entornos restringidos:</w:t>
-      </w:r>
-    </w:p>
-    <w:p>
-      <w:pPr>
-        <w:rPr>
-          <w:lang w:val="es-CR"/>
-        </w:rPr>
-      </w:pPr>
-      <w:r>
-        <w:rPr>
-          <w:lang w:val="es-CR"/>
-        </w:rPr>
-        <w:t>o Cuando la red corporativa solo permite salir a internet mediante un proxy.</w:t>
-      </w:r>
-    </w:p>
-    <w:p>
-      <w:pPr>
-        <w:rPr>
-          <w:lang w:val="es-CR"/>
-        </w:rPr>
-      </w:pPr>
-      <w:r>
-        <w:rPr>
-          <w:lang w:val="es-CR"/>
-        </w:rPr>
-        <w:t xml:space="preserve">• Rotación de </w:t>
-      </w:r>
-      <w:proofErr w:type="spellStart"/>
-      <w:r>
-        <w:rPr>
-          <w:lang w:val="es-CR"/>
-        </w:rPr>
-        <w:t>IPs</w:t>
-      </w:r>
-      <w:proofErr w:type="spellEnd"/>
-      <w:r>
-        <w:rPr>
-          <w:lang w:val="es-CR"/>
-        </w:rPr>
-        <w:t xml:space="preserve"> / pruebas </w:t>
-      </w:r>
-      <w:proofErr w:type="spellStart"/>
-      <w:r>
-        <w:rPr>
-          <w:lang w:val="es-CR"/>
-        </w:rPr>
-        <w:t>anti-bot</w:t>
-      </w:r>
-      <w:proofErr w:type="spellEnd"/>
-      <w:r>
-        <w:rPr>
-          <w:lang w:val="es-CR"/>
-        </w:rPr>
-        <w:t>:</w:t>
-      </w:r>
-    </w:p>
-    <w:p>
-      <w:pPr>
-        <w:rPr>
-          <w:lang w:val="es-CR"/>
-        </w:rPr>
-      </w:pPr>
-      <w:r>
-        <w:rPr>
-          <w:lang w:val="es-CR"/>
-        </w:rPr>
         <w:t>o Simulas diferentes usuarios desde diferentes direcciones IP.</w:t>
       </w:r>
     </w:p>
@@ -578,7 +421,6 @@
     </w:p>
     <w:p>
       <w:r>
-        <w:lastRenderedPageBreak/>
         <w:t>• Set the download directory with map</w:t>
       </w:r>
     </w:p>
@@ -628,13 +470,8 @@
       </w:r>
     </w:p>
     <w:p>
-      <w:proofErr w:type="spellStart"/>
-      <w:r>
-        <w:t>forEach</w:t>
-      </w:r>
-      <w:proofErr w:type="spellEnd"/>
-      <w:r>
-        <w:t>(): Executes an action on each element.</w:t>
+      <w:r>
+        <w:t>forEach(): Executes an action on each element.</w:t>
       </w:r>
     </w:p>
     <w:p>
@@ -643,13 +480,8 @@
       </w:r>
     </w:p>
     <w:p>
-      <w:proofErr w:type="spellStart"/>
-      <w:r>
-        <w:t>concat</w:t>
-      </w:r>
-      <w:proofErr w:type="spellEnd"/>
-      <w:r>
-        <w:t>(): Joins two streams into one.</w:t>
+      <w:r>
+        <w:t>concat(): Joins two streams into one.</w:t>
       </w:r>
     </w:p>
     <w:p>
@@ -664,65 +496,32 @@
     </w:p>
     <w:p>
       <w:r>
-        <w:t>collect(</w:t>
-      </w:r>
-      <w:proofErr w:type="spellStart"/>
-      <w:r>
-        <w:t>Collectors.toList</w:t>
-      </w:r>
-      <w:proofErr w:type="spellEnd"/>
-      <w:r>
-        <w:t>()): Converts the stream into a list.</w:t>
-      </w:r>
-    </w:p>
-    <w:p>
-      <w:proofErr w:type="spellStart"/>
-      <w:r>
-        <w:t>findFirst</w:t>
-      </w:r>
-      <w:proofErr w:type="spellEnd"/>
-      <w:r>
-        <w:t>(): Returns the first element as an Optional.</w:t>
-      </w:r>
-    </w:p>
-    <w:p>
-      <w:proofErr w:type="spellStart"/>
-      <w:r>
-        <w:t>orElse</w:t>
-      </w:r>
-      <w:proofErr w:type="spellEnd"/>
-      <w:r>
-        <w:t>(): Returns a default value if Optional is empty.</w:t>
-      </w:r>
-    </w:p>
-    <w:p>
-      <w:proofErr w:type="spellStart"/>
-      <w:r>
-        <w:t>anyMatch</w:t>
-      </w:r>
-      <w:proofErr w:type="spellEnd"/>
-      <w:r>
-        <w:t>(): Returns true if at least one element matches the condition.</w:t>
-      </w:r>
-    </w:p>
-    <w:p>
-      <w:proofErr w:type="spellStart"/>
-      <w:r>
-        <w:t>allMatch</w:t>
-      </w:r>
-      <w:proofErr w:type="spellEnd"/>
-      <w:r>
-        <w:t>(): Returns true if all elements match the condition.</w:t>
-      </w:r>
-    </w:p>
-    <w:p>
-      <w:proofErr w:type="spellStart"/>
-      <w:r>
-        <w:t>noneMatch</w:t>
-      </w:r>
-      <w:proofErr w:type="spellEnd"/>
-      <w:r>
-        <w:t>(): Returns true if no elements match the condition.</w:t>
+        <w:t>collect(Collectors.toList()): Converts the stream into a list.</w:t>
+      </w:r>
+    </w:p>
+    <w:p>
+      <w:r>
+        <w:t>findFirst(): Returns the first element as an Optional.</w:t>
+      </w:r>
+    </w:p>
+    <w:p>
+      <w:r>
+        <w:t>orElse(): Returns a default value if Optional is empty.</w:t>
+      </w:r>
+    </w:p>
+    <w:p>
+      <w:r>
+        <w:t>anyMatch(): Returns true if at least one element matches the condition.</w:t>
+      </w:r>
+    </w:p>
+    <w:p>
+      <w:r>
+        <w:t>allMatch(): Returns true if all elements match the condition.</w:t>
+      </w:r>
+    </w:p>
+    <w:p>
+      <w:r>
+        <w:t>noneMatch(): Returns true if no elements match the condition.</w:t>
       </w:r>
     </w:p>
     <w:p>
@@ -769,7 +568,6 @@
           <w:b/>
           <w:bCs/>
         </w:rPr>
-        <w:lastRenderedPageBreak/>
         <w:t>TestNG</w:t>
       </w:r>
     </w:p>
@@ -822,86 +620,17 @@
         <w:t>Annotations:</w:t>
       </w:r>
       <w:r>
-        <w:t xml:space="preserve"> BeforeTest, </w:t>
-      </w:r>
-      <w:proofErr w:type="spellStart"/>
-      <w:r>
-        <w:t>AfterTest</w:t>
-      </w:r>
-      <w:proofErr w:type="spellEnd"/>
-      <w:r>
-        <w:t xml:space="preserve">, </w:t>
-      </w:r>
-      <w:proofErr w:type="spellStart"/>
-      <w:r>
-        <w:t>BeforeSuite</w:t>
-      </w:r>
-      <w:proofErr w:type="spellEnd"/>
-      <w:r>
-        <w:t xml:space="preserve">, </w:t>
-      </w:r>
-      <w:proofErr w:type="spellStart"/>
-      <w:r>
-        <w:t>AfterSuite</w:t>
-      </w:r>
-      <w:proofErr w:type="spellEnd"/>
-      <w:r>
-        <w:t xml:space="preserve">, </w:t>
-      </w:r>
-      <w:proofErr w:type="spellStart"/>
-      <w:r>
-        <w:t>BeforeClass</w:t>
-      </w:r>
-      <w:proofErr w:type="spellEnd"/>
-      <w:r>
-        <w:t xml:space="preserve">, </w:t>
-      </w:r>
-      <w:proofErr w:type="spellStart"/>
-      <w:r>
-        <w:t>AfterClass</w:t>
-      </w:r>
-      <w:proofErr w:type="spellEnd"/>
-      <w:r>
-        <w:t xml:space="preserve">, </w:t>
-      </w:r>
-      <w:proofErr w:type="spellStart"/>
-      <w:r>
-        <w:t>BeforeMethod</w:t>
-      </w:r>
-      <w:proofErr w:type="spellEnd"/>
-      <w:r>
-        <w:t xml:space="preserve">, </w:t>
-      </w:r>
-      <w:proofErr w:type="spellStart"/>
-      <w:r>
-        <w:t>AfterMethod</w:t>
-      </w:r>
-      <w:proofErr w:type="spellEnd"/>
-      <w:r>
-        <w:t>, @Parameter, @DataProvider.</w:t>
-      </w:r>
-    </w:p>
-    <w:p>
-      <w:r>
-        <w:t xml:space="preserve">Attribute annotation helper examples: Groups, enable, timeout, </w:t>
-      </w:r>
-      <w:proofErr w:type="spellStart"/>
-      <w:r>
-        <w:t>methodDependent</w:t>
-      </w:r>
-      <w:proofErr w:type="spellEnd"/>
-      <w:r>
-        <w:t>.</w:t>
-      </w:r>
-    </w:p>
-    <w:p>
-      <w:proofErr w:type="spellStart"/>
-      <w:r>
-        <w:t>alwaysRun</w:t>
-      </w:r>
-      <w:proofErr w:type="spellEnd"/>
-      <w:r>
-        <w:t>: Works to avoid skipped executions of tags marked with annotation attributes.</w:t>
+        <w:t xml:space="preserve"> BeforeTest, AfterTest, BeforeSuite, AfterSuite, BeforeClass, AfterClass, BeforeMethod, AfterMethod, @Parameter, @DataProvider.</w:t>
+      </w:r>
+    </w:p>
+    <w:p>
+      <w:r>
+        <w:t>Attribute annotation helper examples: Groups, enable, timeout, methodDependent.</w:t>
+      </w:r>
+    </w:p>
+    <w:p>
+      <w:r>
+        <w:t>alwaysRun: Works to avoid skipped executions of tags marked with annotation attributes.</w:t>
       </w:r>
     </w:p>
     <w:p>
@@ -961,59 +690,27 @@
     </w:p>
     <w:p>
       <w:r>
-        <w:t xml:space="preserve">It’s necessary to create a class and implement the </w:t>
-      </w:r>
-      <w:proofErr w:type="spellStart"/>
-      <w:r>
-        <w:t>ITestListener</w:t>
-      </w:r>
-      <w:proofErr w:type="spellEnd"/>
-      <w:r>
-        <w:t xml:space="preserve"> interface, and specify its location in the XML file.</w:t>
-      </w:r>
-    </w:p>
-    <w:p>
-      <w:proofErr w:type="spellStart"/>
-      <w:r>
-        <w:t>ITestListener</w:t>
-      </w:r>
-      <w:proofErr w:type="spellEnd"/>
-      <w:r>
-        <w:t>: At test level.</w:t>
-      </w:r>
-    </w:p>
-    <w:p>
-      <w:proofErr w:type="spellStart"/>
-      <w:r>
-        <w:lastRenderedPageBreak/>
-        <w:t>ISuiteListener</w:t>
-      </w:r>
-      <w:proofErr w:type="spellEnd"/>
-      <w:r>
-        <w:t>: At suite level.</w:t>
-      </w:r>
-    </w:p>
-    <w:p>
-      <w:proofErr w:type="spellStart"/>
-      <w:r>
-        <w:t>ITestContext</w:t>
-      </w:r>
-      <w:proofErr w:type="spellEnd"/>
-      <w:r>
-        <w:t>:</w:t>
-      </w:r>
-    </w:p>
-    <w:p>
-      <w:r>
-        <w:t xml:space="preserve">Interfaces with </w:t>
-      </w:r>
-      <w:proofErr w:type="spellStart"/>
-      <w:r>
-        <w:t>ThreadLocal</w:t>
-      </w:r>
-      <w:proofErr w:type="spellEnd"/>
-      <w:r>
-        <w:t xml:space="preserve"> to bind driver variables with their specific thread.</w:t>
+        <w:t>It’s necessary to create a class and implement the ITestListener interface, and specify its location in the XML file.</w:t>
+      </w:r>
+    </w:p>
+    <w:p>
+      <w:r>
+        <w:t>ITestListener: At test level.</w:t>
+      </w:r>
+    </w:p>
+    <w:p>
+      <w:r>
+        <w:t>ISuiteListener: At suite level.</w:t>
+      </w:r>
+    </w:p>
+    <w:p>
+      <w:r>
+        <w:t>ITestContext:</w:t>
+      </w:r>
+    </w:p>
+    <w:p>
+      <w:r>
+        <w:t>Interfaces with ThreadLocal to bind driver variables with their specific thread.</w:t>
       </w:r>
     </w:p>
     <w:p>
@@ -1047,43 +744,41 @@
           <w:iCs/>
           <w:u w:val="single"/>
         </w:rPr>
-        <w:t xml:space="preserve">Answer: Using the </w:t>
-      </w:r>
-      <w:proofErr w:type="spellStart"/>
-      <w:r>
+        <w:t>Answer: Using the ITestResult object and the method name.getName().</w:t>
+      </w:r>
+    </w:p>
+    <w:p>
+      <w:pPr>
         <w:rPr>
           <w:i/>
           <w:iCs/>
           <w:u w:val="single"/>
         </w:rPr>
-        <w:t>ITestResult</w:t>
-      </w:r>
-      <w:proofErr w:type="spellEnd"/>
+      </w:pPr>
       <w:r>
         <w:rPr>
           <w:i/>
           <w:iCs/>
           <w:u w:val="single"/>
         </w:rPr>
-        <w:t xml:space="preserve"> object and the method </w:t>
-      </w:r>
-      <w:proofErr w:type="spellStart"/>
-      <w:r>
+        <w:t>Important: Gain knowledge in mobile automation, web automation, and API automation.</w:t>
+      </w:r>
+    </w:p>
+    <w:p>
+      <w:pPr>
         <w:rPr>
           <w:i/>
           <w:iCs/>
           <w:u w:val="single"/>
         </w:rPr>
-        <w:t>name.getName</w:t>
-      </w:r>
-      <w:proofErr w:type="spellEnd"/>
+      </w:pPr>
       <w:r>
         <w:rPr>
           <w:i/>
           <w:iCs/>
           <w:u w:val="single"/>
         </w:rPr>
-        <w:t>().</w:t>
+        <w:t>TODO:</w:t>
       </w:r>
     </w:p>
     <w:p>
@@ -1100,7 +795,7 @@
           <w:iCs/>
           <w:u w:val="single"/>
         </w:rPr>
-        <w:t>Important: Gain knowledge in mobile automation, web automation, and API automation.</w:t>
+        <w:t>Create 3 classes with PS names, use inheritance, extend usable methods in the child, create objects and use them through another inheritance of object, and implement super() to invoke the parent constructor when it’s not called outside the class.</w:t>
       </w:r>
     </w:p>
     <w:p>
@@ -1117,40 +812,6 @@
           <w:iCs/>
           <w:u w:val="single"/>
         </w:rPr>
-        <w:t>TODO:</w:t>
-      </w:r>
-    </w:p>
-    <w:p>
-      <w:pPr>
-        <w:rPr>
-          <w:i/>
-          <w:iCs/>
-          <w:u w:val="single"/>
-        </w:rPr>
-      </w:pPr>
-      <w:r>
-        <w:rPr>
-          <w:i/>
-          <w:iCs/>
-          <w:u w:val="single"/>
-        </w:rPr>
-        <w:t>Create 3 classes with PS names, use inheritance, extend usable methods in the child, create objects and use them through another inheritance of object, and implement super() to invoke the parent constructor when it’s not called outside the class.</w:t>
-      </w:r>
-    </w:p>
-    <w:p>
-      <w:pPr>
-        <w:rPr>
-          <w:i/>
-          <w:iCs/>
-          <w:u w:val="single"/>
-        </w:rPr>
-      </w:pPr>
-      <w:r>
-        <w:rPr>
-          <w:i/>
-          <w:iCs/>
-          <w:u w:val="single"/>
-        </w:rPr>
         <w:t>Create a Maven project and initialize an end-to-end test automation.</w:t>
       </w:r>
     </w:p>
@@ -1191,65 +852,27 @@
     </w:p>
     <w:p>
       <w:r>
-        <w:t xml:space="preserve">In Selenium, attributes that are instances of </w:t>
-      </w:r>
-      <w:proofErr w:type="spellStart"/>
-      <w:r>
-        <w:t>WebElement</w:t>
-      </w:r>
-      <w:proofErr w:type="spellEnd"/>
-      <w:r>
-        <w:t xml:space="preserve"> use the @FindBy annotation. These are initialized with </w:t>
-      </w:r>
-      <w:proofErr w:type="spellStart"/>
-      <w:r>
-        <w:t>PageFactory.initElements</w:t>
-      </w:r>
-      <w:proofErr w:type="spellEnd"/>
-      <w:r>
-        <w:t>().</w:t>
-      </w:r>
-    </w:p>
-    <w:p>
-      <w:proofErr w:type="spellStart"/>
-      <w:r>
-        <w:t>invisibilityOfElementLocated</w:t>
-      </w:r>
-      <w:proofErr w:type="spellEnd"/>
-      <w:r>
-        <w:t xml:space="preserve"> is slower than </w:t>
-      </w:r>
-      <w:proofErr w:type="spellStart"/>
-      <w:r>
-        <w:t>invisibilityOf</w:t>
-      </w:r>
-      <w:proofErr w:type="spellEnd"/>
-      <w:r>
-        <w:t xml:space="preserve"> because the first checks if the element exists in the DOM before verifying its visibility. The second assumes the element is already located.</w:t>
-      </w:r>
-    </w:p>
-    <w:p>
-      <w:pPr>
-        <w:rPr>
-          <w:b/>
-          <w:bCs/>
-        </w:rPr>
-      </w:pPr>
-      <w:proofErr w:type="spellStart"/>
-      <w:r>
-        <w:rPr>
-          <w:b/>
-          <w:bCs/>
-        </w:rPr>
-        <w:t>PageFactory.initElements</w:t>
-      </w:r>
-      <w:proofErr w:type="spellEnd"/>
-      <w:r>
-        <w:rPr>
-          <w:b/>
-          <w:bCs/>
-        </w:rPr>
-        <w:t>(driver, this);</w:t>
+        <w:t>In Selenium, attributes that are instances of WebElement use the @FindBy annotation. These are initialized with PageFactory.initElements().</w:t>
+      </w:r>
+    </w:p>
+    <w:p>
+      <w:r>
+        <w:t>invisibilityOfElementLocated is slower than invisibilityOf because the first checks if the element exists in the DOM before verifying its visibility. The second assumes the element is already located.</w:t>
+      </w:r>
+    </w:p>
+    <w:p>
+      <w:pPr>
+        <w:rPr>
+          <w:b/>
+          <w:bCs/>
+        </w:rPr>
+      </w:pPr>
+      <w:r>
+        <w:rPr>
+          <w:b/>
+          <w:bCs/>
+        </w:rPr>
+        <w:t>PageFactory.initElements(driver, this);</w:t>
       </w:r>
     </w:p>
     <w:p>
@@ -1264,15 +887,7 @@
     </w:p>
     <w:p>
       <w:r>
-        <w:t xml:space="preserve">driver is passed to </w:t>
-      </w:r>
-      <w:proofErr w:type="spellStart"/>
-      <w:r>
-        <w:t>PageFactory</w:t>
-      </w:r>
-      <w:proofErr w:type="spellEnd"/>
-      <w:r>
-        <w:t xml:space="preserve"> so that @FindBy elements know which WebDriver session to use.</w:t>
+        <w:t>driver is passed to PageFactory so that @FindBy elements know which WebDriver session to use.</w:t>
       </w:r>
     </w:p>
     <w:p>
@@ -1292,7 +907,6 @@
           <w:b/>
           <w:bCs/>
         </w:rPr>
-        <w:lastRenderedPageBreak/>
         <w:t>Test Strategy</w:t>
       </w:r>
     </w:p>
@@ -1444,13 +1058,8 @@
           <w:numId w:val="10"/>
         </w:numPr>
       </w:pPr>
-      <w:proofErr w:type="spellStart"/>
-      <w:r>
-        <w:t>ExtentReports</w:t>
-      </w:r>
-      <w:proofErr w:type="spellEnd"/>
-      <w:r>
-        <w:t>: Manages report generation.</w:t>
+      <w:r>
+        <w:t>ExtentReports: Manages report generation.</w:t>
       </w:r>
     </w:p>
     <w:p>
@@ -1461,13 +1070,8 @@
           <w:numId w:val="10"/>
         </w:numPr>
       </w:pPr>
-      <w:proofErr w:type="spellStart"/>
-      <w:r>
-        <w:t>ExtentSparkReporter</w:t>
-      </w:r>
-      <w:proofErr w:type="spellEnd"/>
-      <w:r>
-        <w:t>: Configures report output.</w:t>
+      <w:r>
+        <w:t>ExtentSparkReporter: Configures report output.</w:t>
       </w:r>
     </w:p>
     <w:p>
@@ -1478,13 +1082,8 @@
           <w:numId w:val="10"/>
         </w:numPr>
       </w:pPr>
-      <w:proofErr w:type="spellStart"/>
-      <w:r>
-        <w:t>ExtentTest</w:t>
-      </w:r>
-      <w:proofErr w:type="spellEnd"/>
-      <w:r>
-        <w:t>: Manages test events (pass/fail).</w:t>
+      <w:r>
+        <w:t>ExtentTest: Manages test events (pass/fail).</w:t>
       </w:r>
     </w:p>
     <w:p>
@@ -1504,25 +1103,12 @@
     </w:p>
     <w:p>
       <w:r>
-        <w:t xml:space="preserve">commons-io: </w:t>
-      </w:r>
-      <w:proofErr w:type="spellStart"/>
-      <w:r>
-        <w:t>FileUtils</w:t>
-      </w:r>
-      <w:proofErr w:type="spellEnd"/>
-      <w:r>
-        <w:t xml:space="preserve"> to manage files.</w:t>
-      </w:r>
-    </w:p>
-    <w:p>
-      <w:proofErr w:type="spellStart"/>
-      <w:r>
-        <w:t>jackson-databind</w:t>
-      </w:r>
-      <w:proofErr w:type="spellEnd"/>
-      <w:r>
-        <w:t>: Converts JSON to HashMap to handle test data easily.</w:t>
+        <w:t>commons-io: FileUtils to manage files.</w:t>
+      </w:r>
+    </w:p>
+    <w:p>
+      <w:r>
+        <w:t>jackson-databind: Converts JSON to HashMap to handle test data easily.</w:t>
       </w:r>
     </w:p>
     <w:p>
@@ -1537,21 +1123,12 @@
           <w:bCs/>
         </w:rPr>
       </w:pPr>
-      <w:proofErr w:type="spellStart"/>
-      <w:r>
-        <w:rPr>
-          <w:b/>
-          <w:bCs/>
-        </w:rPr>
-        <w:t>ThreadLocal</w:t>
-      </w:r>
-      <w:proofErr w:type="spellEnd"/>
-      <w:r>
-        <w:rPr>
-          <w:b/>
-          <w:bCs/>
-        </w:rPr>
-        <w:t>:</w:t>
+      <w:r>
+        <w:rPr>
+          <w:b/>
+          <w:bCs/>
+        </w:rPr>
+        <w:t>ThreadLocal:</w:t>
       </w:r>
     </w:p>
     <w:p>
@@ -1560,13 +1137,8 @@
       </w:r>
     </w:p>
     <w:p>
-      <w:proofErr w:type="spellStart"/>
-      <w:r>
-        <w:t>ThreadGuard.protect</w:t>
-      </w:r>
-      <w:proofErr w:type="spellEnd"/>
-      <w:r>
-        <w:t>: Monitors variables (like driver) ensuring access only from their original thread.</w:t>
+      <w:r>
+        <w:t>ThreadGuard.protect: Monitors variables (like driver) ensuring access only from their original thread.</w:t>
       </w:r>
     </w:p>
     <w:p>
@@ -1601,7 +1173,6 @@
     </w:p>
     <w:p>
       <w:r>
-        <w:lastRenderedPageBreak/>
         <w:t>final: Prevents overriding the reference or value of the variable.</w:t>
       </w:r>
     </w:p>
@@ -1728,100 +1299,27 @@
           <w:b/>
           <w:bCs/>
         </w:rPr>
-        <w:t xml:space="preserve">Thread Safety and </w:t>
-      </w:r>
-      <w:proofErr w:type="spellStart"/>
-      <w:r>
-        <w:rPr>
-          <w:b/>
-          <w:bCs/>
-        </w:rPr>
-        <w:t>ThreadGuard</w:t>
-      </w:r>
-      <w:proofErr w:type="spellEnd"/>
-      <w:r>
-        <w:rPr>
-          <w:b/>
-          <w:bCs/>
-        </w:rPr>
-        <w:t xml:space="preserve"> are essential for managing </w:t>
-      </w:r>
-      <w:proofErr w:type="spellStart"/>
-      <w:r>
-        <w:rPr>
-          <w:b/>
-          <w:bCs/>
-        </w:rPr>
-        <w:t>ThreadLocal</w:t>
-      </w:r>
-      <w:proofErr w:type="spellEnd"/>
-      <w:r>
-        <w:rPr>
-          <w:b/>
-          <w:bCs/>
-        </w:rPr>
-        <w:t xml:space="preserve"> objects to avoid concurrency issues.</w:t>
-      </w:r>
-    </w:p>
-    <w:p>
-      <w:pPr>
-        <w:rPr>
-          <w:b/>
-          <w:bCs/>
-        </w:rPr>
-      </w:pPr>
-      <w:proofErr w:type="spellStart"/>
-      <w:r>
-        <w:rPr>
-          <w:b/>
-          <w:bCs/>
-        </w:rPr>
-        <w:t>RetryAnalyzer</w:t>
-      </w:r>
-      <w:proofErr w:type="spellEnd"/>
-      <w:r>
-        <w:rPr>
-          <w:b/>
-          <w:bCs/>
-        </w:rPr>
-        <w:t xml:space="preserve"> (</w:t>
-      </w:r>
-      <w:proofErr w:type="spellStart"/>
-      <w:r>
-        <w:rPr>
-          <w:b/>
-          <w:bCs/>
-        </w:rPr>
-        <w:t>IRetryAnalyzer</w:t>
-      </w:r>
-      <w:proofErr w:type="spellEnd"/>
-      <w:r>
-        <w:rPr>
-          <w:b/>
-          <w:bCs/>
-        </w:rPr>
-        <w:t>):</w:t>
-      </w:r>
-    </w:p>
-    <w:p>
-      <w:r>
-        <w:t xml:space="preserve">Detects flaky tests and retries failed ones. Implement via </w:t>
-      </w:r>
-      <w:proofErr w:type="spellStart"/>
-      <w:r>
-        <w:t>IRetryAnalyzer</w:t>
-      </w:r>
-      <w:proofErr w:type="spellEnd"/>
-      <w:r>
-        <w:t xml:space="preserve"> interface and annotation attribute </w:t>
-      </w:r>
-      <w:proofErr w:type="spellStart"/>
-      <w:r>
-        <w:t>RetryAnalyzer</w:t>
-      </w:r>
-      <w:proofErr w:type="spellEnd"/>
-      <w:r>
-        <w:t>.</w:t>
+        <w:t>Thread Safety and ThreadGuard are essential for managing ThreadLocal objects to avoid concurrency issues.</w:t>
+      </w:r>
+    </w:p>
+    <w:p>
+      <w:pPr>
+        <w:rPr>
+          <w:b/>
+          <w:bCs/>
+        </w:rPr>
+      </w:pPr>
+      <w:r>
+        <w:rPr>
+          <w:b/>
+          <w:bCs/>
+        </w:rPr>
+        <w:t>RetryAnalyzer (IRetryAnalyzer):</w:t>
+      </w:r>
+    </w:p>
+    <w:p>
+      <w:r>
+        <w:t>Detects flaky tests and retries failed ones. Implement via IRetryAnalyzer interface and annotation attribute RetryAnalyzer.</w:t>
       </w:r>
     </w:p>
     <w:p>
@@ -1845,21 +1343,8 @@
       </w:r>
     </w:p>
     <w:p>
-      <w:proofErr w:type="spellStart"/>
-      <w:r>
-        <w:t>mvn</w:t>
-      </w:r>
-      <w:proofErr w:type="spellEnd"/>
-      <w:r>
-        <w:t xml:space="preserve"> test -P{</w:t>
-      </w:r>
-      <w:proofErr w:type="spellStart"/>
-      <w:r>
-        <w:t>testng</w:t>
-      </w:r>
-      <w:proofErr w:type="spellEnd"/>
-      <w:r>
-        <w:t>}</w:t>
+      <w:r>
+        <w:t>mvn test -P{testng}</w:t>
       </w:r>
     </w:p>
     <w:p>
@@ -1868,27 +1353,9 @@
       </w:r>
     </w:p>
     <w:p>
-      <w:proofErr w:type="spellStart"/>
-      <w:r>
-        <w:t>mvn</w:t>
-      </w:r>
-      <w:proofErr w:type="spellEnd"/>
-      <w:r>
-        <w:t xml:space="preserve"> test -</w:t>
-      </w:r>
-      <w:proofErr w:type="spellStart"/>
-      <w:r>
-        <w:t>PErrorValidation</w:t>
-      </w:r>
-      <w:proofErr w:type="spellEnd"/>
-      <w:r>
-        <w:t xml:space="preserve"> -</w:t>
-      </w:r>
-      <w:proofErr w:type="spellStart"/>
-      <w:r>
-        <w:t>DChrome</w:t>
-      </w:r>
-      <w:proofErr w:type="spellEnd"/>
+      <w:r>
+        <w:t>mvn test -PErrorValidation -DChrome</w:t>
+      </w:r>
     </w:p>
     <w:p>
       <w:r>
@@ -1912,28 +1379,12 @@
     </w:p>
     <w:p>
       <w:r>
-        <w:t xml:space="preserve">Used to create jobs that automate testing execution. You can configure parameters, variables, dynamic executions, and scheduled jobs (Jenkins uses </w:t>
-      </w:r>
-      <w:proofErr w:type="spellStart"/>
-      <w:r>
-        <w:t>cron</w:t>
-      </w:r>
-      <w:proofErr w:type="spellEnd"/>
-      <w:r>
-        <w:t xml:space="preserve"> syntax {MINUTE HOUR DAY_OF_MONTH MONTH DAY_OF_WEEK}).</w:t>
-      </w:r>
-    </w:p>
-    <w:p>
-      <w:r>
-        <w:t>Remember to use parameters in steps (e.g., $</w:t>
-      </w:r>
-      <w:proofErr w:type="spellStart"/>
-      <w:r>
-        <w:t>browserName</w:t>
-      </w:r>
-      <w:proofErr w:type="spellEnd"/>
-      <w:r>
-        <w:t>), and check “Use custom workspace” if not using a repository.</w:t>
+        <w:t>Used to create jobs that automate testing execution. You can configure parameters, variables, dynamic executions, and scheduled jobs (Jenkins uses cron syntax {MINUTE HOUR DAY_OF_MONTH MONTH DAY_OF_WEEK}).</w:t>
+      </w:r>
+    </w:p>
+    <w:p>
+      <w:r>
+        <w:t>Remember to use parameters in steps (e.g., $browserName), and check “Use custom workspace” if not using a repository.</w:t>
       </w:r>
     </w:p>
     <w:p>
@@ -1953,7 +1404,6 @@
     </w:p>
     <w:p>
       <w:r>
-        <w:lastRenderedPageBreak/>
         <w:t>Cucumber represents test cases as scenarios using Gherkin syntax and BDD methodology.</w:t>
       </w:r>
     </w:p>
@@ -1979,23 +1429,7 @@
     </w:p>
     <w:p>
       <w:r>
-        <w:t xml:space="preserve">Execution is handled with TestNG by extending </w:t>
-      </w:r>
-      <w:proofErr w:type="spellStart"/>
-      <w:r>
-        <w:t>AbstractTestNGCucumberTests</w:t>
-      </w:r>
-      <w:proofErr w:type="spellEnd"/>
-      <w:r>
-        <w:t xml:space="preserve"> and using annotations for </w:t>
-      </w:r>
-      <w:proofErr w:type="spellStart"/>
-      <w:r>
-        <w:t>ChromeOptions</w:t>
-      </w:r>
-      <w:proofErr w:type="spellEnd"/>
-      <w:r>
-        <w:t>, features, glue, monochrome, plugin, tags, etc.</w:t>
+        <w:t>Execution is handled with TestNG by extending AbstractTestNGCucumberTests and using annotations for ChromeOptions, features, glue, monochrome, plugin, tags, etc.</w:t>
       </w:r>
     </w:p>
     <w:p>
@@ -2020,28 +1454,12 @@
     </w:p>
     <w:p>
       <w:r>
-        <w:t xml:space="preserve">GitHub Hook trigger for </w:t>
-      </w:r>
-      <w:proofErr w:type="spellStart"/>
-      <w:r>
-        <w:t>GITScm</w:t>
-      </w:r>
-      <w:proofErr w:type="spellEnd"/>
-      <w:r>
-        <w:t xml:space="preserve"> polling in Maven projects allows automatic builds when GitHub sends a webhook.</w:t>
-      </w:r>
-    </w:p>
-    <w:p>
-      <w:r>
-        <w:t xml:space="preserve">Payload URL is the Jenkins server endpoint receiving GitHub webhooks. Configure events to trigger (e.g., push actions). For practice, use </w:t>
-      </w:r>
-      <w:proofErr w:type="spellStart"/>
-      <w:r>
-        <w:t>Ngrok</w:t>
-      </w:r>
-      <w:proofErr w:type="spellEnd"/>
-      <w:r>
-        <w:t xml:space="preserve"> to expose Jenkins to the internet, as GitHub requires public access.</w:t>
+        <w:t>GitHub Hook trigger for GITScm polling in Maven projects allows automatic builds when GitHub sends a webhook.</w:t>
+      </w:r>
+    </w:p>
+    <w:p>
+      <w:r>
+        <w:t>Payload URL is the Jenkins server endpoint receiving GitHub webhooks. Configure events to trigger (e.g., push actions). For practice, use Ngrok to expose Jenkins to the internet, as GitHub requires public access.</w:t>
       </w:r>
     </w:p>
     <w:p>
@@ -2157,45 +1575,472 @@
     </w:p>
     <w:p>
       <w:r>
-        <w:lastRenderedPageBreak/>
         <w:t>Important commands:</w:t>
       </w:r>
     </w:p>
     <w:p>
       <w:r>
-        <w:t>Start hub: java -jar &lt;</w:t>
-      </w:r>
-      <w:proofErr w:type="spellStart"/>
-      <w:r>
-        <w:t>SeleniumJarName</w:t>
-      </w:r>
-      <w:proofErr w:type="spellEnd"/>
-      <w:r>
-        <w:t>&gt; hub</w:t>
-      </w:r>
-    </w:p>
-    <w:p>
-      <w:r>
-        <w:t>Start node (same machine): java -jar &lt;</w:t>
-      </w:r>
-      <w:proofErr w:type="spellStart"/>
-      <w:r>
-        <w:t>SeleniumJarName</w:t>
-      </w:r>
-      <w:proofErr w:type="spellEnd"/>
-      <w:r>
-        <w:t>&gt; node --detect-drivers true</w:t>
-      </w:r>
-    </w:p>
-    <w:p>
-      <w:r>
-        <w:t>Note: To configure an external node located on another physical machine, it’s necessary to set the flags --publish-events and --subscribe-events with ports XPUSH and XSUB of the hub (by default 4442 and 4443).</w:t>
+        <w:t>Start hub: java -jar &lt;SeleniumJarName&gt; hub</w:t>
+      </w:r>
+    </w:p>
+    <w:p>
+      <w:r>
+        <w:t>Start node (same machine): java -jar &lt;SeleniumJarName&gt; node --detect-drivers true</w:t>
+      </w:r>
+    </w:p>
+    <w:p>
+      <w:r>
+        <w:rPr/>
+        <w:t xml:space="preserve">Note: To configure an external node </w:t>
+      </w:r>
+      <w:r>
+        <w:rPr/>
+        <w:t>located</w:t>
+      </w:r>
+      <w:r>
+        <w:rPr/>
+        <w:t xml:space="preserve"> on another physical machine, </w:t>
+      </w:r>
+      <w:r>
+        <w:rPr/>
+        <w:t>it’s</w:t>
+      </w:r>
+      <w:r>
+        <w:rPr/>
+        <w:t xml:space="preserve"> necessary to set the flags --publish-events and --subscribe-events with ports XPUSH and XSUB of the hub (by default 4442 and 4443).</w:t>
       </w:r>
     </w:p>
     <w:p/>
     <w:p/>
+    <w:p>
+      <w:r>
+        <w:rPr/>
+        <w:t>Data driver testing from Excel</w:t>
+      </w:r>
+      <w:r>
+        <w:rPr/>
+        <w:t>.</w:t>
+      </w:r>
+      <w:r>
+        <w:rPr/>
+        <w:t xml:space="preserve"> (Excel Drive-Data)</w:t>
+      </w:r>
+      <w:r>
+        <w:br/>
+      </w:r>
+      <w:r>
+        <w:br/>
+      </w:r>
+      <w:r>
+        <w:rPr/>
+        <w:t xml:space="preserve">How </w:t>
+      </w:r>
+      <w:r>
+        <w:rPr/>
+        <w:t>can we</w:t>
+      </w:r>
+      <w:r>
+        <w:rPr/>
+        <w:t xml:space="preserve"> achieve this? using </w:t>
+      </w:r>
+      <w:r>
+        <w:rPr/>
+        <w:t>apache</w:t>
+      </w:r>
+      <w:r>
+        <w:rPr/>
+        <w:t xml:space="preserve"> POI API</w:t>
+      </w:r>
+    </w:p>
+    <w:p>
+      <w:pPr>
+        <w:pStyle w:val="Normal"/>
+      </w:pPr>
+      <w:r>
+        <w:rPr/>
+        <w:t>XSSFWoork</w:t>
+      </w:r>
+      <w:r>
+        <w:rPr/>
+        <w:t xml:space="preserve"> Book is </w:t>
+      </w:r>
+      <w:r>
+        <w:rPr/>
+        <w:t>use</w:t>
+      </w:r>
+      <w:r>
+        <w:rPr/>
+        <w:t xml:space="preserve"> to get </w:t>
+      </w:r>
+      <w:r>
+        <w:rPr/>
+        <w:t>acces</w:t>
+      </w:r>
+      <w:r>
+        <w:rPr/>
+        <w:t xml:space="preserve"> to </w:t>
+      </w:r>
+      <w:r>
+        <w:rPr/>
+        <w:t>theexcel</w:t>
+      </w:r>
+      <w:r>
+        <w:rPr/>
+        <w:t xml:space="preserve"> file</w:t>
+      </w:r>
+    </w:p>
+    <w:p>
+      <w:pPr>
+        <w:pStyle w:val="Normal"/>
+      </w:pPr>
+      <w:r>
+        <w:rPr/>
+        <w:t>XSSFSheets</w:t>
+      </w:r>
+      <w:r>
+        <w:rPr/>
+        <w:t xml:space="preserve"> </w:t>
+      </w:r>
+      <w:r>
+        <w:rPr/>
+        <w:t>i</w:t>
+      </w:r>
+      <w:r>
+        <w:rPr/>
+        <w:t xml:space="preserve"> s use to get </w:t>
+      </w:r>
+      <w:r>
+        <w:rPr/>
+        <w:t xml:space="preserve"> </w:t>
+      </w:r>
+      <w:r>
+        <w:rPr/>
+        <w:t>acces</w:t>
+      </w:r>
+      <w:r>
+        <w:rPr/>
+        <w:t xml:space="preserve"> to the one of the </w:t>
+      </w:r>
+      <w:r>
+        <w:rPr/>
+        <w:t>shhets</w:t>
+      </w:r>
+      <w:r>
+        <w:rPr/>
+        <w:t xml:space="preserve"> </w:t>
+      </w:r>
+      <w:r>
+        <w:rPr/>
+        <w:t>pereset</w:t>
+      </w:r>
+      <w:r>
+        <w:rPr/>
+        <w:t xml:space="preserve"> in </w:t>
+      </w:r>
+      <w:r>
+        <w:rPr/>
+        <w:t>excelñ</w:t>
+      </w:r>
+      <w:r>
+        <w:rPr/>
+        <w:t xml:space="preserve"> file</w:t>
+      </w:r>
+      <w:r>
+        <w:tab/>
+      </w:r>
+      <w:r>
+        <w:tab/>
+      </w:r>
+      <w:r>
+        <w:br/>
+      </w:r>
+      <w:r>
+        <w:br/>
+      </w:r>
+      <w:r>
+        <w:rPr/>
+        <w:t xml:space="preserve">getPhysicalNumber(): The method is used to </w:t>
+      </w:r>
+      <w:r>
+        <w:rPr/>
+        <w:t>obtained</w:t>
+      </w:r>
+      <w:r>
+        <w:rPr/>
+        <w:t xml:space="preserve"> the number of rows present with data in the sheet</w:t>
+      </w:r>
+    </w:p>
+    <w:p>
+      <w:pPr>
+        <w:pStyle w:val="Normal"/>
+      </w:pPr>
+      <w:r>
+        <w:rPr/>
+        <w:t>GetLassCellNum</w:t>
+      </w:r>
+      <w:r>
+        <w:rPr/>
+        <w:t xml:space="preserve">(): Works to </w:t>
+      </w:r>
+      <w:r>
+        <w:rPr/>
+        <w:t>obtained</w:t>
+      </w:r>
+      <w:r>
+        <w:rPr/>
+        <w:t xml:space="preserve"> the number of </w:t>
+      </w:r>
+      <w:r>
+        <w:rPr/>
+        <w:t>collumns</w:t>
+      </w:r>
+      <w:r>
+        <w:rPr/>
+        <w:t xml:space="preserve"> present </w:t>
+      </w:r>
+      <w:r>
+        <w:rPr/>
+        <w:t>inthe</w:t>
+      </w:r>
+      <w:r>
+        <w:rPr/>
+        <w:t xml:space="preserve"> rows, to use is </w:t>
+      </w:r>
+      <w:r>
+        <w:rPr/>
+        <w:t>necesary</w:t>
+      </w:r>
+      <w:r>
+        <w:rPr/>
+        <w:t xml:space="preserve"> the o</w:t>
+      </w:r>
+      <w:r>
+        <w:rPr/>
+        <w:t>bject return by after method.</w:t>
+      </w:r>
+    </w:p>
+    <w:p>
+      <w:pPr>
+        <w:pStyle w:val="Normal"/>
+      </w:pPr>
+      <w:r>
+        <w:rPr/>
+        <w:t xml:space="preserve">Iterator&lt;row&gt; this interface is </w:t>
+      </w:r>
+      <w:r>
+        <w:rPr/>
+        <w:t>use</w:t>
+      </w:r>
+      <w:r>
+        <w:rPr/>
+        <w:t xml:space="preserve"> to navigate to each row of the sheet</w:t>
+      </w:r>
+    </w:p>
+    <w:p>
+      <w:pPr>
+        <w:pStyle w:val="Normal"/>
+      </w:pPr>
+      <w:r>
+        <w:rPr/>
+        <w:t>Antd</w:t>
+      </w:r>
+      <w:r>
+        <w:rPr/>
+        <w:t xml:space="preserve"> </w:t>
+      </w:r>
+      <w:r>
+        <w:rPr/>
+        <w:t xml:space="preserve">Row object is </w:t>
+      </w:r>
+      <w:r>
+        <w:rPr/>
+        <w:t>use</w:t>
+      </w:r>
+      <w:r>
+        <w:rPr/>
+        <w:t xml:space="preserve"> to </w:t>
+      </w:r>
+      <w:r>
+        <w:rPr/>
+        <w:t>acces</w:t>
+      </w:r>
+      <w:r>
+        <w:rPr/>
+        <w:t xml:space="preserve"> the information on all row and navigate to each cell using </w:t>
+      </w:r>
+      <w:r>
+        <w:rPr/>
+        <w:t>cellIteratorMethod</w:t>
+      </w:r>
+      <w:r>
+        <w:rPr/>
+        <w:t>()</w:t>
+      </w:r>
+      <w:r>
+        <w:rPr/>
+        <w:t xml:space="preserve"> and put this returning element in Iterator&lt;Cell&gt; interface</w:t>
+      </w:r>
+    </w:p>
+    <w:p>
+      <w:pPr>
+        <w:pStyle w:val="Normal"/>
+      </w:pPr>
+      <w:r>
+        <w:rPr/>
+        <w:t>getStringCellValue</w:t>
+      </w:r>
+      <w:r>
+        <w:rPr/>
+        <w:t xml:space="preserve">, is a method to </w:t>
+      </w:r>
+      <w:r>
+        <w:rPr/>
+        <w:t>optiona</w:t>
+      </w:r>
+      <w:r>
+        <w:rPr/>
+        <w:t xml:space="preserve"> value </w:t>
+      </w:r>
+      <w:r>
+        <w:rPr/>
+        <w:t>alocated</w:t>
+      </w:r>
+      <w:r>
+        <w:rPr/>
+        <w:t xml:space="preserve"> in the specified cell</w:t>
+      </w:r>
+    </w:p>
+    <w:p>
+      <w:pPr>
+        <w:pStyle w:val="Normal"/>
+      </w:pPr>
+      <w:r>
+        <w:rPr/>
+        <w:t xml:space="preserve">Sheets is collection of rows </w:t>
+      </w:r>
+    </w:p>
+    <w:p>
+      <w:pPr>
+        <w:pStyle w:val="Normal"/>
+      </w:pPr>
+      <w:r>
+        <w:rPr/>
+        <w:t>Row is collection of cells</w:t>
+      </w:r>
+      <w:r>
+        <w:br/>
+      </w:r>
+    </w:p>
+    <w:p>
+      <w:pPr>
+        <w:pStyle w:val="Normal"/>
+      </w:pPr>
+      <w:r>
+        <w:rPr/>
+        <w:t xml:space="preserve">TestNG DataProvider and Excel Data Driver: </w:t>
+      </w:r>
+    </w:p>
+    <w:p>
+      <w:pPr>
+        <w:pStyle w:val="Normal"/>
+      </w:pPr>
+      <w:r>
+        <w:rPr/>
+        <w:t xml:space="preserve">DataProvider </w:t>
+      </w:r>
+      <w:r>
+        <w:rPr/>
+        <w:t xml:space="preserve">allows executing the same test case multiple times and visualizing in the </w:t>
+      </w:r>
+      <w:r>
+        <w:rPr/>
+        <w:t>report</w:t>
+      </w:r>
+      <w:r>
+        <w:rPr/>
+        <w:t xml:space="preserve"> each data execution, showing which data sets pass or fail. </w:t>
+      </w:r>
+    </w:p>
+    <w:p>
+      <w:pPr>
+        <w:pStyle w:val="Normal"/>
+      </w:pPr>
+      <w:r>
+        <w:rPr/>
+        <w:t xml:space="preserve">On the other hand, using only the </w:t>
+      </w:r>
+      <w:r>
+        <w:rPr/>
+        <w:t>DataProvider</w:t>
+      </w:r>
+      <w:r>
+        <w:rPr/>
+        <w:t xml:space="preserve"> requires hardcoding, which makes the approach less dynamic and more complicated. </w:t>
+      </w:r>
+    </w:p>
+    <w:p>
+      <w:pPr>
+        <w:pStyle w:val="Normal"/>
+      </w:pPr>
+      <w:r>
+        <w:rPr/>
+        <w:t xml:space="preserve">Using only Excel Data Driver provides dynamic data, but it does not manage execution of the test at different times. </w:t>
+      </w:r>
+    </w:p>
+    <w:p>
+      <w:pPr>
+        <w:pStyle w:val="Normal"/>
+      </w:pPr>
+      <w:r>
+        <w:rPr/>
+        <w:t>In this case, the test must execute in a loop to verify all data, and finally, the report will show only one execution instead of multiple executions.</w:t>
+      </w:r>
+    </w:p>
+    <w:p>
+      <w:pPr>
+        <w:pStyle w:val="Normal"/>
+      </w:pPr>
+      <w:r>
+        <w:rPr/>
+        <w:t xml:space="preserve">The best </w:t>
+      </w:r>
+      <w:r>
+        <w:rPr/>
+        <w:t>option</w:t>
+      </w:r>
+      <w:r>
+        <w:rPr/>
+        <w:t xml:space="preserve"> is Bring the capabilities to manage dynamic data with Excel data-driven testing combined with</w:t>
+      </w:r>
+      <w:r>
+        <w:rPr/>
+        <w:t xml:space="preserve"> </w:t>
+      </w:r>
+      <w:r>
+        <w:rPr/>
+        <w:t>DataProvide</w:t>
+      </w:r>
+      <w:r>
+        <w:rPr/>
+        <w:t>r</w:t>
+      </w:r>
+      <w:r>
+        <w:rPr/>
+        <w:t>.</w:t>
+      </w:r>
+    </w:p>
+    <w:p>
+      <w:pPr>
+        <w:pStyle w:val="Normal"/>
+      </w:pPr>
+    </w:p>
+    <w:p>
+      <w:pPr>
+        <w:pStyle w:val="Normal"/>
+      </w:pPr>
+    </w:p>
     <w:sectPr>
-      <w:pgSz w:w="12240" w:h="15840"/>
+      <w:pgSz w:w="12240" w:h="15840" w:orient="portrait"/>
       <w:pgMar w:top="1417" w:right="1701" w:bottom="1417" w:left="1701" w:header="720" w:footer="720" w:gutter="0"/>
       <w:cols w:space="720"/>
       <w:docGrid w:linePitch="360"/>
@@ -2219,7 +2064,7 @@
         <w:ind w:left="720" w:hanging="360"/>
       </w:pPr>
       <w:rPr>
-        <w:rFonts w:ascii="Symbol" w:hAnsi="Symbol" w:hint="default"/>
+        <w:rFonts w:hint="default" w:ascii="Symbol" w:hAnsi="Symbol"/>
       </w:rPr>
     </w:lvl>
     <w:lvl w:ilvl="1" w:tplc="140A0003" w:tentative="1">
@@ -2231,7 +2076,7 @@
         <w:ind w:left="1440" w:hanging="360"/>
       </w:pPr>
       <w:rPr>
-        <w:rFonts w:ascii="Courier New" w:hAnsi="Courier New" w:cs="Courier New" w:hint="default"/>
+        <w:rFonts w:hint="default" w:ascii="Courier New" w:hAnsi="Courier New" w:cs="Courier New"/>
       </w:rPr>
     </w:lvl>
     <w:lvl w:ilvl="2" w:tplc="140A0005" w:tentative="1">
@@ -2243,7 +2088,7 @@
         <w:ind w:left="2160" w:hanging="360"/>
       </w:pPr>
       <w:rPr>
-        <w:rFonts w:ascii="Wingdings" w:hAnsi="Wingdings" w:hint="default"/>
+        <w:rFonts w:hint="default" w:ascii="Wingdings" w:hAnsi="Wingdings"/>
       </w:rPr>
     </w:lvl>
     <w:lvl w:ilvl="3" w:tplc="140A0001" w:tentative="1">
@@ -2255,7 +2100,7 @@
         <w:ind w:left="2880" w:hanging="360"/>
       </w:pPr>
       <w:rPr>
-        <w:rFonts w:ascii="Symbol" w:hAnsi="Symbol" w:hint="default"/>
+        <w:rFonts w:hint="default" w:ascii="Symbol" w:hAnsi="Symbol"/>
       </w:rPr>
     </w:lvl>
     <w:lvl w:ilvl="4" w:tplc="140A0003" w:tentative="1">
@@ -2267,7 +2112,7 @@
         <w:ind w:left="3600" w:hanging="360"/>
       </w:pPr>
       <w:rPr>
-        <w:rFonts w:ascii="Courier New" w:hAnsi="Courier New" w:cs="Courier New" w:hint="default"/>
+        <w:rFonts w:hint="default" w:ascii="Courier New" w:hAnsi="Courier New" w:cs="Courier New"/>
       </w:rPr>
     </w:lvl>
     <w:lvl w:ilvl="5" w:tplc="140A0005" w:tentative="1">
@@ -2279,7 +2124,7 @@
         <w:ind w:left="4320" w:hanging="360"/>
       </w:pPr>
       <w:rPr>
-        <w:rFonts w:ascii="Wingdings" w:hAnsi="Wingdings" w:hint="default"/>
+        <w:rFonts w:hint="default" w:ascii="Wingdings" w:hAnsi="Wingdings"/>
       </w:rPr>
     </w:lvl>
     <w:lvl w:ilvl="6" w:tplc="140A0001" w:tentative="1">
@@ -2291,7 +2136,7 @@
         <w:ind w:left="5040" w:hanging="360"/>
       </w:pPr>
       <w:rPr>
-        <w:rFonts w:ascii="Symbol" w:hAnsi="Symbol" w:hint="default"/>
+        <w:rFonts w:hint="default" w:ascii="Symbol" w:hAnsi="Symbol"/>
       </w:rPr>
     </w:lvl>
     <w:lvl w:ilvl="7" w:tplc="140A0003" w:tentative="1">
@@ -2303,7 +2148,7 @@
         <w:ind w:left="5760" w:hanging="360"/>
       </w:pPr>
       <w:rPr>
-        <w:rFonts w:ascii="Courier New" w:hAnsi="Courier New" w:cs="Courier New" w:hint="default"/>
+        <w:rFonts w:hint="default" w:ascii="Courier New" w:hAnsi="Courier New" w:cs="Courier New"/>
       </w:rPr>
     </w:lvl>
     <w:lvl w:ilvl="8" w:tplc="140A0005" w:tentative="1">
@@ -2315,7 +2160,7 @@
         <w:ind w:left="6480" w:hanging="360"/>
       </w:pPr>
       <w:rPr>
-        <w:rFonts w:ascii="Wingdings" w:hAnsi="Wingdings" w:hint="default"/>
+        <w:rFonts w:hint="default" w:ascii="Wingdings" w:hAnsi="Wingdings"/>
       </w:rPr>
     </w:lvl>
   </w:abstractNum>
@@ -2335,7 +2180,7 @@
         <w:ind w:left="720" w:hanging="360"/>
       </w:pPr>
       <w:rPr>
-        <w:rFonts w:ascii="Symbol" w:hAnsi="Symbol" w:hint="default"/>
+        <w:rFonts w:hint="default" w:ascii="Symbol" w:hAnsi="Symbol"/>
         <w:sz w:val="20"/>
       </w:rPr>
     </w:lvl>
@@ -2351,7 +2196,7 @@
         <w:ind w:left="1440" w:hanging="360"/>
       </w:pPr>
       <w:rPr>
-        <w:rFonts w:ascii="Courier New" w:hAnsi="Courier New" w:hint="default"/>
+        <w:rFonts w:hint="default" w:ascii="Courier New" w:hAnsi="Courier New"/>
         <w:sz w:val="20"/>
       </w:rPr>
     </w:lvl>
@@ -2367,7 +2212,7 @@
         <w:ind w:left="2160" w:hanging="360"/>
       </w:pPr>
       <w:rPr>
-        <w:rFonts w:ascii="Wingdings" w:hAnsi="Wingdings" w:hint="default"/>
+        <w:rFonts w:hint="default" w:ascii="Wingdings" w:hAnsi="Wingdings"/>
         <w:sz w:val="20"/>
       </w:rPr>
     </w:lvl>
@@ -2383,7 +2228,7 @@
         <w:ind w:left="2880" w:hanging="360"/>
       </w:pPr>
       <w:rPr>
-        <w:rFonts w:ascii="Wingdings" w:hAnsi="Wingdings" w:hint="default"/>
+        <w:rFonts w:hint="default" w:ascii="Wingdings" w:hAnsi="Wingdings"/>
         <w:sz w:val="20"/>
       </w:rPr>
     </w:lvl>
@@ -2399,7 +2244,7 @@
         <w:ind w:left="3600" w:hanging="360"/>
       </w:pPr>
       <w:rPr>
-        <w:rFonts w:ascii="Wingdings" w:hAnsi="Wingdings" w:hint="default"/>
+        <w:rFonts w:hint="default" w:ascii="Wingdings" w:hAnsi="Wingdings"/>
         <w:sz w:val="20"/>
       </w:rPr>
     </w:lvl>
@@ -2415,7 +2260,7 @@
         <w:ind w:left="4320" w:hanging="360"/>
       </w:pPr>
       <w:rPr>
-        <w:rFonts w:ascii="Wingdings" w:hAnsi="Wingdings" w:hint="default"/>
+        <w:rFonts w:hint="default" w:ascii="Wingdings" w:hAnsi="Wingdings"/>
         <w:sz w:val="20"/>
       </w:rPr>
     </w:lvl>
@@ -2431,7 +2276,7 @@
         <w:ind w:left="5040" w:hanging="360"/>
       </w:pPr>
       <w:rPr>
-        <w:rFonts w:ascii="Wingdings" w:hAnsi="Wingdings" w:hint="default"/>
+        <w:rFonts w:hint="default" w:ascii="Wingdings" w:hAnsi="Wingdings"/>
         <w:sz w:val="20"/>
       </w:rPr>
     </w:lvl>
@@ -2447,7 +2292,7 @@
         <w:ind w:left="5760" w:hanging="360"/>
       </w:pPr>
       <w:rPr>
-        <w:rFonts w:ascii="Wingdings" w:hAnsi="Wingdings" w:hint="default"/>
+        <w:rFonts w:hint="default" w:ascii="Wingdings" w:hAnsi="Wingdings"/>
         <w:sz w:val="20"/>
       </w:rPr>
     </w:lvl>
@@ -2463,7 +2308,7 @@
         <w:ind w:left="6480" w:hanging="360"/>
       </w:pPr>
       <w:rPr>
-        <w:rFonts w:ascii="Wingdings" w:hAnsi="Wingdings" w:hint="default"/>
+        <w:rFonts w:hint="default" w:ascii="Wingdings" w:hAnsi="Wingdings"/>
         <w:sz w:val="20"/>
       </w:rPr>
     </w:lvl>
@@ -2484,7 +2329,7 @@
         <w:ind w:left="720" w:hanging="360"/>
       </w:pPr>
       <w:rPr>
-        <w:rFonts w:ascii="Symbol" w:hAnsi="Symbol" w:hint="default"/>
+        <w:rFonts w:hint="default" w:ascii="Symbol" w:hAnsi="Symbol"/>
         <w:sz w:val="20"/>
       </w:rPr>
     </w:lvl>
@@ -2500,7 +2345,7 @@
         <w:ind w:left="1440" w:hanging="360"/>
       </w:pPr>
       <w:rPr>
-        <w:rFonts w:ascii="Courier New" w:hAnsi="Courier New" w:hint="default"/>
+        <w:rFonts w:hint="default" w:ascii="Courier New" w:hAnsi="Courier New"/>
         <w:sz w:val="20"/>
       </w:rPr>
     </w:lvl>
@@ -2516,7 +2361,7 @@
         <w:ind w:left="2160" w:hanging="360"/>
       </w:pPr>
       <w:rPr>
-        <w:rFonts w:ascii="Wingdings" w:hAnsi="Wingdings" w:hint="default"/>
+        <w:rFonts w:hint="default" w:ascii="Wingdings" w:hAnsi="Wingdings"/>
         <w:sz w:val="20"/>
       </w:rPr>
     </w:lvl>
@@ -2532,7 +2377,7 @@
         <w:ind w:left="2880" w:hanging="360"/>
       </w:pPr>
       <w:rPr>
-        <w:rFonts w:ascii="Wingdings" w:hAnsi="Wingdings" w:hint="default"/>
+        <w:rFonts w:hint="default" w:ascii="Wingdings" w:hAnsi="Wingdings"/>
         <w:sz w:val="20"/>
       </w:rPr>
     </w:lvl>
@@ -2548,7 +2393,7 @@
         <w:ind w:left="3600" w:hanging="360"/>
       </w:pPr>
       <w:rPr>
-        <w:rFonts w:ascii="Wingdings" w:hAnsi="Wingdings" w:hint="default"/>
+        <w:rFonts w:hint="default" w:ascii="Wingdings" w:hAnsi="Wingdings"/>
         <w:sz w:val="20"/>
       </w:rPr>
     </w:lvl>
@@ -2564,7 +2409,7 @@
         <w:ind w:left="4320" w:hanging="360"/>
       </w:pPr>
       <w:rPr>
-        <w:rFonts w:ascii="Wingdings" w:hAnsi="Wingdings" w:hint="default"/>
+        <w:rFonts w:hint="default" w:ascii="Wingdings" w:hAnsi="Wingdings"/>
         <w:sz w:val="20"/>
       </w:rPr>
     </w:lvl>
@@ -2580,7 +2425,7 @@
         <w:ind w:left="5040" w:hanging="360"/>
       </w:pPr>
       <w:rPr>
-        <w:rFonts w:ascii="Wingdings" w:hAnsi="Wingdings" w:hint="default"/>
+        <w:rFonts w:hint="default" w:ascii="Wingdings" w:hAnsi="Wingdings"/>
         <w:sz w:val="20"/>
       </w:rPr>
     </w:lvl>
@@ -2596,7 +2441,7 @@
         <w:ind w:left="5760" w:hanging="360"/>
       </w:pPr>
       <w:rPr>
-        <w:rFonts w:ascii="Wingdings" w:hAnsi="Wingdings" w:hint="default"/>
+        <w:rFonts w:hint="default" w:ascii="Wingdings" w:hAnsi="Wingdings"/>
         <w:sz w:val="20"/>
       </w:rPr>
     </w:lvl>
@@ -2612,7 +2457,7 @@
         <w:ind w:left="6480" w:hanging="360"/>
       </w:pPr>
       <w:rPr>
-        <w:rFonts w:ascii="Wingdings" w:hAnsi="Wingdings" w:hint="default"/>
+        <w:rFonts w:hint="default" w:ascii="Wingdings" w:hAnsi="Wingdings"/>
         <w:sz w:val="20"/>
       </w:rPr>
     </w:lvl>
@@ -2820,7 +2665,7 @@
         <w:ind w:left="1440" w:hanging="360"/>
       </w:pPr>
       <w:rPr>
-        <w:rFonts w:ascii="Courier New" w:hAnsi="Courier New" w:hint="default"/>
+        <w:rFonts w:hint="default" w:ascii="Courier New" w:hAnsi="Courier New"/>
         <w:sz w:val="20"/>
       </w:rPr>
     </w:lvl>
@@ -2922,7 +2767,7 @@
         <w:ind w:left="720" w:hanging="360"/>
       </w:pPr>
       <w:rPr>
-        <w:rFonts w:ascii="Symbol" w:hAnsi="Symbol" w:hint="default"/>
+        <w:rFonts w:hint="default" w:ascii="Symbol" w:hAnsi="Symbol"/>
       </w:rPr>
     </w:lvl>
     <w:lvl w:ilvl="1" w:tplc="140A0003" w:tentative="1">
@@ -2934,7 +2779,7 @@
         <w:ind w:left="1440" w:hanging="360"/>
       </w:pPr>
       <w:rPr>
-        <w:rFonts w:ascii="Courier New" w:hAnsi="Courier New" w:cs="Courier New" w:hint="default"/>
+        <w:rFonts w:hint="default" w:ascii="Courier New" w:hAnsi="Courier New" w:cs="Courier New"/>
       </w:rPr>
     </w:lvl>
     <w:lvl w:ilvl="2" w:tplc="140A0005" w:tentative="1">
@@ -2946,7 +2791,7 @@
         <w:ind w:left="2160" w:hanging="360"/>
       </w:pPr>
       <w:rPr>
-        <w:rFonts w:ascii="Wingdings" w:hAnsi="Wingdings" w:hint="default"/>
+        <w:rFonts w:hint="default" w:ascii="Wingdings" w:hAnsi="Wingdings"/>
       </w:rPr>
     </w:lvl>
     <w:lvl w:ilvl="3" w:tplc="140A0001" w:tentative="1">
@@ -2958,7 +2803,7 @@
         <w:ind w:left="2880" w:hanging="360"/>
       </w:pPr>
       <w:rPr>
-        <w:rFonts w:ascii="Symbol" w:hAnsi="Symbol" w:hint="default"/>
+        <w:rFonts w:hint="default" w:ascii="Symbol" w:hAnsi="Symbol"/>
       </w:rPr>
     </w:lvl>
     <w:lvl w:ilvl="4" w:tplc="140A0003" w:tentative="1">
@@ -2970,7 +2815,7 @@
         <w:ind w:left="3600" w:hanging="360"/>
       </w:pPr>
       <w:rPr>
-        <w:rFonts w:ascii="Courier New" w:hAnsi="Courier New" w:cs="Courier New" w:hint="default"/>
+        <w:rFonts w:hint="default" w:ascii="Courier New" w:hAnsi="Courier New" w:cs="Courier New"/>
       </w:rPr>
     </w:lvl>
     <w:lvl w:ilvl="5" w:tplc="140A0005" w:tentative="1">
@@ -2982,7 +2827,7 @@
         <w:ind w:left="4320" w:hanging="360"/>
       </w:pPr>
       <w:rPr>
-        <w:rFonts w:ascii="Wingdings" w:hAnsi="Wingdings" w:hint="default"/>
+        <w:rFonts w:hint="default" w:ascii="Wingdings" w:hAnsi="Wingdings"/>
       </w:rPr>
     </w:lvl>
     <w:lvl w:ilvl="6" w:tplc="140A0001" w:tentative="1">
@@ -2994,7 +2839,7 @@
         <w:ind w:left="5040" w:hanging="360"/>
       </w:pPr>
       <w:rPr>
-        <w:rFonts w:ascii="Symbol" w:hAnsi="Symbol" w:hint="default"/>
+        <w:rFonts w:hint="default" w:ascii="Symbol" w:hAnsi="Symbol"/>
       </w:rPr>
     </w:lvl>
     <w:lvl w:ilvl="7" w:tplc="140A0003" w:tentative="1">
@@ -3006,7 +2851,7 @@
         <w:ind w:left="5760" w:hanging="360"/>
       </w:pPr>
       <w:rPr>
-        <w:rFonts w:ascii="Courier New" w:hAnsi="Courier New" w:cs="Courier New" w:hint="default"/>
+        <w:rFonts w:hint="default" w:ascii="Courier New" w:hAnsi="Courier New" w:cs="Courier New"/>
       </w:rPr>
     </w:lvl>
     <w:lvl w:ilvl="8" w:tplc="140A0005" w:tentative="1">
@@ -3018,7 +2863,7 @@
         <w:ind w:left="6480" w:hanging="360"/>
       </w:pPr>
       <w:rPr>
-        <w:rFonts w:ascii="Wingdings" w:hAnsi="Wingdings" w:hint="default"/>
+        <w:rFonts w:hint="default" w:ascii="Wingdings" w:hAnsi="Wingdings"/>
       </w:rPr>
     </w:lvl>
   </w:abstractNum>
@@ -3038,7 +2883,7 @@
         <w:ind w:left="720" w:hanging="360"/>
       </w:pPr>
       <w:rPr>
-        <w:rFonts w:ascii="Symbol" w:hAnsi="Symbol" w:hint="default"/>
+        <w:rFonts w:hint="default" w:ascii="Symbol" w:hAnsi="Symbol"/>
         <w:sz w:val="20"/>
       </w:rPr>
     </w:lvl>
@@ -3054,7 +2899,7 @@
         <w:ind w:left="1440" w:hanging="360"/>
       </w:pPr>
       <w:rPr>
-        <w:rFonts w:ascii="Courier New" w:hAnsi="Courier New" w:hint="default"/>
+        <w:rFonts w:hint="default" w:ascii="Courier New" w:hAnsi="Courier New"/>
         <w:sz w:val="20"/>
       </w:rPr>
     </w:lvl>
@@ -3070,7 +2915,7 @@
         <w:ind w:left="2160" w:hanging="360"/>
       </w:pPr>
       <w:rPr>
-        <w:rFonts w:ascii="Wingdings" w:hAnsi="Wingdings" w:hint="default"/>
+        <w:rFonts w:hint="default" w:ascii="Wingdings" w:hAnsi="Wingdings"/>
         <w:sz w:val="20"/>
       </w:rPr>
     </w:lvl>
@@ -3086,7 +2931,7 @@
         <w:ind w:left="2880" w:hanging="360"/>
       </w:pPr>
       <w:rPr>
-        <w:rFonts w:ascii="Wingdings" w:hAnsi="Wingdings" w:hint="default"/>
+        <w:rFonts w:hint="default" w:ascii="Wingdings" w:hAnsi="Wingdings"/>
         <w:sz w:val="20"/>
       </w:rPr>
     </w:lvl>
@@ -3102,7 +2947,7 @@
         <w:ind w:left="3600" w:hanging="360"/>
       </w:pPr>
       <w:rPr>
-        <w:rFonts w:ascii="Wingdings" w:hAnsi="Wingdings" w:hint="default"/>
+        <w:rFonts w:hint="default" w:ascii="Wingdings" w:hAnsi="Wingdings"/>
         <w:sz w:val="20"/>
       </w:rPr>
     </w:lvl>
@@ -3118,7 +2963,7 @@
         <w:ind w:left="4320" w:hanging="360"/>
       </w:pPr>
       <w:rPr>
-        <w:rFonts w:ascii="Wingdings" w:hAnsi="Wingdings" w:hint="default"/>
+        <w:rFonts w:hint="default" w:ascii="Wingdings" w:hAnsi="Wingdings"/>
         <w:sz w:val="20"/>
       </w:rPr>
     </w:lvl>
@@ -3134,7 +2979,7 @@
         <w:ind w:left="5040" w:hanging="360"/>
       </w:pPr>
       <w:rPr>
-        <w:rFonts w:ascii="Wingdings" w:hAnsi="Wingdings" w:hint="default"/>
+        <w:rFonts w:hint="default" w:ascii="Wingdings" w:hAnsi="Wingdings"/>
         <w:sz w:val="20"/>
       </w:rPr>
     </w:lvl>
@@ -3150,7 +2995,7 @@
         <w:ind w:left="5760" w:hanging="360"/>
       </w:pPr>
       <w:rPr>
-        <w:rFonts w:ascii="Wingdings" w:hAnsi="Wingdings" w:hint="default"/>
+        <w:rFonts w:hint="default" w:ascii="Wingdings" w:hAnsi="Wingdings"/>
         <w:sz w:val="20"/>
       </w:rPr>
     </w:lvl>
@@ -3166,7 +3011,7 @@
         <w:ind w:left="6480" w:hanging="360"/>
       </w:pPr>
       <w:rPr>
-        <w:rFonts w:ascii="Wingdings" w:hAnsi="Wingdings" w:hint="default"/>
+        <w:rFonts w:hint="default" w:ascii="Wingdings" w:hAnsi="Wingdings"/>
         <w:sz w:val="20"/>
       </w:rPr>
     </w:lvl>
@@ -3187,7 +3032,7 @@
         <w:ind w:left="720" w:hanging="360"/>
       </w:pPr>
       <w:rPr>
-        <w:rFonts w:ascii="Symbol" w:hAnsi="Symbol" w:hint="default"/>
+        <w:rFonts w:hint="default" w:ascii="Symbol" w:hAnsi="Symbol"/>
         <w:sz w:val="20"/>
       </w:rPr>
     </w:lvl>
@@ -3203,7 +3048,7 @@
         <w:ind w:left="1440" w:hanging="360"/>
       </w:pPr>
       <w:rPr>
-        <w:rFonts w:ascii="Courier New" w:hAnsi="Courier New" w:hint="default"/>
+        <w:rFonts w:hint="default" w:ascii="Courier New" w:hAnsi="Courier New"/>
         <w:sz w:val="20"/>
       </w:rPr>
     </w:lvl>
@@ -3219,7 +3064,7 @@
         <w:ind w:left="2160" w:hanging="360"/>
       </w:pPr>
       <w:rPr>
-        <w:rFonts w:ascii="Wingdings" w:hAnsi="Wingdings" w:hint="default"/>
+        <w:rFonts w:hint="default" w:ascii="Wingdings" w:hAnsi="Wingdings"/>
         <w:sz w:val="20"/>
       </w:rPr>
     </w:lvl>
@@ -3235,7 +3080,7 @@
         <w:ind w:left="2880" w:hanging="360"/>
       </w:pPr>
       <w:rPr>
-        <w:rFonts w:ascii="Wingdings" w:hAnsi="Wingdings" w:hint="default"/>
+        <w:rFonts w:hint="default" w:ascii="Wingdings" w:hAnsi="Wingdings"/>
         <w:sz w:val="20"/>
       </w:rPr>
     </w:lvl>
@@ -3251,7 +3096,7 @@
         <w:ind w:left="3600" w:hanging="360"/>
       </w:pPr>
       <w:rPr>
-        <w:rFonts w:ascii="Wingdings" w:hAnsi="Wingdings" w:hint="default"/>
+        <w:rFonts w:hint="default" w:ascii="Wingdings" w:hAnsi="Wingdings"/>
         <w:sz w:val="20"/>
       </w:rPr>
     </w:lvl>
@@ -3267,7 +3112,7 @@
         <w:ind w:left="4320" w:hanging="360"/>
       </w:pPr>
       <w:rPr>
-        <w:rFonts w:ascii="Wingdings" w:hAnsi="Wingdings" w:hint="default"/>
+        <w:rFonts w:hint="default" w:ascii="Wingdings" w:hAnsi="Wingdings"/>
         <w:sz w:val="20"/>
       </w:rPr>
     </w:lvl>
@@ -3283,7 +3128,7 @@
         <w:ind w:left="5040" w:hanging="360"/>
       </w:pPr>
       <w:rPr>
-        <w:rFonts w:ascii="Wingdings" w:hAnsi="Wingdings" w:hint="default"/>
+        <w:rFonts w:hint="default" w:ascii="Wingdings" w:hAnsi="Wingdings"/>
         <w:sz w:val="20"/>
       </w:rPr>
     </w:lvl>
@@ -3299,7 +3144,7 @@
         <w:ind w:left="5760" w:hanging="360"/>
       </w:pPr>
       <w:rPr>
-        <w:rFonts w:ascii="Wingdings" w:hAnsi="Wingdings" w:hint="default"/>
+        <w:rFonts w:hint="default" w:ascii="Wingdings" w:hAnsi="Wingdings"/>
         <w:sz w:val="20"/>
       </w:rPr>
     </w:lvl>
@@ -3315,7 +3160,7 @@
         <w:ind w:left="6480" w:hanging="360"/>
       </w:pPr>
       <w:rPr>
-        <w:rFonts w:ascii="Wingdings" w:hAnsi="Wingdings" w:hint="default"/>
+        <w:rFonts w:hint="default" w:ascii="Wingdings" w:hAnsi="Wingdings"/>
         <w:sz w:val="20"/>
       </w:rPr>
     </w:lvl>
@@ -3336,7 +3181,7 @@
         <w:ind w:left="720" w:hanging="360"/>
       </w:pPr>
       <w:rPr>
-        <w:rFonts w:ascii="Symbol" w:hAnsi="Symbol" w:hint="default"/>
+        <w:rFonts w:hint="default" w:ascii="Symbol" w:hAnsi="Symbol"/>
         <w:sz w:val="20"/>
       </w:rPr>
     </w:lvl>
@@ -3352,7 +3197,7 @@
         <w:ind w:left="1440" w:hanging="360"/>
       </w:pPr>
       <w:rPr>
-        <w:rFonts w:ascii="Courier New" w:hAnsi="Courier New" w:hint="default"/>
+        <w:rFonts w:hint="default" w:ascii="Courier New" w:hAnsi="Courier New"/>
         <w:sz w:val="20"/>
       </w:rPr>
     </w:lvl>
@@ -3368,7 +3213,7 @@
         <w:ind w:left="2160" w:hanging="360"/>
       </w:pPr>
       <w:rPr>
-        <w:rFonts w:ascii="Wingdings" w:hAnsi="Wingdings" w:hint="default"/>
+        <w:rFonts w:hint="default" w:ascii="Wingdings" w:hAnsi="Wingdings"/>
         <w:sz w:val="20"/>
       </w:rPr>
     </w:lvl>
@@ -3384,7 +3229,7 @@
         <w:ind w:left="2880" w:hanging="360"/>
       </w:pPr>
       <w:rPr>
-        <w:rFonts w:ascii="Wingdings" w:hAnsi="Wingdings" w:hint="default"/>
+        <w:rFonts w:hint="default" w:ascii="Wingdings" w:hAnsi="Wingdings"/>
         <w:sz w:val="20"/>
       </w:rPr>
     </w:lvl>
@@ -3400,7 +3245,7 @@
         <w:ind w:left="3600" w:hanging="360"/>
       </w:pPr>
       <w:rPr>
-        <w:rFonts w:ascii="Wingdings" w:hAnsi="Wingdings" w:hint="default"/>
+        <w:rFonts w:hint="default" w:ascii="Wingdings" w:hAnsi="Wingdings"/>
         <w:sz w:val="20"/>
       </w:rPr>
     </w:lvl>
@@ -3416,7 +3261,7 @@
         <w:ind w:left="4320" w:hanging="360"/>
       </w:pPr>
       <w:rPr>
-        <w:rFonts w:ascii="Wingdings" w:hAnsi="Wingdings" w:hint="default"/>
+        <w:rFonts w:hint="default" w:ascii="Wingdings" w:hAnsi="Wingdings"/>
         <w:sz w:val="20"/>
       </w:rPr>
     </w:lvl>
@@ -3432,7 +3277,7 @@
         <w:ind w:left="5040" w:hanging="360"/>
       </w:pPr>
       <w:rPr>
-        <w:rFonts w:ascii="Wingdings" w:hAnsi="Wingdings" w:hint="default"/>
+        <w:rFonts w:hint="default" w:ascii="Wingdings" w:hAnsi="Wingdings"/>
         <w:sz w:val="20"/>
       </w:rPr>
     </w:lvl>
@@ -3448,7 +3293,7 @@
         <w:ind w:left="5760" w:hanging="360"/>
       </w:pPr>
       <w:rPr>
-        <w:rFonts w:ascii="Wingdings" w:hAnsi="Wingdings" w:hint="default"/>
+        <w:rFonts w:hint="default" w:ascii="Wingdings" w:hAnsi="Wingdings"/>
         <w:sz w:val="20"/>
       </w:rPr>
     </w:lvl>
@@ -3464,7 +3309,7 @@
         <w:ind w:left="6480" w:hanging="360"/>
       </w:pPr>
       <w:rPr>
-        <w:rFonts w:ascii="Wingdings" w:hAnsi="Wingdings" w:hint="default"/>
+        <w:rFonts w:hint="default" w:ascii="Wingdings" w:hAnsi="Wingdings"/>
         <w:sz w:val="20"/>
       </w:rPr>
     </w:lvl>
@@ -3497,7 +3342,7 @@
         <w:ind w:left="1440" w:hanging="360"/>
       </w:pPr>
       <w:rPr>
-        <w:rFonts w:ascii="Courier New" w:hAnsi="Courier New" w:hint="default"/>
+        <w:rFonts w:hint="default" w:ascii="Courier New" w:hAnsi="Courier New"/>
         <w:sz w:val="20"/>
       </w:rPr>
     </w:lvl>
@@ -3599,7 +3444,7 @@
         <w:ind w:left="720" w:hanging="360"/>
       </w:pPr>
       <w:rPr>
-        <w:rFonts w:ascii="Symbol" w:hAnsi="Symbol" w:hint="default"/>
+        <w:rFonts w:hint="default" w:ascii="Symbol" w:hAnsi="Symbol"/>
       </w:rPr>
     </w:lvl>
     <w:lvl w:ilvl="1" w:tplc="140A0003" w:tentative="1">
@@ -3611,7 +3456,7 @@
         <w:ind w:left="1440" w:hanging="360"/>
       </w:pPr>
       <w:rPr>
-        <w:rFonts w:ascii="Courier New" w:hAnsi="Courier New" w:cs="Courier New" w:hint="default"/>
+        <w:rFonts w:hint="default" w:ascii="Courier New" w:hAnsi="Courier New" w:cs="Courier New"/>
       </w:rPr>
     </w:lvl>
     <w:lvl w:ilvl="2" w:tplc="140A0005" w:tentative="1">
@@ -3623,7 +3468,7 @@
         <w:ind w:left="2160" w:hanging="360"/>
       </w:pPr>
       <w:rPr>
-        <w:rFonts w:ascii="Wingdings" w:hAnsi="Wingdings" w:hint="default"/>
+        <w:rFonts w:hint="default" w:ascii="Wingdings" w:hAnsi="Wingdings"/>
       </w:rPr>
     </w:lvl>
     <w:lvl w:ilvl="3" w:tplc="140A0001" w:tentative="1">
@@ -3635,7 +3480,7 @@
         <w:ind w:left="2880" w:hanging="360"/>
       </w:pPr>
       <w:rPr>
-        <w:rFonts w:ascii="Symbol" w:hAnsi="Symbol" w:hint="default"/>
+        <w:rFonts w:hint="default" w:ascii="Symbol" w:hAnsi="Symbol"/>
       </w:rPr>
     </w:lvl>
     <w:lvl w:ilvl="4" w:tplc="140A0003" w:tentative="1">
@@ -3647,7 +3492,7 @@
         <w:ind w:left="3600" w:hanging="360"/>
       </w:pPr>
       <w:rPr>
-        <w:rFonts w:ascii="Courier New" w:hAnsi="Courier New" w:cs="Courier New" w:hint="default"/>
+        <w:rFonts w:hint="default" w:ascii="Courier New" w:hAnsi="Courier New" w:cs="Courier New"/>
       </w:rPr>
     </w:lvl>
     <w:lvl w:ilvl="5" w:tplc="140A0005" w:tentative="1">
@@ -3659,7 +3504,7 @@
         <w:ind w:left="4320" w:hanging="360"/>
       </w:pPr>
       <w:rPr>
-        <w:rFonts w:ascii="Wingdings" w:hAnsi="Wingdings" w:hint="default"/>
+        <w:rFonts w:hint="default" w:ascii="Wingdings" w:hAnsi="Wingdings"/>
       </w:rPr>
     </w:lvl>
     <w:lvl w:ilvl="6" w:tplc="140A0001" w:tentative="1">
@@ -3671,7 +3516,7 @@
         <w:ind w:left="5040" w:hanging="360"/>
       </w:pPr>
       <w:rPr>
-        <w:rFonts w:ascii="Symbol" w:hAnsi="Symbol" w:hint="default"/>
+        <w:rFonts w:hint="default" w:ascii="Symbol" w:hAnsi="Symbol"/>
       </w:rPr>
     </w:lvl>
     <w:lvl w:ilvl="7" w:tplc="140A0003" w:tentative="1">
@@ -3683,7 +3528,7 @@
         <w:ind w:left="5760" w:hanging="360"/>
       </w:pPr>
       <w:rPr>
-        <w:rFonts w:ascii="Courier New" w:hAnsi="Courier New" w:cs="Courier New" w:hint="default"/>
+        <w:rFonts w:hint="default" w:ascii="Courier New" w:hAnsi="Courier New" w:cs="Courier New"/>
       </w:rPr>
     </w:lvl>
     <w:lvl w:ilvl="8" w:tplc="140A0005" w:tentative="1">
@@ -3695,7 +3540,7 @@
         <w:ind w:left="6480" w:hanging="360"/>
       </w:pPr>
       <w:rPr>
-        <w:rFonts w:ascii="Wingdings" w:hAnsi="Wingdings" w:hint="default"/>
+        <w:rFonts w:hint="default" w:ascii="Wingdings" w:hAnsi="Wingdings"/>
       </w:rPr>
     </w:lvl>
   </w:abstractNum>
@@ -3739,11 +3584,11 @@
 </file>
 
 <file path=word/styles.xml><?xml version="1.0" encoding="utf-8"?>
-<w:styles xmlns:mc="http://schemas.openxmlformats.org/markup-compatibility/2006" xmlns:r="http://schemas.openxmlformats.org/officeDocument/2006/relationships" xmlns:w="http://schemas.openxmlformats.org/wordprocessingml/2006/main" xmlns:w14="http://schemas.microsoft.com/office/word/2010/wordml" xmlns:w15="http://schemas.microsoft.com/office/word/2012/wordml" xmlns:w16cex="http://schemas.microsoft.com/office/word/2018/wordml/cex" xmlns:w16cid="http://schemas.microsoft.com/office/word/2016/wordml/cid" xmlns:w16="http://schemas.microsoft.com/office/word/2018/wordml" xmlns:w16du="http://schemas.microsoft.com/office/word/2023/wordml/word16du" xmlns:w16sdtdh="http://schemas.microsoft.com/office/word/2020/wordml/sdtdatahash" xmlns:w16sdtfl="http://schemas.microsoft.com/office/word/2024/wordml/sdtformatlock" xmlns:w16se="http://schemas.microsoft.com/office/word/2015/wordml/symex" mc:Ignorable="w14 w15 w16se w16cid w16 w16cex w16sdtdh w16sdtfl w16du">
+<w:styles xmlns:wp14="http://schemas.microsoft.com/office/word/2010/wordprocessingDrawing" xmlns:mc="http://schemas.openxmlformats.org/markup-compatibility/2006" xmlns:r="http://schemas.openxmlformats.org/officeDocument/2006/relationships" xmlns:w="http://schemas.openxmlformats.org/wordprocessingml/2006/main" xmlns:w14="http://schemas.microsoft.com/office/word/2010/wordml" xmlns:w15="http://schemas.microsoft.com/office/word/2012/wordml" xmlns:w16cex="http://schemas.microsoft.com/office/word/2018/wordml/cex" xmlns:w16cid="http://schemas.microsoft.com/office/word/2016/wordml/cid" xmlns:w16="http://schemas.microsoft.com/office/word/2018/wordml" xmlns:w16du="http://schemas.microsoft.com/office/word/2023/wordml/word16du" xmlns:w16sdtdh="http://schemas.microsoft.com/office/word/2020/wordml/sdtdatahash" xmlns:w16sdtfl="http://schemas.microsoft.com/office/word/2024/wordml/sdtformatlock" xmlns:w16se="http://schemas.microsoft.com/office/word/2015/wordml/symex" mc:Ignorable="w14 w15 w16se w16cid w16 w16cex w16sdtdh w16sdtfl w16du wp14">
   <w:docDefaults>
     <w:rPrDefault>
       <w:rPr>
-        <w:rFonts w:asciiTheme="minorHAnsi" w:eastAsiaTheme="minorHAnsi" w:hAnsiTheme="minorHAnsi" w:cstheme="minorBidi"/>
+        <w:rFonts w:asciiTheme="minorHAnsi" w:hAnsiTheme="minorHAnsi" w:eastAsiaTheme="minorHAnsi" w:cstheme="minorBidi"/>
         <w:kern w:val="2"/>
         <w:sz w:val="24"/>
         <w:szCs w:val="24"/>
@@ -3760,14 +3605,14 @@
   <w:latentStyles w:defLockedState="0" w:defUIPriority="99" w:defSemiHidden="0" w:defUnhideWhenUsed="0" w:defQFormat="0" w:count="376">
     <w:lsdException w:name="Normal" w:uiPriority="0" w:qFormat="1"/>
     <w:lsdException w:name="heading 1" w:uiPriority="9" w:qFormat="1"/>
-    <w:lsdException w:name="heading 2" w:semiHidden="1" w:uiPriority="9" w:unhideWhenUsed="1" w:qFormat="1"/>
-    <w:lsdException w:name="heading 3" w:semiHidden="1" w:uiPriority="9" w:unhideWhenUsed="1" w:qFormat="1"/>
-    <w:lsdException w:name="heading 4" w:semiHidden="1" w:uiPriority="9" w:unhideWhenUsed="1" w:qFormat="1"/>
-    <w:lsdException w:name="heading 5" w:semiHidden="1" w:uiPriority="9" w:unhideWhenUsed="1" w:qFormat="1"/>
-    <w:lsdException w:name="heading 6" w:semiHidden="1" w:uiPriority="9" w:unhideWhenUsed="1" w:qFormat="1"/>
-    <w:lsdException w:name="heading 7" w:semiHidden="1" w:uiPriority="9" w:unhideWhenUsed="1" w:qFormat="1"/>
-    <w:lsdException w:name="heading 8" w:semiHidden="1" w:uiPriority="9" w:unhideWhenUsed="1" w:qFormat="1"/>
-    <w:lsdException w:name="heading 9" w:semiHidden="1" w:uiPriority="9" w:unhideWhenUsed="1" w:qFormat="1"/>
+    <w:lsdException w:name="heading 2" w:uiPriority="9" w:semiHidden="1" w:unhideWhenUsed="1" w:qFormat="1"/>
+    <w:lsdException w:name="heading 3" w:uiPriority="9" w:semiHidden="1" w:unhideWhenUsed="1" w:qFormat="1"/>
+    <w:lsdException w:name="heading 4" w:uiPriority="9" w:semiHidden="1" w:unhideWhenUsed="1" w:qFormat="1"/>
+    <w:lsdException w:name="heading 5" w:uiPriority="9" w:semiHidden="1" w:unhideWhenUsed="1" w:qFormat="1"/>
+    <w:lsdException w:name="heading 6" w:uiPriority="9" w:semiHidden="1" w:unhideWhenUsed="1" w:qFormat="1"/>
+    <w:lsdException w:name="heading 7" w:uiPriority="9" w:semiHidden="1" w:unhideWhenUsed="1" w:qFormat="1"/>
+    <w:lsdException w:name="heading 8" w:uiPriority="9" w:semiHidden="1" w:unhideWhenUsed="1" w:qFormat="1"/>
+    <w:lsdException w:name="heading 9" w:uiPriority="9" w:semiHidden="1" w:unhideWhenUsed="1" w:qFormat="1"/>
     <w:lsdException w:name="index 1" w:semiHidden="1" w:unhideWhenUsed="1"/>
     <w:lsdException w:name="index 2" w:semiHidden="1" w:unhideWhenUsed="1"/>
     <w:lsdException w:name="index 3" w:semiHidden="1" w:unhideWhenUsed="1"/>
@@ -3777,22 +3622,22 @@
     <w:lsdException w:name="index 7" w:semiHidden="1" w:unhideWhenUsed="1"/>
     <w:lsdException w:name="index 8" w:semiHidden="1" w:unhideWhenUsed="1"/>
     <w:lsdException w:name="index 9" w:semiHidden="1" w:unhideWhenUsed="1"/>
-    <w:lsdException w:name="toc 1" w:semiHidden="1" w:uiPriority="39" w:unhideWhenUsed="1"/>
-    <w:lsdException w:name="toc 2" w:semiHidden="1" w:uiPriority="39" w:unhideWhenUsed="1"/>
-    <w:lsdException w:name="toc 3" w:semiHidden="1" w:uiPriority="39" w:unhideWhenUsed="1"/>
-    <w:lsdException w:name="toc 4" w:semiHidden="1" w:uiPriority="39" w:unhideWhenUsed="1"/>
-    <w:lsdException w:name="toc 5" w:semiHidden="1" w:uiPriority="39" w:unhideWhenUsed="1"/>
-    <w:lsdException w:name="toc 6" w:semiHidden="1" w:uiPriority="39" w:unhideWhenUsed="1"/>
-    <w:lsdException w:name="toc 7" w:semiHidden="1" w:uiPriority="39" w:unhideWhenUsed="1"/>
-    <w:lsdException w:name="toc 8" w:semiHidden="1" w:uiPriority="39" w:unhideWhenUsed="1"/>
-    <w:lsdException w:name="toc 9" w:semiHidden="1" w:uiPriority="39" w:unhideWhenUsed="1"/>
+    <w:lsdException w:name="toc 1" w:uiPriority="39" w:semiHidden="1" w:unhideWhenUsed="1"/>
+    <w:lsdException w:name="toc 2" w:uiPriority="39" w:semiHidden="1" w:unhideWhenUsed="1"/>
+    <w:lsdException w:name="toc 3" w:uiPriority="39" w:semiHidden="1" w:unhideWhenUsed="1"/>
+    <w:lsdException w:name="toc 4" w:uiPriority="39" w:semiHidden="1" w:unhideWhenUsed="1"/>
+    <w:lsdException w:name="toc 5" w:uiPriority="39" w:semiHidden="1" w:unhideWhenUsed="1"/>
+    <w:lsdException w:name="toc 6" w:uiPriority="39" w:semiHidden="1" w:unhideWhenUsed="1"/>
+    <w:lsdException w:name="toc 7" w:uiPriority="39" w:semiHidden="1" w:unhideWhenUsed="1"/>
+    <w:lsdException w:name="toc 8" w:uiPriority="39" w:semiHidden="1" w:unhideWhenUsed="1"/>
+    <w:lsdException w:name="toc 9" w:uiPriority="39" w:semiHidden="1" w:unhideWhenUsed="1"/>
     <w:lsdException w:name="Normal Indent" w:semiHidden="1" w:unhideWhenUsed="1"/>
     <w:lsdException w:name="footnote text" w:semiHidden="1" w:unhideWhenUsed="1"/>
     <w:lsdException w:name="annotation text" w:semiHidden="1" w:unhideWhenUsed="1"/>
     <w:lsdException w:name="header" w:semiHidden="1" w:unhideWhenUsed="1"/>
     <w:lsdException w:name="footer" w:semiHidden="1" w:unhideWhenUsed="1"/>
     <w:lsdException w:name="index heading" w:semiHidden="1" w:unhideWhenUsed="1"/>
-    <w:lsdException w:name="caption" w:semiHidden="1" w:uiPriority="35" w:unhideWhenUsed="1" w:qFormat="1"/>
+    <w:lsdException w:name="caption" w:uiPriority="35" w:semiHidden="1" w:unhideWhenUsed="1" w:qFormat="1"/>
     <w:lsdException w:name="table of figures" w:semiHidden="1" w:unhideWhenUsed="1"/>
     <w:lsdException w:name="envelope address" w:semiHidden="1" w:unhideWhenUsed="1"/>
     <w:lsdException w:name="envelope return" w:semiHidden="1" w:unhideWhenUsed="1"/>
@@ -3823,7 +3668,7 @@
     <w:lsdException w:name="Title" w:uiPriority="10" w:qFormat="1"/>
     <w:lsdException w:name="Closing" w:semiHidden="1" w:unhideWhenUsed="1"/>
     <w:lsdException w:name="Signature" w:semiHidden="1" w:unhideWhenUsed="1"/>
-    <w:lsdException w:name="Default Paragraph Font" w:semiHidden="1" w:uiPriority="1" w:unhideWhenUsed="1"/>
+    <w:lsdException w:name="Default Paragraph Font" w:uiPriority="1" w:semiHidden="1" w:unhideWhenUsed="1"/>
     <w:lsdException w:name="Body Text" w:semiHidden="1" w:unhideWhenUsed="1"/>
     <w:lsdException w:name="Body Text Indent" w:semiHidden="1" w:unhideWhenUsed="1"/>
     <w:lsdException w:name="List Continue" w:semiHidden="1" w:unhideWhenUsed="1"/>
@@ -4023,8 +3868,8 @@
     <w:lsdException w:name="Subtle Reference" w:uiPriority="31" w:qFormat="1"/>
     <w:lsdException w:name="Intense Reference" w:uiPriority="32" w:qFormat="1"/>
     <w:lsdException w:name="Book Title" w:uiPriority="33" w:qFormat="1"/>
-    <w:lsdException w:name="Bibliography" w:semiHidden="1" w:uiPriority="37" w:unhideWhenUsed="1"/>
-    <w:lsdException w:name="TOC Heading" w:semiHidden="1" w:uiPriority="39" w:unhideWhenUsed="1" w:qFormat="1"/>
+    <w:lsdException w:name="Bibliography" w:uiPriority="37" w:semiHidden="1" w:unhideWhenUsed="1"/>
+    <w:lsdException w:name="TOC Heading" w:uiPriority="39" w:semiHidden="1" w:unhideWhenUsed="1" w:qFormat="1"/>
     <w:lsdException w:name="Plain Table 1" w:uiPriority="41"/>
     <w:lsdException w:name="Plain Table 2" w:uiPriority="42"/>
     <w:lsdException w:name="Plain Table 3" w:uiPriority="43"/>
@@ -4135,7 +3980,7 @@
     <w:lsdException w:name="Unresolved Mention" w:semiHidden="1" w:unhideWhenUsed="1"/>
     <w:lsdException w:name="Smart Link" w:semiHidden="1" w:unhideWhenUsed="1"/>
   </w:latentStyles>
-  <w:style w:type="paragraph" w:default="1" w:styleId="Normal">
+  <w:style w:type="paragraph" w:styleId="Normal" w:default="1">
     <w:name w:val="Normal"/>
     <w:qFormat/>
   </w:style>
@@ -4154,7 +3999,7 @@
       <w:outlineLvl w:val="0"/>
     </w:pPr>
     <w:rPr>
-      <w:rFonts w:asciiTheme="majorHAnsi" w:eastAsiaTheme="majorEastAsia" w:hAnsiTheme="majorHAnsi" w:cstheme="majorBidi"/>
+      <w:rFonts w:asciiTheme="majorHAnsi" w:hAnsiTheme="majorHAnsi" w:eastAsiaTheme="majorEastAsia" w:cstheme="majorBidi"/>
       <w:color w:val="0F4761" w:themeColor="accent1" w:themeShade="BF"/>
       <w:sz w:val="40"/>
       <w:szCs w:val="40"/>
@@ -4176,7 +4021,7 @@
       <w:outlineLvl w:val="1"/>
     </w:pPr>
     <w:rPr>
-      <w:rFonts w:asciiTheme="majorHAnsi" w:eastAsiaTheme="majorEastAsia" w:hAnsiTheme="majorHAnsi" w:cstheme="majorBidi"/>
+      <w:rFonts w:asciiTheme="majorHAnsi" w:hAnsiTheme="majorHAnsi" w:eastAsiaTheme="majorEastAsia" w:cstheme="majorBidi"/>
       <w:color w:val="0F4761" w:themeColor="accent1" w:themeShade="BF"/>
       <w:sz w:val="32"/>
       <w:szCs w:val="32"/>
@@ -4337,13 +4182,13 @@
       <w:color w:val="272727" w:themeColor="text1" w:themeTint="D8"/>
     </w:rPr>
   </w:style>
-  <w:style w:type="character" w:default="1" w:styleId="DefaultParagraphFont">
+  <w:style w:type="character" w:styleId="DefaultParagraphFont" w:default="1">
     <w:name w:val="Default Paragraph Font"/>
     <w:uiPriority w:val="1"/>
     <w:semiHidden/>
     <w:unhideWhenUsed/>
   </w:style>
-  <w:style w:type="table" w:default="1" w:styleId="TableNormal">
+  <w:style w:type="table" w:styleId="TableNormal" w:default="1">
     <w:name w:val="Normal Table"/>
     <w:uiPriority w:val="99"/>
     <w:semiHidden/>
@@ -4358,39 +4203,39 @@
       </w:tblCellMar>
     </w:tblPr>
   </w:style>
-  <w:style w:type="numbering" w:default="1" w:styleId="NoList">
+  <w:style w:type="numbering" w:styleId="NoList" w:default="1">
     <w:name w:val="No List"/>
     <w:uiPriority w:val="99"/>
     <w:semiHidden/>
     <w:unhideWhenUsed/>
   </w:style>
-  <w:style w:type="character" w:customStyle="1" w:styleId="Heading1Char">
+  <w:style w:type="character" w:styleId="Heading1Char" w:customStyle="1">
     <w:name w:val="Heading 1 Char"/>
     <w:basedOn w:val="DefaultParagraphFont"/>
     <w:link w:val="Heading1"/>
     <w:uiPriority w:val="9"/>
     <w:rsid w:val="008558FF"/>
     <w:rPr>
-      <w:rFonts w:asciiTheme="majorHAnsi" w:eastAsiaTheme="majorEastAsia" w:hAnsiTheme="majorHAnsi" w:cstheme="majorBidi"/>
+      <w:rFonts w:asciiTheme="majorHAnsi" w:hAnsiTheme="majorHAnsi" w:eastAsiaTheme="majorEastAsia" w:cstheme="majorBidi"/>
       <w:color w:val="0F4761" w:themeColor="accent1" w:themeShade="BF"/>
       <w:sz w:val="40"/>
       <w:szCs w:val="40"/>
     </w:rPr>
   </w:style>
-  <w:style w:type="character" w:customStyle="1" w:styleId="Heading2Char">
+  <w:style w:type="character" w:styleId="Heading2Char" w:customStyle="1">
     <w:name w:val="Heading 2 Char"/>
     <w:basedOn w:val="DefaultParagraphFont"/>
     <w:link w:val="Heading2"/>
     <w:uiPriority w:val="9"/>
     <w:rsid w:val="008558FF"/>
     <w:rPr>
-      <w:rFonts w:asciiTheme="majorHAnsi" w:eastAsiaTheme="majorEastAsia" w:hAnsiTheme="majorHAnsi" w:cstheme="majorBidi"/>
+      <w:rFonts w:asciiTheme="majorHAnsi" w:hAnsiTheme="majorHAnsi" w:eastAsiaTheme="majorEastAsia" w:cstheme="majorBidi"/>
       <w:color w:val="0F4761" w:themeColor="accent1" w:themeShade="BF"/>
       <w:sz w:val="32"/>
       <w:szCs w:val="32"/>
     </w:rPr>
   </w:style>
-  <w:style w:type="character" w:customStyle="1" w:styleId="Heading3Char">
+  <w:style w:type="character" w:styleId="Heading3Char" w:customStyle="1">
     <w:name w:val="Heading 3 Char"/>
     <w:basedOn w:val="DefaultParagraphFont"/>
     <w:link w:val="Heading3"/>
@@ -4404,7 +4249,7 @@
       <w:szCs w:val="28"/>
     </w:rPr>
   </w:style>
-  <w:style w:type="character" w:customStyle="1" w:styleId="Heading4Char">
+  <w:style w:type="character" w:styleId="Heading4Char" w:customStyle="1">
     <w:name w:val="Heading 4 Char"/>
     <w:basedOn w:val="DefaultParagraphFont"/>
     <w:link w:val="Heading4"/>
@@ -4418,7 +4263,7 @@
       <w:color w:val="0F4761" w:themeColor="accent1" w:themeShade="BF"/>
     </w:rPr>
   </w:style>
-  <w:style w:type="character" w:customStyle="1" w:styleId="Heading5Char">
+  <w:style w:type="character" w:styleId="Heading5Char" w:customStyle="1">
     <w:name w:val="Heading 5 Char"/>
     <w:basedOn w:val="DefaultParagraphFont"/>
     <w:link w:val="Heading5"/>
@@ -4430,7 +4275,7 @@
       <w:color w:val="0F4761" w:themeColor="accent1" w:themeShade="BF"/>
     </w:rPr>
   </w:style>
-  <w:style w:type="character" w:customStyle="1" w:styleId="Heading6Char">
+  <w:style w:type="character" w:styleId="Heading6Char" w:customStyle="1">
     <w:name w:val="Heading 6 Char"/>
     <w:basedOn w:val="DefaultParagraphFont"/>
     <w:link w:val="Heading6"/>
@@ -4444,7 +4289,7 @@
       <w:color w:val="595959" w:themeColor="text1" w:themeTint="A6"/>
     </w:rPr>
   </w:style>
-  <w:style w:type="character" w:customStyle="1" w:styleId="Heading7Char">
+  <w:style w:type="character" w:styleId="Heading7Char" w:customStyle="1">
     <w:name w:val="Heading 7 Char"/>
     <w:basedOn w:val="DefaultParagraphFont"/>
     <w:link w:val="Heading7"/>
@@ -4456,7 +4301,7 @@
       <w:color w:val="595959" w:themeColor="text1" w:themeTint="A6"/>
     </w:rPr>
   </w:style>
-  <w:style w:type="character" w:customStyle="1" w:styleId="Heading8Char">
+  <w:style w:type="character" w:styleId="Heading8Char" w:customStyle="1">
     <w:name w:val="Heading 8 Char"/>
     <w:basedOn w:val="DefaultParagraphFont"/>
     <w:link w:val="Heading8"/>
@@ -4470,7 +4315,7 @@
       <w:color w:val="272727" w:themeColor="text1" w:themeTint="D8"/>
     </w:rPr>
   </w:style>
-  <w:style w:type="character" w:customStyle="1" w:styleId="Heading9Char">
+  <w:style w:type="character" w:styleId="Heading9Char" w:customStyle="1">
     <w:name w:val="Heading 9 Char"/>
     <w:basedOn w:val="DefaultParagraphFont"/>
     <w:link w:val="Heading9"/>
@@ -4495,21 +4340,21 @@
       <w:contextualSpacing/>
     </w:pPr>
     <w:rPr>
-      <w:rFonts w:asciiTheme="majorHAnsi" w:eastAsiaTheme="majorEastAsia" w:hAnsiTheme="majorHAnsi" w:cstheme="majorBidi"/>
+      <w:rFonts w:asciiTheme="majorHAnsi" w:hAnsiTheme="majorHAnsi" w:eastAsiaTheme="majorEastAsia" w:cstheme="majorBidi"/>
       <w:spacing w:val="-10"/>
       <w:kern w:val="28"/>
       <w:sz w:val="56"/>
       <w:szCs w:val="56"/>
     </w:rPr>
   </w:style>
-  <w:style w:type="character" w:customStyle="1" w:styleId="TitleChar">
+  <w:style w:type="character" w:styleId="TitleChar" w:customStyle="1">
     <w:name w:val="Title Char"/>
     <w:basedOn w:val="DefaultParagraphFont"/>
     <w:link w:val="Title"/>
     <w:uiPriority w:val="10"/>
     <w:rsid w:val="008558FF"/>
     <w:rPr>
-      <w:rFonts w:asciiTheme="majorHAnsi" w:eastAsiaTheme="majorEastAsia" w:hAnsiTheme="majorHAnsi" w:cstheme="majorBidi"/>
+      <w:rFonts w:asciiTheme="majorHAnsi" w:hAnsiTheme="majorHAnsi" w:eastAsiaTheme="majorEastAsia" w:cstheme="majorBidi"/>
       <w:spacing w:val="-10"/>
       <w:kern w:val="28"/>
       <w:sz w:val="56"/>
@@ -4537,7 +4382,7 @@
       <w:szCs w:val="28"/>
     </w:rPr>
   </w:style>
-  <w:style w:type="character" w:customStyle="1" w:styleId="SubtitleChar">
+  <w:style w:type="character" w:styleId="SubtitleChar" w:customStyle="1">
     <w:name w:val="Subtitle Char"/>
     <w:basedOn w:val="DefaultParagraphFont"/>
     <w:link w:val="Subtitle"/>
@@ -4569,7 +4414,7 @@
       <w:color w:val="404040" w:themeColor="text1" w:themeTint="BF"/>
     </w:rPr>
   </w:style>
-  <w:style w:type="character" w:customStyle="1" w:styleId="QuoteChar">
+  <w:style w:type="character" w:styleId="QuoteChar" w:customStyle="1">
     <w:name w:val="Quote Char"/>
     <w:basedOn w:val="DefaultParagraphFont"/>
     <w:link w:val="Quote"/>
@@ -4614,8 +4459,8 @@
     <w:rsid w:val="008558FF"/>
     <w:pPr>
       <w:pBdr>
-        <w:top w:val="single" w:sz="4" w:space="10" w:color="0F4761" w:themeColor="accent1" w:themeShade="BF"/>
-        <w:bottom w:val="single" w:sz="4" w:space="10" w:color="0F4761" w:themeColor="accent1" w:themeShade="BF"/>
+        <w:top w:val="single" w:color="0F4761" w:themeColor="accent1" w:themeShade="BF" w:sz="4" w:space="10"/>
+        <w:bottom w:val="single" w:color="0F4761" w:themeColor="accent1" w:themeShade="BF" w:sz="4" w:space="10"/>
       </w:pBdr>
       <w:spacing w:before="360" w:after="360"/>
       <w:ind w:left="864" w:right="864"/>
@@ -4627,7 +4472,7 @@
       <w:color w:val="0F4761" w:themeColor="accent1" w:themeShade="BF"/>
     </w:rPr>
   </w:style>
-  <w:style w:type="character" w:customStyle="1" w:styleId="IntenseQuoteChar">
+  <w:style w:type="character" w:styleId="IntenseQuoteChar" w:customStyle="1">
     <w:name w:val="Intense Quote Char"/>
     <w:basedOn w:val="DefaultParagraphFont"/>
     <w:link w:val="IntenseQuote"/>
@@ -4664,7 +4509,7 @@
       <w:spacing w:before="100" w:beforeAutospacing="1" w:after="100" w:afterAutospacing="1" w:line="240" w:lineRule="auto"/>
     </w:pPr>
     <w:rPr>
-      <w:rFonts w:ascii="Times New Roman" w:eastAsia="Times New Roman" w:hAnsi="Times New Roman" w:cs="Times New Roman"/>
+      <w:rFonts w:ascii="Times New Roman" w:hAnsi="Times New Roman" w:eastAsia="Times New Roman" w:cs="Times New Roman"/>
       <w:kern w:val="0"/>
       <w14:ligatures w14:val="none"/>
     </w:rPr>
@@ -4707,7 +4552,7 @@
 </file>
 
 <file path=word/theme/theme1.xml><?xml version="1.0" encoding="utf-8"?>
-<a:theme xmlns:a="http://schemas.openxmlformats.org/drawingml/2006/main" name="Office Theme">
+<a:theme xmlns:a="http://schemas.openxmlformats.org/drawingml/2006/main" xmlns:thm15="http://schemas.microsoft.com/office/thememl/2012/main" name="Office Theme">
   <a:themeElements>
     <a:clrScheme name="Office">
       <a:dk1>

</xml_diff>

<commit_message>
Upload and download(to updated cells) excel file with selenium practice
</commit_message>
<xml_diff>
--- a/Selenium Tutorial.docx
+++ b/Selenium Tutorial.docx
@@ -6,8 +6,16 @@
       <w:pPr>
         <w:pStyle w:val="Heading1"/>
       </w:pPr>
-      <w:r>
-        <w:t>Selenium Framework</w:t>
+      <w:proofErr w:type="spellStart"/>
+      <w:r>
+        <w:t>z</w:t>
+      </w:r>
+      <w:r>
+        <w:t>Selenium</w:t>
+      </w:r>
+      <w:proofErr w:type="spellEnd"/>
+      <w:r>
+        <w:t xml:space="preserve"> Framework</w:t>
       </w:r>
     </w:p>
     <w:p>
@@ -23,6 +31,7 @@
       </w:r>
     </w:p>
     <w:p>
+      <w:proofErr w:type="spellStart"/>
       <w:r>
         <w:rPr>
           <w:b/>
@@ -30,19 +39,41 @@
         </w:rPr>
         <w:t>SelectorHub</w:t>
       </w:r>
+      <w:proofErr w:type="spellEnd"/>
       <w:r>
         <w:t xml:space="preserve"> is a plugin that helps us verify when a CSS selector is used — use only one in the code or more.</w:t>
       </w:r>
     </w:p>
     <w:p>
       <w:r>
-        <w:t>I can validate the identifier to use in locators cssSelector or xpath through the next two ways:</w:t>
-      </w:r>
-    </w:p>
-    <w:p>
-      <w:r>
-        <w:t>• Using the plugin SelectorHub</w:t>
-      </w:r>
+        <w:t xml:space="preserve">I can validate the identifier to use in locators </w:t>
+      </w:r>
+      <w:proofErr w:type="spellStart"/>
+      <w:r>
+        <w:t>cssSelector</w:t>
+      </w:r>
+      <w:proofErr w:type="spellEnd"/>
+      <w:r>
+        <w:t xml:space="preserve"> or </w:t>
+      </w:r>
+      <w:proofErr w:type="spellStart"/>
+      <w:r>
+        <w:t>xpath</w:t>
+      </w:r>
+      <w:proofErr w:type="spellEnd"/>
+      <w:r>
+        <w:t xml:space="preserve"> through the next two ways:</w:t>
+      </w:r>
+    </w:p>
+    <w:p>
+      <w:r>
+        <w:t xml:space="preserve">• Using the plugin </w:t>
+      </w:r>
+      <w:proofErr w:type="spellStart"/>
+      <w:r>
+        <w:t>SelectorHub</w:t>
+      </w:r>
+      <w:proofErr w:type="spellEnd"/>
     </w:p>
     <w:p>
       <w:r>
@@ -61,6 +92,7 @@
         </w:rPr>
         <w:t>o $('</w:t>
       </w:r>
+      <w:proofErr w:type="spellStart"/>
       <w:proofErr w:type="gramStart"/>
       <w:r>
         <w:rPr>
@@ -68,25 +100,48 @@
         </w:rPr>
         <w:t>p.error</w:t>
       </w:r>
+      <w:proofErr w:type="spellEnd"/>
       <w:proofErr w:type="gramEnd"/>
       <w:r>
         <w:rPr>
           <w:lang w:val="es-CR"/>
         </w:rPr>
-        <w:t>') → cssSelector</w:t>
-      </w:r>
-    </w:p>
-    <w:p>
-      <w:pPr>
+        <w:t xml:space="preserve">') → </w:t>
+      </w:r>
+      <w:proofErr w:type="spellStart"/>
+      <w:r>
         <w:rPr>
           <w:lang w:val="es-CR"/>
         </w:rPr>
-      </w:pPr>
-      <w:r>
+        <w:t>cssSelector</w:t>
+      </w:r>
+      <w:proofErr w:type="spellEnd"/>
+    </w:p>
+    <w:p>
+      <w:pPr>
         <w:rPr>
           <w:lang w:val="es-CR"/>
         </w:rPr>
-        <w:t>o $x('//tagname[@attribute="name"]')</w:t>
+      </w:pPr>
+      <w:r>
+        <w:rPr>
+          <w:lang w:val="es-CR"/>
+        </w:rPr>
+        <w:t>o $x('//</w:t>
+      </w:r>
+      <w:proofErr w:type="spellStart"/>
+      <w:r>
+        <w:rPr>
+          <w:lang w:val="es-CR"/>
+        </w:rPr>
+        <w:t>tagname</w:t>
+      </w:r>
+      <w:proofErr w:type="spellEnd"/>
+      <w:r>
+        <w:rPr>
+          <w:lang w:val="es-CR"/>
+        </w:rPr>
+        <w:t>[@attribute="name"]')</w:t>
       </w:r>
     </w:p>
     <w:p>
@@ -121,7 +176,23 @@
       </w:r>
       <w:proofErr w:type="gramEnd"/>
       <w:r>
-        <w:t>): Is used to configure a wait in all call types findElement or findElements in the Selenium framework. The program only waits until the element appears, not for all the time configured.</w:t>
+        <w:t xml:space="preserve">): Is used to configure a wait in all call types </w:t>
+      </w:r>
+      <w:proofErr w:type="spellStart"/>
+      <w:r>
+        <w:t>findElement</w:t>
+      </w:r>
+      <w:proofErr w:type="spellEnd"/>
+      <w:r>
+        <w:t xml:space="preserve"> or </w:t>
+      </w:r>
+      <w:proofErr w:type="spellStart"/>
+      <w:r>
+        <w:t>findElements</w:t>
+      </w:r>
+      <w:proofErr w:type="spellEnd"/>
+      <w:r>
+        <w:t xml:space="preserve"> in the Selenium framework. The program only waits until the element appears, not for all the time configured.</w:t>
       </w:r>
     </w:p>
     <w:p>
@@ -139,12 +210,36 @@
     </w:p>
     <w:p>
       <w:r>
-        <w:t>• Fluent wait(): Is used when I need to configure not only the wait time and the specific element to wait for, but also how often Selenium checks whether the condition has been successfully met, and which exceptions can be ignored.</w:t>
-      </w:r>
-    </w:p>
-    <w:p>
-      <w:r>
-        <w:t>• Thread.sleep(): Is not the best option because it forces the program to wait the exact time — no more, no less.</w:t>
+        <w:t xml:space="preserve">• Fluent </w:t>
+      </w:r>
+      <w:proofErr w:type="gramStart"/>
+      <w:r>
+        <w:t>wait(</w:t>
+      </w:r>
+      <w:proofErr w:type="gramEnd"/>
+      <w:r>
+        <w:t>): Is used when I need to configure not only the wait time and the specific element to wait for, but also how often Selenium checks whether the condition has been successfully met, and which exceptions can be ignored.</w:t>
+      </w:r>
+    </w:p>
+    <w:p>
+      <w:r>
+        <w:t xml:space="preserve">• </w:t>
+      </w:r>
+      <w:proofErr w:type="spellStart"/>
+      <w:r>
+        <w:t>Thread.sleep</w:t>
+      </w:r>
+      <w:proofErr w:type="spellEnd"/>
+      <w:r>
+        <w:t xml:space="preserve">(): Is not the best option because it forces the program to </w:t>
+      </w:r>
+      <w:proofErr w:type="gramStart"/>
+      <w:r>
+        <w:t>wait</w:t>
+      </w:r>
+      <w:proofErr w:type="gramEnd"/>
+      <w:r>
+        <w:t xml:space="preserve"> the exact time — no more, no less.</w:t>
       </w:r>
     </w:p>
     <w:p>
@@ -164,57 +259,115 @@
     </w:p>
     <w:p>
       <w:r>
-        <w:t>• parent::</w:t>
-      </w:r>
-    </w:p>
-    <w:p>
-      <w:r>
-        <w:t>• child::</w:t>
-      </w:r>
-    </w:p>
-    <w:p>
-      <w:r>
-        <w:t>• following-sibling::</w:t>
-      </w:r>
-    </w:p>
-    <w:p>
-      <w:r>
-        <w:t>• preceding-sibling::</w:t>
-      </w:r>
-    </w:p>
-    <w:p>
-      <w:pPr>
-        <w:rPr>
-          <w:b/>
-          <w:bCs/>
-        </w:rPr>
-      </w:pPr>
-      <w:r>
-        <w:rPr>
-          <w:b/>
-          <w:bCs/>
-        </w:rPr>
+        <w:t xml:space="preserve">• </w:t>
+      </w:r>
+      <w:proofErr w:type="gramStart"/>
+      <w:r>
+        <w:t>parent::</w:t>
+      </w:r>
+      <w:proofErr w:type="gramEnd"/>
+    </w:p>
+    <w:p>
+      <w:r>
+        <w:t xml:space="preserve">• </w:t>
+      </w:r>
+      <w:proofErr w:type="gramStart"/>
+      <w:r>
+        <w:t>child::</w:t>
+      </w:r>
+      <w:proofErr w:type="gramEnd"/>
+    </w:p>
+    <w:p>
+      <w:r>
+        <w:t>• following-</w:t>
+      </w:r>
+      <w:proofErr w:type="gramStart"/>
+      <w:r>
+        <w:t>sibling::</w:t>
+      </w:r>
+      <w:proofErr w:type="gramEnd"/>
+    </w:p>
+    <w:p>
+      <w:r>
+        <w:t>• preceding-</w:t>
+      </w:r>
+      <w:proofErr w:type="gramStart"/>
+      <w:r>
+        <w:t>sibling::</w:t>
+      </w:r>
+      <w:proofErr w:type="gramEnd"/>
+    </w:p>
+    <w:p>
+      <w:pPr>
+        <w:rPr>
+          <w:b/>
+          <w:bCs/>
+        </w:rPr>
+      </w:pPr>
+      <w:r>
+        <w:rPr>
+          <w:b/>
+          <w:bCs/>
+        </w:rPr>
+        <w:lastRenderedPageBreak/>
         <w:t>Handle dynamic dropdowns:</w:t>
       </w:r>
     </w:p>
     <w:p>
       <w:r>
-        <w:t>• size(): Used to obtain the length of a list.</w:t>
-      </w:r>
-    </w:p>
-    <w:p>
-      <w:r>
-        <w:t>• length(): Used to obtain the size of an array.</w:t>
-      </w:r>
-    </w:p>
-    <w:p>
-      <w:r>
-        <w:t>• When we have two elements located within only one XPath, I can use this to differentiate: ('xpath')[index]</w:t>
-      </w:r>
-    </w:p>
-    <w:p>
-      <w:r>
-        <w:t>• normalize-space(): Trims white spaces.</w:t>
+        <w:t xml:space="preserve">• </w:t>
+      </w:r>
+      <w:proofErr w:type="gramStart"/>
+      <w:r>
+        <w:t>size(</w:t>
+      </w:r>
+      <w:proofErr w:type="gramEnd"/>
+      <w:r>
+        <w:t>): Used to obtain the length of a list.</w:t>
+      </w:r>
+    </w:p>
+    <w:p>
+      <w:r>
+        <w:t xml:space="preserve">• </w:t>
+      </w:r>
+      <w:proofErr w:type="gramStart"/>
+      <w:r>
+        <w:t>length(</w:t>
+      </w:r>
+      <w:proofErr w:type="gramEnd"/>
+      <w:r>
+        <w:t>): Used to obtain the size of an array.</w:t>
+      </w:r>
+    </w:p>
+    <w:p>
+      <w:r>
+        <w:t>• When we have two elements located within only one XPath, I can use this to differentiate: ('</w:t>
+      </w:r>
+      <w:proofErr w:type="spellStart"/>
+      <w:r>
+        <w:t>xpath</w:t>
+      </w:r>
+      <w:proofErr w:type="spellEnd"/>
+      <w:proofErr w:type="gramStart"/>
+      <w:r>
+        <w:t>')[</w:t>
+      </w:r>
+      <w:proofErr w:type="gramEnd"/>
+      <w:r>
+        <w:t>index]</w:t>
+      </w:r>
+    </w:p>
+    <w:p>
+      <w:r>
+        <w:t>• normalize-</w:t>
+      </w:r>
+      <w:proofErr w:type="gramStart"/>
+      <w:r>
+        <w:t>space(</w:t>
+      </w:r>
+      <w:proofErr w:type="gramEnd"/>
+      <w:r>
+        <w:t>): Trims white spaces.</w:t>
       </w:r>
     </w:p>
     <w:p>
@@ -234,12 +387,33 @@
     </w:p>
     <w:p>
       <w:r>
-        <w:t>First, cast the driver to JavascriptExecutor to access additional functions, then use executeScript.</w:t>
-      </w:r>
-    </w:p>
-    <w:p>
-      <w:r>
-        <w:t>Downcasting is from child to parent; upcasting is from parent to child.</w:t>
+        <w:t xml:space="preserve">First, cast the driver to </w:t>
+      </w:r>
+      <w:proofErr w:type="spellStart"/>
+      <w:r>
+        <w:t>JavascriptExecutor</w:t>
+      </w:r>
+      <w:proofErr w:type="spellEnd"/>
+      <w:r>
+        <w:t xml:space="preserve"> to access additional functions, then use </w:t>
+      </w:r>
+      <w:proofErr w:type="spellStart"/>
+      <w:r>
+        <w:t>executeScript</w:t>
+      </w:r>
+      <w:proofErr w:type="spellEnd"/>
+      <w:r>
+        <w:t>.</w:t>
+      </w:r>
+    </w:p>
+    <w:p>
+      <w:proofErr w:type="spellStart"/>
+      <w:r>
+        <w:t>Downcasting</w:t>
+      </w:r>
+      <w:proofErr w:type="spellEnd"/>
+      <w:r>
+        <w:t xml:space="preserve"> is from child to parent; upcasting is from parent to child.</w:t>
       </w:r>
     </w:p>
     <w:p>
@@ -333,20 +507,21 @@
         <w:rPr>
           <w:lang w:val="es-CR"/>
         </w:rPr>
-        <w:t>• Interceptar y analizar requests/responses:</w:t>
-      </w:r>
-    </w:p>
-    <w:p>
-      <w:pPr>
+        <w:t xml:space="preserve">• Interceptar y analizar </w:t>
+      </w:r>
+      <w:proofErr w:type="spellStart"/>
+      <w:r>
         <w:rPr>
           <w:lang w:val="es-CR"/>
         </w:rPr>
-      </w:pPr>
+        <w:t>requests</w:t>
+      </w:r>
+      <w:proofErr w:type="spellEnd"/>
       <w:r>
         <w:rPr>
           <w:lang w:val="es-CR"/>
         </w:rPr>
-        <w:t>o Puedes ver qué encabezados manda la app, si se envían cookies, tokens, etc.</w:t>
+        <w:t>/responses:</w:t>
       </w:r>
     </w:p>
     <w:p>
@@ -359,19 +534,60 @@
         <w:rPr>
           <w:lang w:val="es-CR"/>
         </w:rPr>
-        <w:t>o Útil en QA para validar seguridad, autenticación, performance o que los requests cumplan con los estándares.</w:t>
-      </w:r>
-    </w:p>
-    <w:p>
-      <w:pPr>
+        <w:t xml:space="preserve">o Puedes ver qué encabezados manda la </w:t>
+      </w:r>
+      <w:proofErr w:type="gramStart"/>
+      <w:r>
         <w:rPr>
           <w:lang w:val="es-CR"/>
         </w:rPr>
-      </w:pPr>
+        <w:t>app</w:t>
+      </w:r>
+      <w:proofErr w:type="gramEnd"/>
       <w:r>
         <w:rPr>
           <w:lang w:val="es-CR"/>
         </w:rPr>
+        <w:t>, si se envían cookies, tokens, etc.</w:t>
+      </w:r>
+    </w:p>
+    <w:p>
+      <w:pPr>
+        <w:rPr>
+          <w:lang w:val="es-CR"/>
+        </w:rPr>
+      </w:pPr>
+      <w:r>
+        <w:rPr>
+          <w:lang w:val="es-CR"/>
+        </w:rPr>
+        <w:t xml:space="preserve">o Útil en QA para validar seguridad, autenticación, performance o que los </w:t>
+      </w:r>
+      <w:proofErr w:type="spellStart"/>
+      <w:r>
+        <w:rPr>
+          <w:lang w:val="es-CR"/>
+        </w:rPr>
+        <w:t>requests</w:t>
+      </w:r>
+      <w:proofErr w:type="spellEnd"/>
+      <w:r>
+        <w:rPr>
+          <w:lang w:val="es-CR"/>
+        </w:rPr>
+        <w:t xml:space="preserve"> cumplan con los estándares.</w:t>
+      </w:r>
+    </w:p>
+    <w:p>
+      <w:pPr>
+        <w:rPr>
+          <w:lang w:val="es-CR"/>
+        </w:rPr>
+      </w:pPr>
+      <w:r>
+        <w:rPr>
+          <w:lang w:val="es-CR"/>
+        </w:rPr>
         <w:t>• Pruebas en entornos restringidos:</w:t>
       </w:r>
     </w:p>
@@ -398,19 +614,47 @@
         <w:rPr>
           <w:lang w:val="es-CR"/>
         </w:rPr>
-        <w:t>• Rotación de IPs / pruebas anti-bot:</w:t>
-      </w:r>
-    </w:p>
-    <w:p>
-      <w:pPr>
+        <w:t xml:space="preserve">• Rotación de </w:t>
+      </w:r>
+      <w:proofErr w:type="spellStart"/>
+      <w:r>
         <w:rPr>
           <w:lang w:val="es-CR"/>
         </w:rPr>
-      </w:pPr>
+        <w:t>IPs</w:t>
+      </w:r>
+      <w:proofErr w:type="spellEnd"/>
       <w:r>
         <w:rPr>
           <w:lang w:val="es-CR"/>
         </w:rPr>
+        <w:t xml:space="preserve"> / pruebas </w:t>
+      </w:r>
+      <w:proofErr w:type="spellStart"/>
+      <w:r>
+        <w:rPr>
+          <w:lang w:val="es-CR"/>
+        </w:rPr>
+        <w:t>anti-bot</w:t>
+      </w:r>
+      <w:proofErr w:type="spellEnd"/>
+      <w:r>
+        <w:rPr>
+          <w:lang w:val="es-CR"/>
+        </w:rPr>
+        <w:t>:</w:t>
+      </w:r>
+    </w:p>
+    <w:p>
+      <w:pPr>
+        <w:rPr>
+          <w:lang w:val="es-CR"/>
+        </w:rPr>
+      </w:pPr>
+      <w:r>
+        <w:rPr>
+          <w:lang w:val="es-CR"/>
+        </w:rPr>
         <w:t>o Simulas diferentes usuarios desde diferentes direcciones IP.</w:t>
       </w:r>
     </w:p>
@@ -421,6 +665,7 @@
     </w:p>
     <w:p>
       <w:r>
+        <w:lastRenderedPageBreak/>
         <w:t>• Set the download directory with map</w:t>
       </w:r>
     </w:p>
@@ -455,73 +700,183 @@
       </w:r>
     </w:p>
     <w:p>
-      <w:r>
-        <w:t>stream(): Converts a collection into a data flow.</w:t>
-      </w:r>
-    </w:p>
-    <w:p>
-      <w:r>
-        <w:t>filter(): Filters elements based on a condition.</w:t>
-      </w:r>
-    </w:p>
-    <w:p>
-      <w:r>
-        <w:t>map(): Transforms each element using a function.</w:t>
-      </w:r>
-    </w:p>
-    <w:p>
-      <w:r>
-        <w:t>forEach(): Executes an action on each element.</w:t>
-      </w:r>
-    </w:p>
-    <w:p>
-      <w:r>
-        <w:t>sorted(): Sorts elements naturally or custom.</w:t>
-      </w:r>
-    </w:p>
-    <w:p>
-      <w:r>
-        <w:t>concat(): Joins two streams into one.</w:t>
-      </w:r>
-    </w:p>
-    <w:p>
-      <w:r>
-        <w:t>distinct(): Removes duplicate elements.</w:t>
-      </w:r>
-    </w:p>
-    <w:p>
-      <w:r>
-        <w:t>limit(): Limits the number of elements.</w:t>
-      </w:r>
-    </w:p>
-    <w:p>
-      <w:r>
-        <w:t>collect(Collectors.toList()): Converts the stream into a list.</w:t>
-      </w:r>
-    </w:p>
-    <w:p>
-      <w:r>
-        <w:t>findFirst(): Returns the first element as an Optional.</w:t>
-      </w:r>
-    </w:p>
-    <w:p>
-      <w:r>
-        <w:t>orElse(): Returns a default value if Optional is empty.</w:t>
-      </w:r>
-    </w:p>
-    <w:p>
-      <w:r>
-        <w:t>anyMatch(): Returns true if at least one element matches the condition.</w:t>
-      </w:r>
-    </w:p>
-    <w:p>
-      <w:r>
-        <w:t>allMatch(): Returns true if all elements match the condition.</w:t>
-      </w:r>
-    </w:p>
-    <w:p>
-      <w:r>
-        <w:t>noneMatch(): Returns true if no elements match the condition.</w:t>
+      <w:proofErr w:type="gramStart"/>
+      <w:r>
+        <w:t>stream(</w:t>
+      </w:r>
+      <w:proofErr w:type="gramEnd"/>
+      <w:r>
+        <w:t>): Converts a collection into a data flow.</w:t>
+      </w:r>
+    </w:p>
+    <w:p>
+      <w:proofErr w:type="gramStart"/>
+      <w:r>
+        <w:t>filter(</w:t>
+      </w:r>
+      <w:proofErr w:type="gramEnd"/>
+      <w:r>
+        <w:t>): Filters elements based on a condition.</w:t>
+      </w:r>
+    </w:p>
+    <w:p>
+      <w:proofErr w:type="gramStart"/>
+      <w:r>
+        <w:t>map(</w:t>
+      </w:r>
+      <w:proofErr w:type="gramEnd"/>
+      <w:r>
+        <w:t>): Transforms each element using a function.</w:t>
+      </w:r>
+    </w:p>
+    <w:p>
+      <w:proofErr w:type="spellStart"/>
+      <w:proofErr w:type="gramStart"/>
+      <w:r>
+        <w:t>forEach</w:t>
+      </w:r>
+      <w:proofErr w:type="spellEnd"/>
+      <w:r>
+        <w:t>(</w:t>
+      </w:r>
+      <w:proofErr w:type="gramEnd"/>
+      <w:r>
+        <w:t>): Executes an action on each element.</w:t>
+      </w:r>
+    </w:p>
+    <w:p>
+      <w:proofErr w:type="gramStart"/>
+      <w:r>
+        <w:t>sorted(</w:t>
+      </w:r>
+      <w:proofErr w:type="gramEnd"/>
+      <w:r>
+        <w:t>): Sorts elements naturally or custom.</w:t>
+      </w:r>
+    </w:p>
+    <w:p>
+      <w:proofErr w:type="spellStart"/>
+      <w:proofErr w:type="gramStart"/>
+      <w:r>
+        <w:t>concat</w:t>
+      </w:r>
+      <w:proofErr w:type="spellEnd"/>
+      <w:r>
+        <w:t>(</w:t>
+      </w:r>
+      <w:proofErr w:type="gramEnd"/>
+      <w:r>
+        <w:t>): Joins two streams into one.</w:t>
+      </w:r>
+    </w:p>
+    <w:p>
+      <w:proofErr w:type="gramStart"/>
+      <w:r>
+        <w:t>distinct(</w:t>
+      </w:r>
+      <w:proofErr w:type="gramEnd"/>
+      <w:r>
+        <w:t>): Removes duplicate elements.</w:t>
+      </w:r>
+    </w:p>
+    <w:p>
+      <w:proofErr w:type="gramStart"/>
+      <w:r>
+        <w:t>limit(</w:t>
+      </w:r>
+      <w:proofErr w:type="gramEnd"/>
+      <w:r>
+        <w:t>): Limits the number of elements.</w:t>
+      </w:r>
+    </w:p>
+    <w:p>
+      <w:proofErr w:type="gramStart"/>
+      <w:r>
+        <w:t>collect(</w:t>
+      </w:r>
+      <w:proofErr w:type="spellStart"/>
+      <w:proofErr w:type="gramEnd"/>
+      <w:r>
+        <w:t>Collectors.toList</w:t>
+      </w:r>
+      <w:proofErr w:type="spellEnd"/>
+      <w:r>
+        <w:t>()): Converts the stream into a list.</w:t>
+      </w:r>
+    </w:p>
+    <w:p>
+      <w:proofErr w:type="spellStart"/>
+      <w:proofErr w:type="gramStart"/>
+      <w:r>
+        <w:t>findFirst</w:t>
+      </w:r>
+      <w:proofErr w:type="spellEnd"/>
+      <w:r>
+        <w:t>(</w:t>
+      </w:r>
+      <w:proofErr w:type="gramEnd"/>
+      <w:r>
+        <w:t>): Returns the first element as an Optional.</w:t>
+      </w:r>
+    </w:p>
+    <w:p>
+      <w:proofErr w:type="spellStart"/>
+      <w:proofErr w:type="gramStart"/>
+      <w:r>
+        <w:t>orElse</w:t>
+      </w:r>
+      <w:proofErr w:type="spellEnd"/>
+      <w:r>
+        <w:t>(</w:t>
+      </w:r>
+      <w:proofErr w:type="gramEnd"/>
+      <w:r>
+        <w:t>): Returns a default value if Optional is empty.</w:t>
+      </w:r>
+    </w:p>
+    <w:p>
+      <w:proofErr w:type="spellStart"/>
+      <w:proofErr w:type="gramStart"/>
+      <w:r>
+        <w:t>anyMatch</w:t>
+      </w:r>
+      <w:proofErr w:type="spellEnd"/>
+      <w:r>
+        <w:t>(</w:t>
+      </w:r>
+      <w:proofErr w:type="gramEnd"/>
+      <w:r>
+        <w:t>): Returns true if at least one element matches the condition.</w:t>
+      </w:r>
+    </w:p>
+    <w:p>
+      <w:proofErr w:type="spellStart"/>
+      <w:proofErr w:type="gramStart"/>
+      <w:r>
+        <w:t>allMatch</w:t>
+      </w:r>
+      <w:proofErr w:type="spellEnd"/>
+      <w:r>
+        <w:t>(</w:t>
+      </w:r>
+      <w:proofErr w:type="gramEnd"/>
+      <w:r>
+        <w:t>): Returns true if all elements match the condition.</w:t>
+      </w:r>
+    </w:p>
+    <w:p>
+      <w:proofErr w:type="spellStart"/>
+      <w:proofErr w:type="gramStart"/>
+      <w:r>
+        <w:t>noneMatch</w:t>
+      </w:r>
+      <w:proofErr w:type="spellEnd"/>
+      <w:r>
+        <w:t>(</w:t>
+      </w:r>
+      <w:proofErr w:type="gramEnd"/>
+      <w:r>
+        <w:t>): Returns true if no elements match the condition.</w:t>
       </w:r>
     </w:p>
     <w:p>
@@ -541,12 +896,52 @@
     </w:p>
     <w:p>
       <w:r>
-        <w:t>Use the get() function of the list.</w:t>
-      </w:r>
-    </w:p>
-    <w:p>
-      <w:r>
-        <w:t>Use CSS selectors like :nth-child(n), :nth-of-type(n), :last-child(of-type), or :first-child(of-type).</w:t>
+        <w:t xml:space="preserve">Use the </w:t>
+      </w:r>
+      <w:proofErr w:type="gramStart"/>
+      <w:r>
+        <w:t>get(</w:t>
+      </w:r>
+      <w:proofErr w:type="gramEnd"/>
+      <w:r>
+        <w:t>) function of the list.</w:t>
+      </w:r>
+    </w:p>
+    <w:p>
+      <w:r>
+        <w:t xml:space="preserve">Use CSS selectors </w:t>
+      </w:r>
+      <w:proofErr w:type="gramStart"/>
+      <w:r>
+        <w:t>like :nth</w:t>
+      </w:r>
+      <w:proofErr w:type="gramEnd"/>
+      <w:r>
+        <w:t>-child(n)</w:t>
+      </w:r>
+      <w:proofErr w:type="gramStart"/>
+      <w:r>
+        <w:t>, :nth</w:t>
+      </w:r>
+      <w:proofErr w:type="gramEnd"/>
+      <w:r>
+        <w:t>-of-type(n)</w:t>
+      </w:r>
+      <w:proofErr w:type="gramStart"/>
+      <w:r>
+        <w:t>, :last</w:t>
+      </w:r>
+      <w:proofErr w:type="gramEnd"/>
+      <w:r>
+        <w:t xml:space="preserve">-child(of-type), </w:t>
+      </w:r>
+      <w:proofErr w:type="gramStart"/>
+      <w:r>
+        <w:t>or :first</w:t>
+      </w:r>
+      <w:proofErr w:type="gramEnd"/>
+      <w:r>
+        <w:t>-child(of-type).</w:t>
       </w:r>
     </w:p>
     <w:p>
@@ -568,6 +963,7 @@
           <w:b/>
           <w:bCs/>
         </w:rPr>
+        <w:lastRenderedPageBreak/>
         <w:t>TestNG</w:t>
       </w:r>
     </w:p>
@@ -620,17 +1016,104 @@
         <w:t>Annotations:</w:t>
       </w:r>
       <w:r>
-        <w:t xml:space="preserve"> BeforeTest, AfterTest, BeforeSuite, AfterSuite, BeforeClass, AfterClass, BeforeMethod, AfterMethod, @Parameter, @DataProvider.</w:t>
-      </w:r>
-    </w:p>
-    <w:p>
-      <w:r>
-        <w:t>Attribute annotation helper examples: Groups, enable, timeout, methodDependent.</w:t>
-      </w:r>
-    </w:p>
-    <w:p>
-      <w:r>
-        <w:t>alwaysRun: Works to avoid skipped executions of tags marked with annotation attributes.</w:t>
+        <w:t xml:space="preserve"> </w:t>
+      </w:r>
+      <w:proofErr w:type="spellStart"/>
+      <w:r>
+        <w:t>BeforeTest</w:t>
+      </w:r>
+      <w:proofErr w:type="spellEnd"/>
+      <w:r>
+        <w:t xml:space="preserve">, </w:t>
+      </w:r>
+      <w:proofErr w:type="spellStart"/>
+      <w:r>
+        <w:t>AfterTest</w:t>
+      </w:r>
+      <w:proofErr w:type="spellEnd"/>
+      <w:r>
+        <w:t xml:space="preserve">, </w:t>
+      </w:r>
+      <w:proofErr w:type="spellStart"/>
+      <w:r>
+        <w:t>BeforeSuite</w:t>
+      </w:r>
+      <w:proofErr w:type="spellEnd"/>
+      <w:r>
+        <w:t xml:space="preserve">, </w:t>
+      </w:r>
+      <w:proofErr w:type="spellStart"/>
+      <w:r>
+        <w:t>AfterSuite</w:t>
+      </w:r>
+      <w:proofErr w:type="spellEnd"/>
+      <w:r>
+        <w:t xml:space="preserve">, </w:t>
+      </w:r>
+      <w:proofErr w:type="spellStart"/>
+      <w:r>
+        <w:t>BeforeClass</w:t>
+      </w:r>
+      <w:proofErr w:type="spellEnd"/>
+      <w:r>
+        <w:t xml:space="preserve">, </w:t>
+      </w:r>
+      <w:proofErr w:type="spellStart"/>
+      <w:r>
+        <w:t>AfterClass</w:t>
+      </w:r>
+      <w:proofErr w:type="spellEnd"/>
+      <w:r>
+        <w:t xml:space="preserve">, </w:t>
+      </w:r>
+      <w:proofErr w:type="spellStart"/>
+      <w:r>
+        <w:t>BeforeMethod</w:t>
+      </w:r>
+      <w:proofErr w:type="spellEnd"/>
+      <w:r>
+        <w:t xml:space="preserve">, </w:t>
+      </w:r>
+      <w:proofErr w:type="spellStart"/>
+      <w:r>
+        <w:t>AfterMethod</w:t>
+      </w:r>
+      <w:proofErr w:type="spellEnd"/>
+      <w:r>
+        <w:t>, @Parameter, @DataProvider.</w:t>
+      </w:r>
+    </w:p>
+    <w:p>
+      <w:r>
+        <w:t xml:space="preserve">Attribute annotation helper examples: Groups, enable, timeout, </w:t>
+      </w:r>
+      <w:proofErr w:type="spellStart"/>
+      <w:r>
+        <w:t>methodDependent</w:t>
+      </w:r>
+      <w:proofErr w:type="spellEnd"/>
+      <w:r>
+        <w:t>.</w:t>
+      </w:r>
+    </w:p>
+    <w:p>
+      <w:proofErr w:type="spellStart"/>
+      <w:proofErr w:type="gramStart"/>
+      <w:r>
+        <w:t>alwaysRun</w:t>
+      </w:r>
+      <w:proofErr w:type="spellEnd"/>
+      <w:proofErr w:type="gramEnd"/>
+      <w:r>
+        <w:t xml:space="preserve">: Works to avoid </w:t>
+      </w:r>
+      <w:proofErr w:type="gramStart"/>
+      <w:r>
+        <w:t>skipped</w:t>
+      </w:r>
+      <w:proofErr w:type="gramEnd"/>
+      <w:r>
+        <w:t xml:space="preserve"> executions of tags marked with annotation attributes.</w:t>
       </w:r>
     </w:p>
     <w:p>
@@ -639,8 +1122,13 @@
       </w:r>
     </w:p>
     <w:p>
-      <w:r>
-        <w:t>With @DataProvider it’s recommended to return HashMap, since test parameterization could be dynamic, and spending time adding parameters manually is inefficient.</w:t>
+      <w:proofErr w:type="gramStart"/>
+      <w:r>
+        <w:t>With @</w:t>
+      </w:r>
+      <w:proofErr w:type="gramEnd"/>
+      <w:r>
+        <w:t>DataProvider it’s recommended to return HashMap, since test parameterization could be dynamic, and spending time adding parameters manually is inefficient.</w:t>
       </w:r>
     </w:p>
     <w:p>
@@ -690,27 +1178,67 @@
     </w:p>
     <w:p>
       <w:r>
-        <w:t>It’s necessary to create a class and implement the ITestListener interface, and specify its location in the XML file.</w:t>
-      </w:r>
-    </w:p>
-    <w:p>
-      <w:r>
-        <w:t>ITestListener: At test level.</w:t>
-      </w:r>
-    </w:p>
-    <w:p>
-      <w:r>
-        <w:t>ISuiteListener: At suite level.</w:t>
-      </w:r>
-    </w:p>
-    <w:p>
-      <w:r>
-        <w:t>ITestContext:</w:t>
-      </w:r>
-    </w:p>
-    <w:p>
-      <w:r>
-        <w:t>Interfaces with ThreadLocal to bind driver variables with their specific thread.</w:t>
+        <w:t xml:space="preserve">It’s necessary to create a class and implement the </w:t>
+      </w:r>
+      <w:proofErr w:type="spellStart"/>
+      <w:r>
+        <w:t>ITestListener</w:t>
+      </w:r>
+      <w:proofErr w:type="spellEnd"/>
+      <w:r>
+        <w:t xml:space="preserve"> </w:t>
+      </w:r>
+      <w:proofErr w:type="gramStart"/>
+      <w:r>
+        <w:t>interface, and</w:t>
+      </w:r>
+      <w:proofErr w:type="gramEnd"/>
+      <w:r>
+        <w:t xml:space="preserve"> specify its location in the XML file.</w:t>
+      </w:r>
+    </w:p>
+    <w:p>
+      <w:proofErr w:type="spellStart"/>
+      <w:r>
+        <w:t>ITestListener</w:t>
+      </w:r>
+      <w:proofErr w:type="spellEnd"/>
+      <w:r>
+        <w:t>: At test level.</w:t>
+      </w:r>
+    </w:p>
+    <w:p>
+      <w:proofErr w:type="spellStart"/>
+      <w:r>
+        <w:lastRenderedPageBreak/>
+        <w:t>ISuiteListener</w:t>
+      </w:r>
+      <w:proofErr w:type="spellEnd"/>
+      <w:r>
+        <w:t>: At suite level.</w:t>
+      </w:r>
+    </w:p>
+    <w:p>
+      <w:proofErr w:type="spellStart"/>
+      <w:r>
+        <w:t>ITestContext</w:t>
+      </w:r>
+      <w:proofErr w:type="spellEnd"/>
+      <w:r>
+        <w:t>:</w:t>
+      </w:r>
+    </w:p>
+    <w:p>
+      <w:r>
+        <w:t xml:space="preserve">Interfaces with </w:t>
+      </w:r>
+      <w:proofErr w:type="spellStart"/>
+      <w:r>
+        <w:t>ThreadLocal</w:t>
+      </w:r>
+      <w:proofErr w:type="spellEnd"/>
+      <w:r>
+        <w:t xml:space="preserve"> to bind driver variables with their specific thread.</w:t>
       </w:r>
     </w:p>
     <w:p>
@@ -744,41 +1272,45 @@
           <w:iCs/>
           <w:u w:val="single"/>
         </w:rPr>
-        <w:t>Answer: Using the ITestResult object and the method name.getName().</w:t>
-      </w:r>
-    </w:p>
-    <w:p>
-      <w:pPr>
+        <w:t xml:space="preserve">Answer: Using the </w:t>
+      </w:r>
+      <w:proofErr w:type="spellStart"/>
+      <w:r>
         <w:rPr>
           <w:i/>
           <w:iCs/>
           <w:u w:val="single"/>
         </w:rPr>
-      </w:pPr>
+        <w:t>ITestResult</w:t>
+      </w:r>
+      <w:proofErr w:type="spellEnd"/>
       <w:r>
         <w:rPr>
           <w:i/>
           <w:iCs/>
           <w:u w:val="single"/>
         </w:rPr>
-        <w:t>Important: Gain knowledge in mobile automation, web automation, and API automation.</w:t>
-      </w:r>
-    </w:p>
-    <w:p>
-      <w:pPr>
+        <w:t xml:space="preserve"> object and the method </w:t>
+      </w:r>
+      <w:proofErr w:type="spellStart"/>
+      <w:proofErr w:type="gramStart"/>
+      <w:r>
         <w:rPr>
           <w:i/>
           <w:iCs/>
           <w:u w:val="single"/>
         </w:rPr>
-      </w:pPr>
+        <w:t>name.getName</w:t>
+      </w:r>
+      <w:proofErr w:type="spellEnd"/>
+      <w:proofErr w:type="gramEnd"/>
       <w:r>
         <w:rPr>
           <w:i/>
           <w:iCs/>
           <w:u w:val="single"/>
         </w:rPr>
-        <w:t>TODO:</w:t>
+        <w:t>().</w:t>
       </w:r>
     </w:p>
     <w:p>
@@ -795,7 +1327,7 @@
           <w:iCs/>
           <w:u w:val="single"/>
         </w:rPr>
-        <w:t>Create 3 classes with PS names, use inheritance, extend usable methods in the child, create objects and use them through another inheritance of object, and implement super() to invoke the parent constructor when it’s not called outside the class.</w:t>
+        <w:t>Important: Gain knowledge in mobile automation, web automation, and API automation.</w:t>
       </w:r>
     </w:p>
     <w:p>
@@ -812,6 +1344,58 @@
           <w:iCs/>
           <w:u w:val="single"/>
         </w:rPr>
+        <w:t>TODO:</w:t>
+      </w:r>
+    </w:p>
+    <w:p>
+      <w:pPr>
+        <w:rPr>
+          <w:i/>
+          <w:iCs/>
+          <w:u w:val="single"/>
+        </w:rPr>
+      </w:pPr>
+      <w:r>
+        <w:rPr>
+          <w:i/>
+          <w:iCs/>
+          <w:u w:val="single"/>
+        </w:rPr>
+        <w:t xml:space="preserve">Create 3 classes with PS names, use inheritance, extend usable methods in the child, create objects and use them through another inheritance of object, and implement </w:t>
+      </w:r>
+      <w:proofErr w:type="gramStart"/>
+      <w:r>
+        <w:rPr>
+          <w:i/>
+          <w:iCs/>
+          <w:u w:val="single"/>
+        </w:rPr>
+        <w:t>super(</w:t>
+      </w:r>
+      <w:proofErr w:type="gramEnd"/>
+      <w:r>
+        <w:rPr>
+          <w:i/>
+          <w:iCs/>
+          <w:u w:val="single"/>
+        </w:rPr>
+        <w:t>) to invoke the parent constructor when it’s not called outside the class.</w:t>
+      </w:r>
+    </w:p>
+    <w:p>
+      <w:pPr>
+        <w:rPr>
+          <w:i/>
+          <w:iCs/>
+          <w:u w:val="single"/>
+        </w:rPr>
+      </w:pPr>
+      <w:r>
+        <w:rPr>
+          <w:i/>
+          <w:iCs/>
+          <w:u w:val="single"/>
+        </w:rPr>
         <w:t>Create a Maven project and initialize an end-to-end test automation.</w:t>
       </w:r>
     </w:p>
@@ -852,28 +1436,83 @@
     </w:p>
     <w:p>
       <w:r>
-        <w:t>In Selenium, attributes that are instances of WebElement use the @FindBy annotation. These are initialized with PageFactory.initElements().</w:t>
-      </w:r>
-    </w:p>
-    <w:p>
-      <w:r>
-        <w:t>invisibilityOfElementLocated is slower than invisibilityOf because the first checks if the element exists in the DOM before verifying its visibility. The second assumes the element is already located.</w:t>
-      </w:r>
-    </w:p>
-    <w:p>
-      <w:pPr>
-        <w:rPr>
-          <w:b/>
-          <w:bCs/>
-        </w:rPr>
-      </w:pPr>
-      <w:r>
-        <w:rPr>
-          <w:b/>
-          <w:bCs/>
-        </w:rPr>
-        <w:t>PageFactory.initElements(driver, this);</w:t>
-      </w:r>
+        <w:t xml:space="preserve">In Selenium, attributes that are instances of </w:t>
+      </w:r>
+      <w:proofErr w:type="spellStart"/>
+      <w:r>
+        <w:t>WebElement</w:t>
+      </w:r>
+      <w:proofErr w:type="spellEnd"/>
+      <w:r>
+        <w:t xml:space="preserve"> use </w:t>
+      </w:r>
+      <w:proofErr w:type="gramStart"/>
+      <w:r>
+        <w:t>the @</w:t>
+      </w:r>
+      <w:proofErr w:type="gramEnd"/>
+      <w:r>
+        <w:t xml:space="preserve">FindBy annotation. These are initialized with </w:t>
+      </w:r>
+      <w:proofErr w:type="spellStart"/>
+      <w:r>
+        <w:t>PageFactory.initElements</w:t>
+      </w:r>
+      <w:proofErr w:type="spellEnd"/>
+      <w:r>
+        <w:t>().</w:t>
+      </w:r>
+    </w:p>
+    <w:p>
+      <w:proofErr w:type="spellStart"/>
+      <w:r>
+        <w:t>invisibilityOfElementLocated</w:t>
+      </w:r>
+      <w:proofErr w:type="spellEnd"/>
+      <w:r>
+        <w:t xml:space="preserve"> is slower than </w:t>
+      </w:r>
+      <w:proofErr w:type="spellStart"/>
+      <w:r>
+        <w:t>invisibilityOf</w:t>
+      </w:r>
+      <w:proofErr w:type="spellEnd"/>
+      <w:r>
+        <w:t xml:space="preserve"> because the first checks if the element exists in the DOM before verifying its visibility. The second assumes the element is already located.</w:t>
+      </w:r>
+    </w:p>
+    <w:p>
+      <w:pPr>
+        <w:rPr>
+          <w:b/>
+          <w:bCs/>
+        </w:rPr>
+      </w:pPr>
+      <w:proofErr w:type="spellStart"/>
+      <w:r>
+        <w:rPr>
+          <w:b/>
+          <w:bCs/>
+        </w:rPr>
+        <w:t>PageFactory.initElements</w:t>
+      </w:r>
+      <w:proofErr w:type="spellEnd"/>
+      <w:r>
+        <w:rPr>
+          <w:b/>
+          <w:bCs/>
+        </w:rPr>
+        <w:t>(driver, this</w:t>
+      </w:r>
+      <w:proofErr w:type="gramStart"/>
+      <w:r>
+        <w:rPr>
+          <w:b/>
+          <w:bCs/>
+        </w:rPr>
+        <w:t>);</w:t>
+      </w:r>
+      <w:proofErr w:type="gramEnd"/>
     </w:p>
     <w:p>
       <w:r>
@@ -881,13 +1520,36 @@
       </w:r>
     </w:p>
     <w:p>
-      <w:r>
-        <w:t>this refers to the current instance of the class being created.</w:t>
-      </w:r>
-    </w:p>
-    <w:p>
-      <w:r>
-        <w:t>driver is passed to PageFactory so that @FindBy elements know which WebDriver session to use.</w:t>
+      <w:proofErr w:type="gramStart"/>
+      <w:r>
+        <w:t>this</w:t>
+      </w:r>
+      <w:proofErr w:type="gramEnd"/>
+      <w:r>
+        <w:t xml:space="preserve"> refers to the current instance of the class being created.</w:t>
+      </w:r>
+    </w:p>
+    <w:p>
+      <w:r>
+        <w:t xml:space="preserve">driver is passed to </w:t>
+      </w:r>
+      <w:proofErr w:type="spellStart"/>
+      <w:proofErr w:type="gramStart"/>
+      <w:r>
+        <w:t>PageFactory</w:t>
+      </w:r>
+      <w:proofErr w:type="spellEnd"/>
+      <w:proofErr w:type="gramEnd"/>
+      <w:r>
+        <w:t xml:space="preserve"> so </w:t>
+      </w:r>
+      <w:proofErr w:type="gramStart"/>
+      <w:r>
+        <w:t>that @</w:t>
+      </w:r>
+      <w:proofErr w:type="gramEnd"/>
+      <w:r>
+        <w:t>FindBy elements know which WebDriver session to use.</w:t>
       </w:r>
     </w:p>
     <w:p>
@@ -907,288 +1569,8 @@
           <w:b/>
           <w:bCs/>
         </w:rPr>
+        <w:lastRenderedPageBreak/>
         <w:t>Test Strategy</w:t>
-      </w:r>
-    </w:p>
-    <w:p>
-      <w:pPr>
-        <w:pStyle w:val="ListParagraph"/>
-        <w:numPr>
-          <w:ilvl w:val="0"/>
-          <w:numId w:val="9"/>
-        </w:numPr>
-      </w:pPr>
-      <w:r>
-        <w:t>Test Automation Pyramid</w:t>
-      </w:r>
-    </w:p>
-    <w:p>
-      <w:pPr>
-        <w:pStyle w:val="ListParagraph"/>
-        <w:numPr>
-          <w:ilvl w:val="0"/>
-          <w:numId w:val="9"/>
-        </w:numPr>
-      </w:pPr>
-      <w:r>
-        <w:t>Prioritize by value/risk</w:t>
-      </w:r>
-    </w:p>
-    <w:p>
-      <w:pPr>
-        <w:pStyle w:val="ListParagraph"/>
-        <w:numPr>
-          <w:ilvl w:val="0"/>
-          <w:numId w:val="9"/>
-        </w:numPr>
-      </w:pPr>
-      <w:r>
-        <w:t>Modularization / Reuse</w:t>
-      </w:r>
-    </w:p>
-    <w:p>
-      <w:pPr>
-        <w:pStyle w:val="ListParagraph"/>
-        <w:numPr>
-          <w:ilvl w:val="0"/>
-          <w:numId w:val="9"/>
-        </w:numPr>
-      </w:pPr>
-      <w:r>
-        <w:t>Test independence</w:t>
-      </w:r>
-    </w:p>
-    <w:p>
-      <w:pPr>
-        <w:pStyle w:val="ListParagraph"/>
-        <w:numPr>
-          <w:ilvl w:val="0"/>
-          <w:numId w:val="9"/>
-        </w:numPr>
-      </w:pPr>
-      <w:r>
-        <w:t>Stability (avoid flaky tests)</w:t>
-      </w:r>
-    </w:p>
-    <w:p>
-      <w:pPr>
-        <w:pStyle w:val="ListParagraph"/>
-        <w:numPr>
-          <w:ilvl w:val="0"/>
-          <w:numId w:val="9"/>
-        </w:numPr>
-      </w:pPr>
-      <w:r>
-        <w:t>Consistent environments and data</w:t>
-      </w:r>
-    </w:p>
-    <w:p>
-      <w:pPr>
-        <w:pStyle w:val="ListParagraph"/>
-        <w:numPr>
-          <w:ilvl w:val="0"/>
-          <w:numId w:val="9"/>
-        </w:numPr>
-      </w:pPr>
-      <w:r>
-        <w:t>CI/CD integration</w:t>
-      </w:r>
-    </w:p>
-    <w:p>
-      <w:pPr>
-        <w:pStyle w:val="ListParagraph"/>
-        <w:numPr>
-          <w:ilvl w:val="0"/>
-          <w:numId w:val="9"/>
-        </w:numPr>
-      </w:pPr>
-      <w:r>
-        <w:t>Parallel execution</w:t>
-      </w:r>
-    </w:p>
-    <w:p>
-      <w:pPr>
-        <w:pStyle w:val="ListParagraph"/>
-        <w:numPr>
-          <w:ilvl w:val="0"/>
-          <w:numId w:val="9"/>
-        </w:numPr>
-      </w:pPr>
-      <w:r>
-        <w:t>Clear metrics and continuous improvement</w:t>
-      </w:r>
-    </w:p>
-    <w:p>
-      <w:pPr>
-        <w:pStyle w:val="ListParagraph"/>
-        <w:numPr>
-          <w:ilvl w:val="0"/>
-          <w:numId w:val="9"/>
-        </w:numPr>
-      </w:pPr>
-      <w:r>
-        <w:t>Standards / conventions / documentation</w:t>
-      </w:r>
-    </w:p>
-    <w:p>
-      <w:pPr>
-        <w:rPr>
-          <w:b/>
-          <w:bCs/>
-        </w:rPr>
-      </w:pPr>
-      <w:r>
-        <w:rPr>
-          <w:b/>
-          <w:bCs/>
-        </w:rPr>
-        <w:t>Extent Reports:</w:t>
-      </w:r>
-    </w:p>
-    <w:p>
-      <w:r>
-        <w:t>Main classes:</w:t>
-      </w:r>
-    </w:p>
-    <w:p>
-      <w:pPr>
-        <w:pStyle w:val="ListParagraph"/>
-        <w:numPr>
-          <w:ilvl w:val="0"/>
-          <w:numId w:val="10"/>
-        </w:numPr>
-      </w:pPr>
-      <w:r>
-        <w:t>ExtentReports: Manages report generation.</w:t>
-      </w:r>
-    </w:p>
-    <w:p>
-      <w:pPr>
-        <w:pStyle w:val="ListParagraph"/>
-        <w:numPr>
-          <w:ilvl w:val="0"/>
-          <w:numId w:val="10"/>
-        </w:numPr>
-      </w:pPr>
-      <w:r>
-        <w:t>ExtentSparkReporter: Configures report output.</w:t>
-      </w:r>
-    </w:p>
-    <w:p>
-      <w:pPr>
-        <w:pStyle w:val="ListParagraph"/>
-        <w:numPr>
-          <w:ilvl w:val="0"/>
-          <w:numId w:val="10"/>
-        </w:numPr>
-      </w:pPr>
-      <w:r>
-        <w:t>ExtentTest: Manages test events (pass/fail).</w:t>
-      </w:r>
-    </w:p>
-    <w:p>
-      <w:pPr>
-        <w:rPr>
-          <w:b/>
-          <w:bCs/>
-        </w:rPr>
-      </w:pPr>
-      <w:r>
-        <w:rPr>
-          <w:b/>
-          <w:bCs/>
-        </w:rPr>
-        <w:t>Imported libraries:</w:t>
-      </w:r>
-    </w:p>
-    <w:p>
-      <w:r>
-        <w:t>commons-io: FileUtils to manage files.</w:t>
-      </w:r>
-    </w:p>
-    <w:p>
-      <w:r>
-        <w:t>jackson-databind: Converts JSON to HashMap to handle test data easily.</w:t>
-      </w:r>
-    </w:p>
-    <w:p>
-      <w:r>
-        <w:t>Use quick start template or Maven project from org.apache.com.</w:t>
-      </w:r>
-    </w:p>
-    <w:p>
-      <w:pPr>
-        <w:rPr>
-          <w:b/>
-          <w:bCs/>
-        </w:rPr>
-      </w:pPr>
-      <w:r>
-        <w:rPr>
-          <w:b/>
-          <w:bCs/>
-        </w:rPr>
-        <w:t>ThreadLocal:</w:t>
-      </w:r>
-    </w:p>
-    <w:p>
-      <w:r>
-        <w:t>Manages parallel methods, assigning a unique variable per thread to avoid concurrency issues.</w:t>
-      </w:r>
-    </w:p>
-    <w:p>
-      <w:r>
-        <w:t>ThreadGuard.protect: Monitors variables (like driver) ensuring access only from their original thread.</w:t>
-      </w:r>
-    </w:p>
-    <w:p>
-      <w:pPr>
-        <w:rPr>
-          <w:b/>
-          <w:bCs/>
-        </w:rPr>
-      </w:pPr>
-      <w:r>
-        <w:rPr>
-          <w:b/>
-          <w:bCs/>
-        </w:rPr>
-        <w:t>Synchronized:</w:t>
-      </w:r>
-    </w:p>
-    <w:p>
-      <w:r>
-        <w:t>Restricts access to a method or code block to one thread at a time.</w:t>
-      </w:r>
-    </w:p>
-    <w:p>
-      <w:r>
-        <w:t>Important keywords in parallel testing:</w:t>
-      </w:r>
-    </w:p>
-    <w:p>
-      <w:r>
-        <w:t>static: Only one instance of the variable exists in the class; changes reflect in all objects.</w:t>
-      </w:r>
-    </w:p>
-    <w:p>
-      <w:r>
-        <w:t>final: Prevents overriding the reference or value of the variable.</w:t>
-      </w:r>
-    </w:p>
-    <w:p>
-      <w:pPr>
-        <w:rPr>
-          <w:b/>
-          <w:bCs/>
-        </w:rPr>
-      </w:pPr>
-      <w:r>
-        <w:rPr>
-          <w:b/>
-          <w:bCs/>
-        </w:rPr>
-        <w:t>Parallel Options:</w:t>
       </w:r>
     </w:p>
     <w:p>
@@ -1200,7 +1582,7 @@
         </w:numPr>
       </w:pPr>
       <w:r>
-        <w:t>classes</w:t>
+        <w:t>Test Automation Pyramid</w:t>
       </w:r>
     </w:p>
     <w:p>
@@ -1212,7 +1594,7 @@
         </w:numPr>
       </w:pPr>
       <w:r>
-        <w:t>false</w:t>
+        <w:t>Prioritize by value/risk</w:t>
       </w:r>
     </w:p>
     <w:p>
@@ -1224,7 +1606,7 @@
         </w:numPr>
       </w:pPr>
       <w:r>
-        <w:t>instances</w:t>
+        <w:t>Modularization / Reuse</w:t>
       </w:r>
     </w:p>
     <w:p>
@@ -1236,7 +1618,7 @@
         </w:numPr>
       </w:pPr>
       <w:r>
-        <w:t>methods</w:t>
+        <w:t>Test independence</w:t>
       </w:r>
     </w:p>
     <w:p>
@@ -1248,7 +1630,7 @@
         </w:numPr>
       </w:pPr>
       <w:r>
-        <w:t>none</w:t>
+        <w:t>Stability (avoid flaky tests)</w:t>
       </w:r>
     </w:p>
     <w:p>
@@ -1260,7 +1642,7 @@
         </w:numPr>
       </w:pPr>
       <w:r>
-        <w:t>tests</w:t>
+        <w:t>Consistent environments and data</w:t>
       </w:r>
     </w:p>
     <w:p>
@@ -1272,7 +1654,7 @@
         </w:numPr>
       </w:pPr>
       <w:r>
-        <w:t>classes</w:t>
+        <w:t>CI/CD integration</w:t>
       </w:r>
     </w:p>
     <w:p>
@@ -1284,203 +1666,51 @@
         </w:numPr>
       </w:pPr>
       <w:r>
-        <w:t>true</w:t>
-      </w:r>
-    </w:p>
-    <w:p>
-      <w:pPr>
-        <w:rPr>
-          <w:b/>
-          <w:bCs/>
-        </w:rPr>
-      </w:pPr>
-      <w:r>
-        <w:rPr>
-          <w:b/>
-          <w:bCs/>
-        </w:rPr>
-        <w:t>Thread Safety and ThreadGuard are essential for managing ThreadLocal objects to avoid concurrency issues.</w:t>
-      </w:r>
-    </w:p>
-    <w:p>
-      <w:pPr>
-        <w:rPr>
-          <w:b/>
-          <w:bCs/>
-        </w:rPr>
-      </w:pPr>
-      <w:r>
-        <w:rPr>
-          <w:b/>
-          <w:bCs/>
-        </w:rPr>
-        <w:t>RetryAnalyzer (IRetryAnalyzer):</w:t>
-      </w:r>
-    </w:p>
-    <w:p>
-      <w:r>
-        <w:t>Detects flaky tests and retries failed ones. Implement via IRetryAnalyzer interface and annotation attribute RetryAnalyzer.</w:t>
-      </w:r>
-    </w:p>
-    <w:p>
-      <w:pPr>
-        <w:rPr>
-          <w:b/>
-          <w:bCs/>
-        </w:rPr>
-      </w:pPr>
-      <w:r>
-        <w:rPr>
-          <w:b/>
-          <w:bCs/>
-        </w:rPr>
-        <w:t>Maven commands to run a test from terminal:</w:t>
-      </w:r>
-    </w:p>
-    <w:p>
-      <w:r>
-        <w:t>Configure Maven globally with environment variables, set the TestNG plugin and compiler version, define profiles, then run:</w:t>
-      </w:r>
-    </w:p>
-    <w:p>
-      <w:r>
-        <w:t>mvn test -P{testng}</w:t>
-      </w:r>
-    </w:p>
-    <w:p>
-      <w:r>
-        <w:t>You can also use /D properties to define global variables, e.g.:</w:t>
-      </w:r>
-    </w:p>
-    <w:p>
-      <w:r>
-        <w:t>mvn test -PErrorValidation -DChrome</w:t>
-      </w:r>
-    </w:p>
-    <w:p>
-      <w:r>
-        <w:t>Use Surefire reports to view detailed execution results.</w:t>
-      </w:r>
-    </w:p>
-    <w:p>
-      <w:pPr>
-        <w:rPr>
-          <w:b/>
-          <w:bCs/>
-        </w:rPr>
-      </w:pPr>
-      <w:r>
-        <w:rPr>
-          <w:b/>
-          <w:bCs/>
-        </w:rPr>
-        <w:t>Jenkins (Continuous Integration tool):</w:t>
-      </w:r>
-    </w:p>
-    <w:p>
-      <w:r>
-        <w:t>Used to create jobs that automate testing execution. You can configure parameters, variables, dynamic executions, and scheduled jobs (Jenkins uses cron syntax {MINUTE HOUR DAY_OF_MONTH MONTH DAY_OF_WEEK}).</w:t>
-      </w:r>
-    </w:p>
-    <w:p>
-      <w:r>
-        <w:t>Remember to use parameters in steps (e.g., $browserName), and check “Use custom workspace” if not using a repository.</w:t>
-      </w:r>
-    </w:p>
-    <w:p>
-      <w:pPr>
-        <w:rPr>
-          <w:b/>
-          <w:bCs/>
-        </w:rPr>
-      </w:pPr>
-      <w:r>
-        <w:rPr>
-          <w:b/>
-          <w:bCs/>
-        </w:rPr>
-        <w:t>Cucumber:</w:t>
-      </w:r>
-    </w:p>
-    <w:p>
-      <w:r>
-        <w:t>Cucumber represents test cases as scenarios using Gherkin syntax and BDD methodology.</w:t>
-      </w:r>
-    </w:p>
-    <w:p>
-      <w:r>
-        <w:t>Keywords: Scenario, Feature, Feature File, Scenario Outline, Step Definition, Tags.</w:t>
-      </w:r>
-    </w:p>
-    <w:p>
-      <w:r>
-        <w:t>A Feature defines system behavior, and Scenarios define expected outcomes.</w:t>
-      </w:r>
-    </w:p>
-    <w:p>
-      <w:r>
-        <w:t>In Java, bind feature steps to code using annotations @Given, @When, @Then, @And.</w:t>
-      </w:r>
-    </w:p>
-    <w:p>
-      <w:r>
-        <w:t>Parameterization with outlines requires regular expressions (e.g., "^(.+)$").</w:t>
-      </w:r>
-    </w:p>
-    <w:p>
-      <w:r>
-        <w:t>Execution is handled with TestNG by extending AbstractTestNGCucumberTests and using annotations for ChromeOptions, features, glue, monochrome, plugin, tags, etc.</w:t>
-      </w:r>
-    </w:p>
-    <w:p>
-      <w:pPr>
-        <w:rPr>
-          <w:b/>
-          <w:bCs/>
-        </w:rPr>
-      </w:pPr>
-      <w:r>
-        <w:rPr>
-          <w:b/>
-          <w:bCs/>
-        </w:rPr>
-        <w:t>CI/CD Pipeline:</w:t>
-      </w:r>
-    </w:p>
-    <w:p>
-      <w:r>
-        <w:t>Webhook: Is an automatic notification that GitHub sends to another server (like Jenkins) to trigger jobs or events.</w:t>
-      </w:r>
-    </w:p>
-    <w:p>
-      <w:r>
-        <w:t>GitHub Hook trigger for GITScm polling in Maven projects allows automatic builds when GitHub sends a webhook.</w:t>
-      </w:r>
-    </w:p>
-    <w:p>
-      <w:r>
-        <w:t>Payload URL is the Jenkins server endpoint receiving GitHub webhooks. Configure events to trigger (e.g., push actions). For practice, use Ngrok to expose Jenkins to the internet, as GitHub requires public access.</w:t>
-      </w:r>
-    </w:p>
-    <w:p>
-      <w:pPr>
-        <w:rPr>
-          <w:b/>
-          <w:bCs/>
-          <w:i/>
-          <w:iCs/>
-          <w:u w:val="single"/>
-        </w:rPr>
-      </w:pPr>
-      <w:r>
-        <w:rPr>
-          <w:b/>
-          <w:bCs/>
-          <w:i/>
-          <w:iCs/>
-          <w:u w:val="single"/>
-        </w:rPr>
-        <w:t>Remember:</w:t>
+        <w:t>Parallel execution</w:t>
+      </w:r>
+    </w:p>
+    <w:p>
+      <w:pPr>
+        <w:pStyle w:val="ListParagraph"/>
+        <w:numPr>
+          <w:ilvl w:val="0"/>
+          <w:numId w:val="11"/>
+        </w:numPr>
+      </w:pPr>
+      <w:r>
+        <w:t>Clear metrics and continuous improvement</w:t>
+      </w:r>
+    </w:p>
+    <w:p>
+      <w:pPr>
+        <w:pStyle w:val="ListParagraph"/>
+        <w:numPr>
+          <w:ilvl w:val="0"/>
+          <w:numId w:val="11"/>
+        </w:numPr>
+      </w:pPr>
+      <w:r>
+        <w:t>Standards / conventions / documentation</w:t>
+      </w:r>
+    </w:p>
+    <w:p>
+      <w:pPr>
+        <w:rPr>
+          <w:b/>
+          <w:bCs/>
+        </w:rPr>
+      </w:pPr>
+      <w:r>
+        <w:rPr>
+          <w:b/>
+          <w:bCs/>
+        </w:rPr>
+        <w:t>Extent Reports:</w:t>
+      </w:r>
+    </w:p>
+    <w:p>
+      <w:r>
+        <w:t>Main classes:</w:t>
       </w:r>
     </w:p>
     <w:p>
@@ -1491,8 +1721,13 @@
           <w:numId w:val="12"/>
         </w:numPr>
       </w:pPr>
-      <w:r>
-        <w:t>Create a secret token in GitHub (Developer settings → Personal access tokens → Tokens (classic)).</w:t>
+      <w:proofErr w:type="spellStart"/>
+      <w:r>
+        <w:t>ExtentReports</w:t>
+      </w:r>
+      <w:proofErr w:type="spellEnd"/>
+      <w:r>
+        <w:t>: Manages report generation.</w:t>
       </w:r>
     </w:p>
     <w:p>
@@ -1503,8 +1738,13 @@
           <w:numId w:val="12"/>
         </w:numPr>
       </w:pPr>
-      <w:r>
-        <w:t>Configure secret tests in GitHub.</w:t>
+      <w:proofErr w:type="spellStart"/>
+      <w:r>
+        <w:t>ExtentSparkReporter</w:t>
+      </w:r>
+      <w:proofErr w:type="spellEnd"/>
+      <w:r>
+        <w:t>: Configures report output.</w:t>
       </w:r>
     </w:p>
     <w:p>
@@ -1515,8 +1755,146 @@
           <w:numId w:val="12"/>
         </w:numPr>
       </w:pPr>
-      <w:r>
-        <w:t>Configure the webhook in the repository.</w:t>
+      <w:proofErr w:type="spellStart"/>
+      <w:r>
+        <w:t>ExtentTest</w:t>
+      </w:r>
+      <w:proofErr w:type="spellEnd"/>
+      <w:r>
+        <w:t>: Manages test events (pass/fail).</w:t>
+      </w:r>
+    </w:p>
+    <w:p>
+      <w:pPr>
+        <w:rPr>
+          <w:b/>
+          <w:bCs/>
+        </w:rPr>
+      </w:pPr>
+      <w:r>
+        <w:rPr>
+          <w:b/>
+          <w:bCs/>
+        </w:rPr>
+        <w:t>Imported libraries:</w:t>
+      </w:r>
+    </w:p>
+    <w:p>
+      <w:r>
+        <w:t xml:space="preserve">commons-io: </w:t>
+      </w:r>
+      <w:proofErr w:type="spellStart"/>
+      <w:r>
+        <w:t>FileUtils</w:t>
+      </w:r>
+      <w:proofErr w:type="spellEnd"/>
+      <w:r>
+        <w:t xml:space="preserve"> to manage files.</w:t>
+      </w:r>
+    </w:p>
+    <w:p>
+      <w:proofErr w:type="spellStart"/>
+      <w:r>
+        <w:t>jackson-databind</w:t>
+      </w:r>
+      <w:proofErr w:type="spellEnd"/>
+      <w:r>
+        <w:t>: Converts JSON to HashMap to handle test data easily.</w:t>
+      </w:r>
+    </w:p>
+    <w:p>
+      <w:r>
+        <w:t>Use quick start template or Maven project from org.apache.com.</w:t>
+      </w:r>
+    </w:p>
+    <w:p>
+      <w:pPr>
+        <w:rPr>
+          <w:b/>
+          <w:bCs/>
+        </w:rPr>
+      </w:pPr>
+      <w:proofErr w:type="spellStart"/>
+      <w:r>
+        <w:rPr>
+          <w:b/>
+          <w:bCs/>
+        </w:rPr>
+        <w:t>ThreadLocal</w:t>
+      </w:r>
+      <w:proofErr w:type="spellEnd"/>
+      <w:r>
+        <w:rPr>
+          <w:b/>
+          <w:bCs/>
+        </w:rPr>
+        <w:t>:</w:t>
+      </w:r>
+    </w:p>
+    <w:p>
+      <w:r>
+        <w:t>Manages parallel methods, assigning a unique variable per thread to avoid concurrency issues.</w:t>
+      </w:r>
+    </w:p>
+    <w:p>
+      <w:proofErr w:type="spellStart"/>
+      <w:r>
+        <w:t>ThreadGuard.protect</w:t>
+      </w:r>
+      <w:proofErr w:type="spellEnd"/>
+      <w:r>
+        <w:t>: Monitors variables (like driver) ensuring access only from their original thread.</w:t>
+      </w:r>
+    </w:p>
+    <w:p>
+      <w:pPr>
+        <w:rPr>
+          <w:b/>
+          <w:bCs/>
+        </w:rPr>
+      </w:pPr>
+      <w:r>
+        <w:rPr>
+          <w:b/>
+          <w:bCs/>
+        </w:rPr>
+        <w:t>Synchronized:</w:t>
+      </w:r>
+    </w:p>
+    <w:p>
+      <w:r>
+        <w:t>Restricts access to a method or code block to one thread at a time.</w:t>
+      </w:r>
+    </w:p>
+    <w:p>
+      <w:r>
+        <w:t>Important keywords in parallel testing:</w:t>
+      </w:r>
+    </w:p>
+    <w:p>
+      <w:r>
+        <w:t>static: Only one instance of the variable exists in the class; changes reflect in all objects.</w:t>
+      </w:r>
+    </w:p>
+    <w:p>
+      <w:r>
+        <w:lastRenderedPageBreak/>
+        <w:t>final: Prevents overriding the reference or value of the variable.</w:t>
+      </w:r>
+    </w:p>
+    <w:p>
+      <w:pPr>
+        <w:rPr>
+          <w:b/>
+          <w:bCs/>
+        </w:rPr>
+      </w:pPr>
+      <w:r>
+        <w:rPr>
+          <w:b/>
+          <w:bCs/>
+        </w:rPr>
+        <w:t>Parallel Options:</w:t>
       </w:r>
     </w:p>
     <w:p>
@@ -1524,11 +1902,11 @@
         <w:pStyle w:val="ListParagraph"/>
         <w:numPr>
           <w:ilvl w:val="0"/>
-          <w:numId w:val="12"/>
+          <w:numId w:val="13"/>
         </w:numPr>
       </w:pPr>
       <w:r>
-        <w:t>Set Maven path in Jenkins tools.</w:t>
+        <w:t>classes</w:t>
       </w:r>
     </w:p>
     <w:p>
@@ -1536,10 +1914,507 @@
         <w:pStyle w:val="ListParagraph"/>
         <w:numPr>
           <w:ilvl w:val="0"/>
-          <w:numId w:val="12"/>
+          <w:numId w:val="13"/>
         </w:numPr>
       </w:pPr>
       <w:r>
+        <w:t>false</w:t>
+      </w:r>
+    </w:p>
+    <w:p>
+      <w:pPr>
+        <w:pStyle w:val="ListParagraph"/>
+        <w:numPr>
+          <w:ilvl w:val="0"/>
+          <w:numId w:val="13"/>
+        </w:numPr>
+      </w:pPr>
+      <w:r>
+        <w:t>instances</w:t>
+      </w:r>
+    </w:p>
+    <w:p>
+      <w:pPr>
+        <w:pStyle w:val="ListParagraph"/>
+        <w:numPr>
+          <w:ilvl w:val="0"/>
+          <w:numId w:val="13"/>
+        </w:numPr>
+      </w:pPr>
+      <w:r>
+        <w:t>methods</w:t>
+      </w:r>
+    </w:p>
+    <w:p>
+      <w:pPr>
+        <w:pStyle w:val="ListParagraph"/>
+        <w:numPr>
+          <w:ilvl w:val="0"/>
+          <w:numId w:val="13"/>
+        </w:numPr>
+      </w:pPr>
+      <w:r>
+        <w:t>none</w:t>
+      </w:r>
+    </w:p>
+    <w:p>
+      <w:pPr>
+        <w:pStyle w:val="ListParagraph"/>
+        <w:numPr>
+          <w:ilvl w:val="0"/>
+          <w:numId w:val="13"/>
+        </w:numPr>
+      </w:pPr>
+      <w:r>
+        <w:t>tests</w:t>
+      </w:r>
+    </w:p>
+    <w:p>
+      <w:pPr>
+        <w:pStyle w:val="ListParagraph"/>
+        <w:numPr>
+          <w:ilvl w:val="0"/>
+          <w:numId w:val="13"/>
+        </w:numPr>
+      </w:pPr>
+      <w:r>
+        <w:t>classes</w:t>
+      </w:r>
+    </w:p>
+    <w:p>
+      <w:pPr>
+        <w:pStyle w:val="ListParagraph"/>
+        <w:numPr>
+          <w:ilvl w:val="0"/>
+          <w:numId w:val="13"/>
+        </w:numPr>
+      </w:pPr>
+      <w:r>
+        <w:t>true</w:t>
+      </w:r>
+    </w:p>
+    <w:p>
+      <w:pPr>
+        <w:rPr>
+          <w:b/>
+          <w:bCs/>
+        </w:rPr>
+      </w:pPr>
+      <w:r>
+        <w:rPr>
+          <w:b/>
+          <w:bCs/>
+        </w:rPr>
+        <w:t xml:space="preserve">Thread Safety and </w:t>
+      </w:r>
+      <w:proofErr w:type="spellStart"/>
+      <w:r>
+        <w:rPr>
+          <w:b/>
+          <w:bCs/>
+        </w:rPr>
+        <w:t>ThreadGuard</w:t>
+      </w:r>
+      <w:proofErr w:type="spellEnd"/>
+      <w:r>
+        <w:rPr>
+          <w:b/>
+          <w:bCs/>
+        </w:rPr>
+        <w:t xml:space="preserve"> are essential for managing </w:t>
+      </w:r>
+      <w:proofErr w:type="spellStart"/>
+      <w:r>
+        <w:rPr>
+          <w:b/>
+          <w:bCs/>
+        </w:rPr>
+        <w:t>ThreadLocal</w:t>
+      </w:r>
+      <w:proofErr w:type="spellEnd"/>
+      <w:r>
+        <w:rPr>
+          <w:b/>
+          <w:bCs/>
+        </w:rPr>
+        <w:t xml:space="preserve"> objects to avoid concurrency issues.</w:t>
+      </w:r>
+    </w:p>
+    <w:p>
+      <w:pPr>
+        <w:rPr>
+          <w:b/>
+          <w:bCs/>
+        </w:rPr>
+      </w:pPr>
+      <w:proofErr w:type="spellStart"/>
+      <w:r>
+        <w:rPr>
+          <w:b/>
+          <w:bCs/>
+        </w:rPr>
+        <w:t>RetryAnalyzer</w:t>
+      </w:r>
+      <w:proofErr w:type="spellEnd"/>
+      <w:r>
+        <w:rPr>
+          <w:b/>
+          <w:bCs/>
+        </w:rPr>
+        <w:t xml:space="preserve"> (</w:t>
+      </w:r>
+      <w:proofErr w:type="spellStart"/>
+      <w:r>
+        <w:rPr>
+          <w:b/>
+          <w:bCs/>
+        </w:rPr>
+        <w:t>IRetryAnalyzer</w:t>
+      </w:r>
+      <w:proofErr w:type="spellEnd"/>
+      <w:r>
+        <w:rPr>
+          <w:b/>
+          <w:bCs/>
+        </w:rPr>
+        <w:t>):</w:t>
+      </w:r>
+    </w:p>
+    <w:p>
+      <w:r>
+        <w:t xml:space="preserve">Detects flaky tests and retries failed ones. Implement via </w:t>
+      </w:r>
+      <w:proofErr w:type="spellStart"/>
+      <w:r>
+        <w:t>IRetryAnalyzer</w:t>
+      </w:r>
+      <w:proofErr w:type="spellEnd"/>
+      <w:r>
+        <w:t xml:space="preserve"> interface and annotation attribute </w:t>
+      </w:r>
+      <w:proofErr w:type="spellStart"/>
+      <w:r>
+        <w:t>RetryAnalyzer</w:t>
+      </w:r>
+      <w:proofErr w:type="spellEnd"/>
+      <w:r>
+        <w:t>.</w:t>
+      </w:r>
+    </w:p>
+    <w:p>
+      <w:pPr>
+        <w:rPr>
+          <w:b/>
+          <w:bCs/>
+        </w:rPr>
+      </w:pPr>
+      <w:r>
+        <w:rPr>
+          <w:b/>
+          <w:bCs/>
+        </w:rPr>
+        <w:t>Maven commands to run a test from terminal:</w:t>
+      </w:r>
+    </w:p>
+    <w:p>
+      <w:r>
+        <w:t>Configure Maven globally with environment variables, set the TestNG plugin and compiler version, define profiles, then run:</w:t>
+      </w:r>
+    </w:p>
+    <w:p>
+      <w:proofErr w:type="spellStart"/>
+      <w:r>
+        <w:t>mvn</w:t>
+      </w:r>
+      <w:proofErr w:type="spellEnd"/>
+      <w:r>
+        <w:t xml:space="preserve"> test -P{</w:t>
+      </w:r>
+      <w:proofErr w:type="spellStart"/>
+      <w:r>
+        <w:t>testng</w:t>
+      </w:r>
+      <w:proofErr w:type="spellEnd"/>
+      <w:r>
+        <w:t>}</w:t>
+      </w:r>
+    </w:p>
+    <w:p>
+      <w:r>
+        <w:t>You can also use /D properties to define global variables, e.g.:</w:t>
+      </w:r>
+    </w:p>
+    <w:p>
+      <w:proofErr w:type="spellStart"/>
+      <w:r>
+        <w:t>mvn</w:t>
+      </w:r>
+      <w:proofErr w:type="spellEnd"/>
+      <w:r>
+        <w:t xml:space="preserve"> test -</w:t>
+      </w:r>
+      <w:proofErr w:type="spellStart"/>
+      <w:r>
+        <w:t>PErrorValidation</w:t>
+      </w:r>
+      <w:proofErr w:type="spellEnd"/>
+      <w:r>
+        <w:t xml:space="preserve"> -</w:t>
+      </w:r>
+      <w:proofErr w:type="spellStart"/>
+      <w:r>
+        <w:t>DChrome</w:t>
+      </w:r>
+      <w:proofErr w:type="spellEnd"/>
+    </w:p>
+    <w:p>
+      <w:r>
+        <w:t>Use Surefire reports to view detailed execution results.</w:t>
+      </w:r>
+    </w:p>
+    <w:p>
+      <w:pPr>
+        <w:rPr>
+          <w:b/>
+          <w:bCs/>
+        </w:rPr>
+      </w:pPr>
+      <w:r>
+        <w:rPr>
+          <w:b/>
+          <w:bCs/>
+        </w:rPr>
+        <w:t>Jenkins (Continuous Integration tool):</w:t>
+      </w:r>
+    </w:p>
+    <w:p>
+      <w:r>
+        <w:t xml:space="preserve">Used to create jobs that automate testing execution. You can configure parameters, variables, dynamic executions, and scheduled jobs (Jenkins uses </w:t>
+      </w:r>
+      <w:proofErr w:type="spellStart"/>
+      <w:r>
+        <w:t>cron</w:t>
+      </w:r>
+      <w:proofErr w:type="spellEnd"/>
+      <w:r>
+        <w:t xml:space="preserve"> syntax {MINUTE HOUR DAY_OF_MONTH MONTH DAY_OF_WEEK}).</w:t>
+      </w:r>
+    </w:p>
+    <w:p>
+      <w:r>
+        <w:t>Remember to use parameters in steps (e.g., $</w:t>
+      </w:r>
+      <w:proofErr w:type="spellStart"/>
+      <w:r>
+        <w:t>browserName</w:t>
+      </w:r>
+      <w:proofErr w:type="spellEnd"/>
+      <w:r>
+        <w:t>), and check “Use custom workspace” if not using a repository.</w:t>
+      </w:r>
+    </w:p>
+    <w:p>
+      <w:pPr>
+        <w:rPr>
+          <w:b/>
+          <w:bCs/>
+        </w:rPr>
+      </w:pPr>
+      <w:r>
+        <w:rPr>
+          <w:b/>
+          <w:bCs/>
+        </w:rPr>
+        <w:t>Cucumber:</w:t>
+      </w:r>
+    </w:p>
+    <w:p>
+      <w:r>
+        <w:lastRenderedPageBreak/>
+        <w:t>Cucumber represents test cases as scenarios using Gherkin syntax and BDD methodology.</w:t>
+      </w:r>
+    </w:p>
+    <w:p>
+      <w:r>
+        <w:t>Keywords: Scenario, Feature, Feature File, Scenario Outline, Step Definition, Tags.</w:t>
+      </w:r>
+    </w:p>
+    <w:p>
+      <w:r>
+        <w:t>A Feature defines system behavior, and Scenarios define expected outcomes.</w:t>
+      </w:r>
+    </w:p>
+    <w:p>
+      <w:r>
+        <w:t>In Java, bind feature steps to code using annotations @Given, @When, @Then, @And.</w:t>
+      </w:r>
+    </w:p>
+    <w:p>
+      <w:r>
+        <w:t>Parameterization with outlines requires regular expressions (e.g., "</w:t>
+      </w:r>
+      <w:proofErr w:type="gramStart"/>
+      <w:r>
+        <w:t>^(</w:t>
+      </w:r>
+      <w:proofErr w:type="gramEnd"/>
+      <w:r>
+        <w:t>.</w:t>
+      </w:r>
+      <w:proofErr w:type="gramStart"/>
+      <w:r>
+        <w:t>+)$</w:t>
+      </w:r>
+      <w:proofErr w:type="gramEnd"/>
+      <w:r>
+        <w:t>").</w:t>
+      </w:r>
+    </w:p>
+    <w:p>
+      <w:r>
+        <w:t xml:space="preserve">Execution is handled with TestNG by extending </w:t>
+      </w:r>
+      <w:proofErr w:type="spellStart"/>
+      <w:r>
+        <w:t>AbstractTestNGCucumberTests</w:t>
+      </w:r>
+      <w:proofErr w:type="spellEnd"/>
+      <w:r>
+        <w:t xml:space="preserve"> and using annotations for </w:t>
+      </w:r>
+      <w:proofErr w:type="spellStart"/>
+      <w:r>
+        <w:t>ChromeOptions</w:t>
+      </w:r>
+      <w:proofErr w:type="spellEnd"/>
+      <w:r>
+        <w:t>, features, glue, monochrome, plugin, tags, etc.</w:t>
+      </w:r>
+    </w:p>
+    <w:p>
+      <w:pPr>
+        <w:rPr>
+          <w:b/>
+          <w:bCs/>
+        </w:rPr>
+      </w:pPr>
+      <w:r>
+        <w:rPr>
+          <w:b/>
+          <w:bCs/>
+        </w:rPr>
+        <w:t>CI/CD Pipeline:</w:t>
+      </w:r>
+    </w:p>
+    <w:p>
+      <w:r>
+        <w:t>Webhook: Is an automatic notification that GitHub sends to another server (like Jenkins) to trigger jobs or events.</w:t>
+      </w:r>
+    </w:p>
+    <w:p>
+      <w:r>
+        <w:t xml:space="preserve">GitHub Hook trigger for </w:t>
+      </w:r>
+      <w:proofErr w:type="spellStart"/>
+      <w:r>
+        <w:t>GITScm</w:t>
+      </w:r>
+      <w:proofErr w:type="spellEnd"/>
+      <w:r>
+        <w:t xml:space="preserve"> polling in Maven projects allows automatic builds when GitHub sends a webhook.</w:t>
+      </w:r>
+    </w:p>
+    <w:p>
+      <w:r>
+        <w:t xml:space="preserve">Payload URL is the Jenkins server endpoint receiving GitHub webhooks. Configure events to trigger (e.g., push actions). For practice, use </w:t>
+      </w:r>
+      <w:proofErr w:type="spellStart"/>
+      <w:r>
+        <w:t>Ngrok</w:t>
+      </w:r>
+      <w:proofErr w:type="spellEnd"/>
+      <w:r>
+        <w:t xml:space="preserve"> to expose Jenkins to the internet, as GitHub requires public access.</w:t>
+      </w:r>
+    </w:p>
+    <w:p>
+      <w:pPr>
+        <w:rPr>
+          <w:b/>
+          <w:bCs/>
+          <w:i/>
+          <w:iCs/>
+          <w:u w:val="single"/>
+        </w:rPr>
+      </w:pPr>
+      <w:r>
+        <w:rPr>
+          <w:b/>
+          <w:bCs/>
+          <w:i/>
+          <w:iCs/>
+          <w:u w:val="single"/>
+        </w:rPr>
+        <w:t>Remember:</w:t>
+      </w:r>
+    </w:p>
+    <w:p>
+      <w:pPr>
+        <w:pStyle w:val="ListParagraph"/>
+        <w:numPr>
+          <w:ilvl w:val="0"/>
+          <w:numId w:val="14"/>
+        </w:numPr>
+      </w:pPr>
+      <w:r>
+        <w:t>Create a secret token in GitHub (Developer settings → Personal access tokens → Tokens (classic)).</w:t>
+      </w:r>
+    </w:p>
+    <w:p>
+      <w:pPr>
+        <w:pStyle w:val="ListParagraph"/>
+        <w:numPr>
+          <w:ilvl w:val="0"/>
+          <w:numId w:val="14"/>
+        </w:numPr>
+      </w:pPr>
+      <w:r>
+        <w:t>Configure secret tests in GitHub.</w:t>
+      </w:r>
+    </w:p>
+    <w:p>
+      <w:pPr>
+        <w:pStyle w:val="ListParagraph"/>
+        <w:numPr>
+          <w:ilvl w:val="0"/>
+          <w:numId w:val="14"/>
+        </w:numPr>
+      </w:pPr>
+      <w:r>
+        <w:t>Configure the webhook in the repository.</w:t>
+      </w:r>
+    </w:p>
+    <w:p>
+      <w:pPr>
+        <w:pStyle w:val="ListParagraph"/>
+        <w:numPr>
+          <w:ilvl w:val="0"/>
+          <w:numId w:val="14"/>
+        </w:numPr>
+      </w:pPr>
+      <w:r>
+        <w:t>Set Maven path in Jenkins tools.</w:t>
+      </w:r>
+    </w:p>
+    <w:p>
+      <w:pPr>
+        <w:pStyle w:val="ListParagraph"/>
+        <w:numPr>
+          <w:ilvl w:val="0"/>
+          <w:numId w:val="14"/>
+        </w:numPr>
+      </w:pPr>
+      <w:r>
         <w:t>Configure the payload URL in Jenkins (“System” section).</w:t>
       </w:r>
     </w:p>
@@ -1575,54 +2450,51 @@
     </w:p>
     <w:p>
       <w:r>
+        <w:lastRenderedPageBreak/>
         <w:t>Important commands:</w:t>
       </w:r>
     </w:p>
     <w:p>
       <w:r>
-        <w:t>Start hub: java -jar &lt;SeleniumJarName&gt; hub</w:t>
-      </w:r>
-    </w:p>
-    <w:p>
-      <w:r>
-        <w:t>Start node (same machine): java -jar &lt;SeleniumJarName&gt; node --detect-drivers true</w:t>
-      </w:r>
-    </w:p>
-    <w:p>
-      <w:r>
-        <w:rPr/>
-        <w:t xml:space="preserve">Note: To configure an external node </w:t>
-      </w:r>
-      <w:r>
-        <w:rPr/>
-        <w:t>located</w:t>
-      </w:r>
-      <w:r>
-        <w:rPr/>
-        <w:t xml:space="preserve"> on another physical machine, </w:t>
-      </w:r>
-      <w:r>
-        <w:rPr/>
-        <w:t>it’s</w:t>
-      </w:r>
-      <w:r>
-        <w:rPr/>
-        <w:t xml:space="preserve"> necessary to set the flags --publish-events and --subscribe-events with ports XPUSH and XSUB of the hub (by default 4442 and 4443).</w:t>
+        <w:t>Start hub: java -jar &lt;</w:t>
+      </w:r>
+      <w:proofErr w:type="spellStart"/>
+      <w:r>
+        <w:t>SeleniumJarName</w:t>
+      </w:r>
+      <w:proofErr w:type="spellEnd"/>
+      <w:r>
+        <w:t>&gt; hub</w:t>
+      </w:r>
+    </w:p>
+    <w:p>
+      <w:r>
+        <w:t>Start node (same machine): java -jar &lt;</w:t>
+      </w:r>
+      <w:proofErr w:type="spellStart"/>
+      <w:r>
+        <w:t>SeleniumJarName</w:t>
+      </w:r>
+      <w:proofErr w:type="spellEnd"/>
+      <w:r>
+        <w:t>&gt; node --detect-drivers true</w:t>
+      </w:r>
+    </w:p>
+    <w:p>
+      <w:r>
+        <w:t>Note: To configure an external node located on another physical machine, it’s necessary to set the flags --publish-events and --subscribe-events with ports XPUSH and XSUB of the hub (by default 4442 and 4443).</w:t>
       </w:r>
     </w:p>
     <w:p/>
     <w:p/>
     <w:p>
       <w:r>
-        <w:rPr/>
         <w:t>Data driver testing from Excel</w:t>
       </w:r>
       <w:r>
-        <w:rPr/>
         <w:t>.</w:t>
       </w:r>
       <w:r>
-        <w:rPr/>
         <w:t xml:space="preserve"> (Excel Drive-Data)</w:t>
       </w:r>
       <w:r>
@@ -1632,117 +2504,120 @@
         <w:br/>
       </w:r>
       <w:r>
-        <w:rPr/>
         <w:t xml:space="preserve">How </w:t>
       </w:r>
       <w:r>
-        <w:rPr/>
         <w:t>can we</w:t>
       </w:r>
       <w:r>
-        <w:rPr/>
         <w:t xml:space="preserve"> achieve this? using </w:t>
       </w:r>
-      <w:r>
-        <w:rPr/>
+      <w:proofErr w:type="spellStart"/>
+      <w:r>
         <w:t>apache</w:t>
       </w:r>
-      <w:r>
-        <w:rPr/>
+      <w:proofErr w:type="spellEnd"/>
+      <w:r>
         <w:t xml:space="preserve"> POI API</w:t>
       </w:r>
     </w:p>
     <w:p>
-      <w:pPr>
-        <w:pStyle w:val="Normal"/>
-      </w:pPr>
-      <w:r>
-        <w:rPr/>
+      <w:proofErr w:type="spellStart"/>
+      <w:r>
         <w:t>XSSFWoork</w:t>
       </w:r>
-      <w:r>
-        <w:rPr/>
+      <w:proofErr w:type="spellEnd"/>
+      <w:r>
         <w:t xml:space="preserve"> Book is </w:t>
       </w:r>
-      <w:r>
-        <w:rPr/>
+      <w:proofErr w:type="gramStart"/>
+      <w:r>
         <w:t>use</w:t>
       </w:r>
-      <w:r>
-        <w:rPr/>
+      <w:proofErr w:type="gramEnd"/>
+      <w:r>
         <w:t xml:space="preserve"> to get </w:t>
       </w:r>
-      <w:r>
-        <w:rPr/>
+      <w:proofErr w:type="spellStart"/>
+      <w:r>
         <w:t>acces</w:t>
       </w:r>
-      <w:r>
-        <w:rPr/>
+      <w:proofErr w:type="spellEnd"/>
+      <w:r>
         <w:t xml:space="preserve"> to </w:t>
       </w:r>
-      <w:r>
-        <w:rPr/>
+      <w:proofErr w:type="spellStart"/>
+      <w:r>
         <w:t>theexcel</w:t>
       </w:r>
-      <w:r>
-        <w:rPr/>
+      <w:proofErr w:type="spellEnd"/>
+      <w:r>
         <w:t xml:space="preserve"> file</w:t>
       </w:r>
     </w:p>
     <w:p>
-      <w:pPr>
-        <w:pStyle w:val="Normal"/>
-      </w:pPr>
-      <w:r>
-        <w:rPr/>
+      <w:proofErr w:type="spellStart"/>
+      <w:r>
         <w:t>XSSFSheets</w:t>
       </w:r>
-      <w:r>
-        <w:rPr/>
+      <w:proofErr w:type="spellEnd"/>
+      <w:r>
         <w:t xml:space="preserve"> </w:t>
       </w:r>
-      <w:r>
-        <w:rPr/>
+      <w:proofErr w:type="spellStart"/>
+      <w:r>
         <w:t>i</w:t>
       </w:r>
-      <w:r>
-        <w:rPr/>
-        <w:t xml:space="preserve"> s use to get </w:t>
-      </w:r>
-      <w:r>
-        <w:rPr/>
+      <w:proofErr w:type="spellEnd"/>
+      <w:r>
+        <w:t xml:space="preserve"> s use to </w:t>
+      </w:r>
+      <w:proofErr w:type="gramStart"/>
+      <w:r>
+        <w:t xml:space="preserve">get </w:t>
+      </w:r>
+      <w:r>
         <w:t xml:space="preserve"> </w:t>
       </w:r>
-      <w:r>
-        <w:rPr/>
+      <w:proofErr w:type="spellStart"/>
+      <w:r>
         <w:t>acces</w:t>
       </w:r>
-      <w:r>
-        <w:rPr/>
-        <w:t xml:space="preserve"> to the one of the </w:t>
-      </w:r>
-      <w:r>
-        <w:rPr/>
+      <w:proofErr w:type="spellEnd"/>
+      <w:proofErr w:type="gramEnd"/>
+      <w:r>
+        <w:t xml:space="preserve"> to </w:t>
+      </w:r>
+      <w:proofErr w:type="gramStart"/>
+      <w:r>
+        <w:t>the one</w:t>
+      </w:r>
+      <w:proofErr w:type="gramEnd"/>
+      <w:r>
+        <w:t xml:space="preserve"> of the </w:t>
+      </w:r>
+      <w:proofErr w:type="spellStart"/>
+      <w:r>
         <w:t>shhets</w:t>
       </w:r>
-      <w:r>
-        <w:rPr/>
+      <w:proofErr w:type="spellEnd"/>
+      <w:r>
         <w:t xml:space="preserve"> </w:t>
       </w:r>
-      <w:r>
-        <w:rPr/>
+      <w:proofErr w:type="spellStart"/>
+      <w:r>
         <w:t>pereset</w:t>
       </w:r>
-      <w:r>
-        <w:rPr/>
+      <w:proofErr w:type="spellEnd"/>
+      <w:r>
         <w:t xml:space="preserve"> in </w:t>
       </w:r>
-      <w:r>
-        <w:rPr/>
+      <w:proofErr w:type="spellStart"/>
+      <w:r>
         <w:t>excelñ</w:t>
       </w:r>
-      <w:r>
-        <w:rPr/>
+      <w:proofErr w:type="spellEnd"/>
+      <w:r>
         <w:t xml:space="preserve"> file</w:t>
       </w:r>
       <w:r>
@@ -1757,174 +2632,179 @@
       <w:r>
         <w:br/>
       </w:r>
-      <w:r>
-        <w:rPr/>
-        <w:t xml:space="preserve">getPhysicalNumber(): The method is used to </w:t>
-      </w:r>
-      <w:r>
-        <w:rPr/>
+      <w:proofErr w:type="spellStart"/>
+      <w:proofErr w:type="gramStart"/>
+      <w:r>
+        <w:t>getPhysicalNumber</w:t>
+      </w:r>
+      <w:proofErr w:type="spellEnd"/>
+      <w:r>
+        <w:t>(</w:t>
+      </w:r>
+      <w:proofErr w:type="gramEnd"/>
+      <w:r>
+        <w:t xml:space="preserve">): The method is used to </w:t>
+      </w:r>
+      <w:proofErr w:type="gramStart"/>
+      <w:r>
         <w:t>obtained</w:t>
       </w:r>
-      <w:r>
-        <w:rPr/>
+      <w:proofErr w:type="gramEnd"/>
+      <w:r>
         <w:t xml:space="preserve"> the number of rows present with data in the sheet</w:t>
       </w:r>
     </w:p>
     <w:p>
-      <w:pPr>
-        <w:pStyle w:val="Normal"/>
-      </w:pPr>
-      <w:r>
-        <w:rPr/>
+      <w:proofErr w:type="spellStart"/>
+      <w:proofErr w:type="gramStart"/>
+      <w:r>
         <w:t>GetLassCellNum</w:t>
       </w:r>
-      <w:r>
-        <w:rPr/>
-        <w:t xml:space="preserve">(): Works to </w:t>
-      </w:r>
-      <w:r>
-        <w:rPr/>
+      <w:proofErr w:type="spellEnd"/>
+      <w:r>
+        <w:t>(</w:t>
+      </w:r>
+      <w:proofErr w:type="gramEnd"/>
+      <w:r>
+        <w:t xml:space="preserve">): Works to </w:t>
+      </w:r>
+      <w:proofErr w:type="gramStart"/>
+      <w:r>
         <w:t>obtained</w:t>
       </w:r>
-      <w:r>
-        <w:rPr/>
+      <w:proofErr w:type="gramEnd"/>
+      <w:r>
         <w:t xml:space="preserve"> the number of </w:t>
       </w:r>
-      <w:r>
-        <w:rPr/>
+      <w:proofErr w:type="spellStart"/>
+      <w:r>
         <w:t>collumns</w:t>
       </w:r>
-      <w:r>
-        <w:rPr/>
+      <w:proofErr w:type="spellEnd"/>
+      <w:r>
         <w:t xml:space="preserve"> present </w:t>
       </w:r>
-      <w:r>
-        <w:rPr/>
+      <w:proofErr w:type="spellStart"/>
+      <w:proofErr w:type="gramStart"/>
+      <w:r>
         <w:t>inthe</w:t>
       </w:r>
-      <w:r>
-        <w:rPr/>
+      <w:proofErr w:type="spellEnd"/>
+      <w:proofErr w:type="gramEnd"/>
+      <w:r>
         <w:t xml:space="preserve"> rows, to use is </w:t>
       </w:r>
-      <w:r>
-        <w:rPr/>
+      <w:proofErr w:type="spellStart"/>
+      <w:r>
         <w:t>necesary</w:t>
       </w:r>
-      <w:r>
-        <w:rPr/>
+      <w:proofErr w:type="spellEnd"/>
+      <w:r>
         <w:t xml:space="preserve"> the o</w:t>
       </w:r>
       <w:r>
-        <w:rPr/>
         <w:t>bject return by after method.</w:t>
       </w:r>
     </w:p>
     <w:p>
-      <w:pPr>
-        <w:pStyle w:val="Normal"/>
-      </w:pPr>
-      <w:r>
-        <w:rPr/>
+      <w:r>
         <w:t xml:space="preserve">Iterator&lt;row&gt; this interface is </w:t>
       </w:r>
-      <w:r>
-        <w:rPr/>
+      <w:proofErr w:type="gramStart"/>
+      <w:r>
         <w:t>use</w:t>
       </w:r>
-      <w:r>
-        <w:rPr/>
+      <w:proofErr w:type="gramEnd"/>
+      <w:r>
         <w:t xml:space="preserve"> to navigate to each row of the sheet</w:t>
       </w:r>
     </w:p>
     <w:p>
-      <w:pPr>
-        <w:pStyle w:val="Normal"/>
-      </w:pPr>
-      <w:r>
-        <w:rPr/>
+      <w:proofErr w:type="spellStart"/>
+      <w:r>
         <w:t>Antd</w:t>
       </w:r>
-      <w:r>
-        <w:rPr/>
+      <w:proofErr w:type="spellEnd"/>
+      <w:r>
         <w:t xml:space="preserve"> </w:t>
       </w:r>
       <w:r>
-        <w:rPr/>
         <w:t xml:space="preserve">Row object is </w:t>
       </w:r>
-      <w:r>
-        <w:rPr/>
+      <w:proofErr w:type="gramStart"/>
+      <w:r>
         <w:t>use</w:t>
       </w:r>
-      <w:r>
-        <w:rPr/>
+      <w:proofErr w:type="gramEnd"/>
+      <w:r>
         <w:t xml:space="preserve"> to </w:t>
       </w:r>
-      <w:r>
-        <w:rPr/>
+      <w:proofErr w:type="spellStart"/>
+      <w:r>
         <w:t>acces</w:t>
       </w:r>
-      <w:r>
-        <w:rPr/>
+      <w:proofErr w:type="spellEnd"/>
+      <w:r>
         <w:t xml:space="preserve"> the information on all row and navigate to each cell using </w:t>
       </w:r>
-      <w:r>
-        <w:rPr/>
+      <w:proofErr w:type="spellStart"/>
+      <w:proofErr w:type="gramStart"/>
+      <w:r>
         <w:t>cellIteratorMethod</w:t>
       </w:r>
-      <w:r>
-        <w:rPr/>
-        <w:t>()</w:t>
-      </w:r>
-      <w:r>
-        <w:rPr/>
+      <w:proofErr w:type="spellEnd"/>
+      <w:r>
+        <w:t>(</w:t>
+      </w:r>
+      <w:proofErr w:type="gramEnd"/>
+      <w:r>
+        <w:t>)</w:t>
+      </w:r>
+      <w:r>
         <w:t xml:space="preserve"> and put this returning element in Iterator&lt;Cell&gt; interface</w:t>
       </w:r>
     </w:p>
     <w:p>
-      <w:pPr>
-        <w:pStyle w:val="Normal"/>
-      </w:pPr>
-      <w:r>
-        <w:rPr/>
+      <w:proofErr w:type="spellStart"/>
+      <w:r>
         <w:t>getStringCellValue</w:t>
       </w:r>
-      <w:r>
-        <w:rPr/>
+      <w:proofErr w:type="spellEnd"/>
+      <w:r>
         <w:t xml:space="preserve">, is a method to </w:t>
       </w:r>
-      <w:r>
-        <w:rPr/>
+      <w:proofErr w:type="spellStart"/>
+      <w:r>
         <w:t>optiona</w:t>
       </w:r>
-      <w:r>
-        <w:rPr/>
+      <w:proofErr w:type="spellEnd"/>
+      <w:r>
         <w:t xml:space="preserve"> value </w:t>
       </w:r>
-      <w:r>
-        <w:rPr/>
+      <w:proofErr w:type="spellStart"/>
+      <w:r>
         <w:t>alocated</w:t>
       </w:r>
-      <w:r>
-        <w:rPr/>
+      <w:proofErr w:type="spellEnd"/>
+      <w:r>
         <w:t xml:space="preserve"> in the specified cell</w:t>
       </w:r>
     </w:p>
     <w:p>
-      <w:pPr>
-        <w:pStyle w:val="Normal"/>
-      </w:pPr>
-      <w:r>
-        <w:rPr/>
-        <w:t xml:space="preserve">Sheets is collection of rows </w:t>
-      </w:r>
-    </w:p>
-    <w:p>
-      <w:pPr>
-        <w:pStyle w:val="Normal"/>
-      </w:pPr>
-      <w:r>
-        <w:rPr/>
+      <w:r>
+        <w:t xml:space="preserve">Sheets </w:t>
+      </w:r>
+      <w:proofErr w:type="gramStart"/>
+      <w:r>
+        <w:t>is</w:t>
+      </w:r>
+      <w:proofErr w:type="gramEnd"/>
+      <w:r>
+        <w:t xml:space="preserve"> collection of rows </w:t>
+      </w:r>
+    </w:p>
+    <w:p>
+      <w:r>
         <w:t>Row is collection of cells</w:t>
       </w:r>
       <w:r>
@@ -1932,115 +2812,207 @@
       </w:r>
     </w:p>
     <w:p>
-      <w:pPr>
-        <w:pStyle w:val="Normal"/>
-      </w:pPr>
-      <w:r>
-        <w:rPr/>
-        <w:t xml:space="preserve">TestNG DataProvider and Excel Data Driver: </w:t>
-      </w:r>
-    </w:p>
-    <w:p>
-      <w:pPr>
-        <w:pStyle w:val="Normal"/>
-      </w:pPr>
-      <w:r>
-        <w:rPr/>
-        <w:t xml:space="preserve">DataProvider </w:t>
-      </w:r>
-      <w:r>
-        <w:rPr/>
-        <w:t xml:space="preserve">allows executing the same test case multiple times and visualizing in the </w:t>
-      </w:r>
-      <w:r>
-        <w:rPr/>
-        <w:t>report</w:t>
-      </w:r>
-      <w:r>
-        <w:rPr/>
-        <w:t xml:space="preserve"> each data execution, showing which data sets pass or fail. </w:t>
-      </w:r>
-    </w:p>
-    <w:p>
-      <w:pPr>
-        <w:pStyle w:val="Normal"/>
-      </w:pPr>
-      <w:r>
-        <w:rPr/>
+      <w:r>
+        <w:t xml:space="preserve">TestNG </w:t>
+      </w:r>
+      <w:proofErr w:type="spellStart"/>
+      <w:r>
+        <w:t>DataProvider</w:t>
+      </w:r>
+      <w:proofErr w:type="spellEnd"/>
+      <w:r>
+        <w:t xml:space="preserve"> and Excel Data Driver: </w:t>
+      </w:r>
+    </w:p>
+    <w:p>
+      <w:proofErr w:type="spellStart"/>
+      <w:r>
+        <w:t>DataProvider</w:t>
+      </w:r>
+      <w:proofErr w:type="spellEnd"/>
+      <w:r>
+        <w:t xml:space="preserve"> </w:t>
+      </w:r>
+      <w:r>
+        <w:t xml:space="preserve">allows executing the same test case multiple times and visualizing in the report each data execution, showing which data sets pass or fail. </w:t>
+      </w:r>
+    </w:p>
+    <w:p>
+      <w:r>
         <w:t xml:space="preserve">On the other hand, using only the </w:t>
       </w:r>
-      <w:r>
-        <w:rPr/>
+      <w:proofErr w:type="spellStart"/>
+      <w:r>
         <w:t>DataProvider</w:t>
       </w:r>
-      <w:r>
-        <w:rPr/>
+      <w:proofErr w:type="spellEnd"/>
+      <w:r>
         <w:t xml:space="preserve"> requires hardcoding, which makes the approach less dynamic and more complicated. </w:t>
       </w:r>
     </w:p>
     <w:p>
-      <w:pPr>
-        <w:pStyle w:val="Normal"/>
-      </w:pPr>
-      <w:r>
-        <w:rPr/>
+      <w:r>
+        <w:lastRenderedPageBreak/>
         <w:t xml:space="preserve">Using only Excel Data Driver provides dynamic data, but it does not manage execution of the test at different times. </w:t>
       </w:r>
     </w:p>
     <w:p>
-      <w:pPr>
-        <w:pStyle w:val="Normal"/>
-      </w:pPr>
-      <w:r>
-        <w:rPr/>
-        <w:t>In this case, the test must execute in a loop to verify all data, and finally, the report will show only one execution instead of multiple executions.</w:t>
-      </w:r>
-    </w:p>
-    <w:p>
-      <w:pPr>
-        <w:pStyle w:val="Normal"/>
-      </w:pPr>
-      <w:r>
-        <w:rPr/>
-        <w:t xml:space="preserve">The best </w:t>
-      </w:r>
-      <w:r>
-        <w:rPr/>
-        <w:t>option</w:t>
-      </w:r>
-      <w:r>
-        <w:rPr/>
-        <w:t xml:space="preserve"> is Bring the capabilities to manage dynamic data with Excel data-driven testing combined with</w:t>
-      </w:r>
-      <w:r>
-        <w:rPr/>
-        <w:t xml:space="preserve"> </w:t>
-      </w:r>
-      <w:r>
-        <w:rPr/>
-        <w:t>DataProvide</w:t>
-      </w:r>
-      <w:r>
-        <w:rPr/>
-        <w:t>r</w:t>
-      </w:r>
-      <w:r>
-        <w:rPr/>
+      <w:r>
+        <w:t xml:space="preserve">In this case, the test must </w:t>
+      </w:r>
+      <w:proofErr w:type="gramStart"/>
+      <w:r>
+        <w:t>execute</w:t>
+      </w:r>
+      <w:proofErr w:type="gramEnd"/>
+      <w:r>
+        <w:t xml:space="preserve"> in a loop to verify all data, and finally, the report will show only one execution instead of multiple executions.</w:t>
+      </w:r>
+    </w:p>
+    <w:p>
+      <w:r>
+        <w:t xml:space="preserve">The best option is Bring the capabilities to manage dynamic data with Excel data-driven testing combined with </w:t>
+      </w:r>
+      <w:proofErr w:type="spellStart"/>
+      <w:r>
+        <w:t>DataProvider</w:t>
+      </w:r>
+      <w:proofErr w:type="spellEnd"/>
+      <w:r>
         <w:t>.</w:t>
       </w:r>
     </w:p>
     <w:p>
-      <w:pPr>
-        <w:pStyle w:val="Normal"/>
-      </w:pPr>
-    </w:p>
-    <w:p>
-      <w:pPr>
-        <w:pStyle w:val="Normal"/>
-      </w:pPr>
-    </w:p>
+      <w:proofErr w:type="spellStart"/>
+      <w:r>
+        <w:t>DataFormatter</w:t>
+      </w:r>
+      <w:proofErr w:type="spellEnd"/>
+      <w:r>
+        <w:t xml:space="preserve">: Works to </w:t>
+      </w:r>
+      <w:r>
+        <w:t xml:space="preserve">obtain the visibility value </w:t>
+      </w:r>
+      <w:proofErr w:type="spellStart"/>
+      <w:r>
+        <w:t>oreset</w:t>
+      </w:r>
+      <w:proofErr w:type="spellEnd"/>
+      <w:r>
+        <w:t xml:space="preserve"> in a cell.</w:t>
+      </w:r>
+      <w:r>
+        <w:br/>
+      </w:r>
+      <w:proofErr w:type="spellStart"/>
+      <w:proofErr w:type="gramStart"/>
+      <w:r>
+        <w:rPr>
+          <w:rFonts w:ascii="Aptos" w:eastAsia="Aptos" w:hAnsi="Aptos" w:cs="Aptos"/>
+        </w:rPr>
+        <w:t>getPhysicalNumberOfRows</w:t>
+      </w:r>
+      <w:proofErr w:type="spellEnd"/>
+      <w:r>
+        <w:rPr>
+          <w:rFonts w:ascii="Aptos" w:eastAsia="Aptos" w:hAnsi="Aptos" w:cs="Aptos"/>
+        </w:rPr>
+        <w:t>(</w:t>
+      </w:r>
+      <w:proofErr w:type="gramEnd"/>
+      <w:r>
+        <w:rPr>
+          <w:rFonts w:ascii="Aptos" w:eastAsia="Aptos" w:hAnsi="Aptos" w:cs="Aptos"/>
+        </w:rPr>
+        <w:t>)</w:t>
+      </w:r>
+      <w:r>
+        <w:rPr>
+          <w:rFonts w:ascii="Aptos" w:eastAsia="Aptos" w:hAnsi="Aptos" w:cs="Aptos"/>
+        </w:rPr>
+        <w:t xml:space="preserve">: Get </w:t>
+      </w:r>
+      <w:proofErr w:type="spellStart"/>
+      <w:r>
+        <w:rPr>
+          <w:rFonts w:ascii="Aptos" w:eastAsia="Aptos" w:hAnsi="Aptos" w:cs="Aptos"/>
+        </w:rPr>
+        <w:t>th</w:t>
+      </w:r>
+      <w:proofErr w:type="spellEnd"/>
+      <w:r>
+        <w:rPr>
+          <w:rFonts w:ascii="Aptos" w:eastAsia="Aptos" w:hAnsi="Aptos" w:cs="Aptos"/>
+        </w:rPr>
+        <w:t xml:space="preserve"> total of rows that have a value, skip empty cell.</w:t>
+      </w:r>
+      <w:r>
+        <w:rPr>
+          <w:rFonts w:ascii="Aptos" w:eastAsia="Aptos" w:hAnsi="Aptos" w:cs="Aptos"/>
+        </w:rPr>
+        <w:br/>
+      </w:r>
+      <w:proofErr w:type="spellStart"/>
+      <w:proofErr w:type="gramStart"/>
+      <w:r>
+        <w:rPr>
+          <w:rFonts w:ascii="Aptos" w:eastAsia="Aptos" w:hAnsi="Aptos" w:cs="Aptos"/>
+        </w:rPr>
+        <w:t>getLastRowNum</w:t>
+      </w:r>
+      <w:proofErr w:type="spellEnd"/>
+      <w:r>
+        <w:rPr>
+          <w:rFonts w:ascii="Aptos" w:eastAsia="Aptos" w:hAnsi="Aptos" w:cs="Aptos"/>
+        </w:rPr>
+        <w:t>(</w:t>
+      </w:r>
+      <w:proofErr w:type="gramEnd"/>
+      <w:r>
+        <w:rPr>
+          <w:rFonts w:ascii="Aptos" w:eastAsia="Aptos" w:hAnsi="Aptos" w:cs="Aptos"/>
+        </w:rPr>
+        <w:t>)</w:t>
+      </w:r>
+      <w:r>
+        <w:rPr>
+          <w:rFonts w:ascii="Aptos" w:eastAsia="Aptos" w:hAnsi="Aptos" w:cs="Aptos"/>
+        </w:rPr>
+        <w:t>: Works to get the last row with data, include empty values.</w:t>
+      </w:r>
+    </w:p>
+    <w:p/>
+    <w:p>
+      <w:proofErr w:type="spellStart"/>
+      <w:r>
+        <w:t>FileI</w:t>
+      </w:r>
+      <w:r>
+        <w:t>n</w:t>
+      </w:r>
+      <w:r>
+        <w:t>putStream</w:t>
+      </w:r>
+      <w:proofErr w:type="spellEnd"/>
+      <w:r>
+        <w:t xml:space="preserve">: </w:t>
+      </w:r>
+      <w:r>
+        <w:br/>
+      </w:r>
+      <w:proofErr w:type="spellStart"/>
+      <w:r>
+        <w:t>FileOutputStream</w:t>
+      </w:r>
+      <w:proofErr w:type="spellEnd"/>
+      <w:r>
+        <w:t>:</w:t>
+      </w:r>
+    </w:p>
+    <w:p/>
     <w:sectPr>
-      <w:pgSz w:w="12240" w:h="15840" w:orient="portrait"/>
+      <w:pgSz w:w="12240" w:h="15840"/>
       <w:pgMar w:top="1417" w:right="1701" w:bottom="1417" w:left="1701" w:header="720" w:footer="720" w:gutter="0"/>
       <w:cols w:space="720"/>
       <w:docGrid w:linePitch="360"/>
@@ -2064,7 +3036,7 @@
         <w:ind w:left="720" w:hanging="360"/>
       </w:pPr>
       <w:rPr>
-        <w:rFonts w:hint="default" w:ascii="Symbol" w:hAnsi="Symbol"/>
+        <w:rFonts w:ascii="Symbol" w:hAnsi="Symbol" w:hint="default"/>
       </w:rPr>
     </w:lvl>
     <w:lvl w:ilvl="1" w:tplc="140A0003" w:tentative="1">
@@ -2076,7 +3048,7 @@
         <w:ind w:left="1440" w:hanging="360"/>
       </w:pPr>
       <w:rPr>
-        <w:rFonts w:hint="default" w:ascii="Courier New" w:hAnsi="Courier New" w:cs="Courier New"/>
+        <w:rFonts w:ascii="Courier New" w:hAnsi="Courier New" w:cs="Courier New" w:hint="default"/>
       </w:rPr>
     </w:lvl>
     <w:lvl w:ilvl="2" w:tplc="140A0005" w:tentative="1">
@@ -2088,7 +3060,7 @@
         <w:ind w:left="2160" w:hanging="360"/>
       </w:pPr>
       <w:rPr>
-        <w:rFonts w:hint="default" w:ascii="Wingdings" w:hAnsi="Wingdings"/>
+        <w:rFonts w:ascii="Wingdings" w:hAnsi="Wingdings" w:hint="default"/>
       </w:rPr>
     </w:lvl>
     <w:lvl w:ilvl="3" w:tplc="140A0001" w:tentative="1">
@@ -2100,7 +3072,7 @@
         <w:ind w:left="2880" w:hanging="360"/>
       </w:pPr>
       <w:rPr>
-        <w:rFonts w:hint="default" w:ascii="Symbol" w:hAnsi="Symbol"/>
+        <w:rFonts w:ascii="Symbol" w:hAnsi="Symbol" w:hint="default"/>
       </w:rPr>
     </w:lvl>
     <w:lvl w:ilvl="4" w:tplc="140A0003" w:tentative="1">
@@ -2112,7 +3084,7 @@
         <w:ind w:left="3600" w:hanging="360"/>
       </w:pPr>
       <w:rPr>
-        <w:rFonts w:hint="default" w:ascii="Courier New" w:hAnsi="Courier New" w:cs="Courier New"/>
+        <w:rFonts w:ascii="Courier New" w:hAnsi="Courier New" w:cs="Courier New" w:hint="default"/>
       </w:rPr>
     </w:lvl>
     <w:lvl w:ilvl="5" w:tplc="140A0005" w:tentative="1">
@@ -2124,7 +3096,7 @@
         <w:ind w:left="4320" w:hanging="360"/>
       </w:pPr>
       <w:rPr>
-        <w:rFonts w:hint="default" w:ascii="Wingdings" w:hAnsi="Wingdings"/>
+        <w:rFonts w:ascii="Wingdings" w:hAnsi="Wingdings" w:hint="default"/>
       </w:rPr>
     </w:lvl>
     <w:lvl w:ilvl="6" w:tplc="140A0001" w:tentative="1">
@@ -2136,7 +3108,7 @@
         <w:ind w:left="5040" w:hanging="360"/>
       </w:pPr>
       <w:rPr>
-        <w:rFonts w:hint="default" w:ascii="Symbol" w:hAnsi="Symbol"/>
+        <w:rFonts w:ascii="Symbol" w:hAnsi="Symbol" w:hint="default"/>
       </w:rPr>
     </w:lvl>
     <w:lvl w:ilvl="7" w:tplc="140A0003" w:tentative="1">
@@ -2148,7 +3120,7 @@
         <w:ind w:left="5760" w:hanging="360"/>
       </w:pPr>
       <w:rPr>
-        <w:rFonts w:hint="default" w:ascii="Courier New" w:hAnsi="Courier New" w:cs="Courier New"/>
+        <w:rFonts w:ascii="Courier New" w:hAnsi="Courier New" w:cs="Courier New" w:hint="default"/>
       </w:rPr>
     </w:lvl>
     <w:lvl w:ilvl="8" w:tplc="140A0005" w:tentative="1">
@@ -2160,7 +3132,7 @@
         <w:ind w:left="6480" w:hanging="360"/>
       </w:pPr>
       <w:rPr>
-        <w:rFonts w:hint="default" w:ascii="Wingdings" w:hAnsi="Wingdings"/>
+        <w:rFonts w:ascii="Wingdings" w:hAnsi="Wingdings" w:hint="default"/>
       </w:rPr>
     </w:lvl>
   </w:abstractNum>
@@ -2180,7 +3152,7 @@
         <w:ind w:left="720" w:hanging="360"/>
       </w:pPr>
       <w:rPr>
-        <w:rFonts w:hint="default" w:ascii="Symbol" w:hAnsi="Symbol"/>
+        <w:rFonts w:ascii="Symbol" w:hAnsi="Symbol" w:hint="default"/>
         <w:sz w:val="20"/>
       </w:rPr>
     </w:lvl>
@@ -2196,7 +3168,7 @@
         <w:ind w:left="1440" w:hanging="360"/>
       </w:pPr>
       <w:rPr>
-        <w:rFonts w:hint="default" w:ascii="Courier New" w:hAnsi="Courier New"/>
+        <w:rFonts w:ascii="Courier New" w:hAnsi="Courier New" w:hint="default"/>
         <w:sz w:val="20"/>
       </w:rPr>
     </w:lvl>
@@ -2212,7 +3184,7 @@
         <w:ind w:left="2160" w:hanging="360"/>
       </w:pPr>
       <w:rPr>
-        <w:rFonts w:hint="default" w:ascii="Wingdings" w:hAnsi="Wingdings"/>
+        <w:rFonts w:ascii="Wingdings" w:hAnsi="Wingdings" w:hint="default"/>
         <w:sz w:val="20"/>
       </w:rPr>
     </w:lvl>
@@ -2228,7 +3200,7 @@
         <w:ind w:left="2880" w:hanging="360"/>
       </w:pPr>
       <w:rPr>
-        <w:rFonts w:hint="default" w:ascii="Wingdings" w:hAnsi="Wingdings"/>
+        <w:rFonts w:ascii="Wingdings" w:hAnsi="Wingdings" w:hint="default"/>
         <w:sz w:val="20"/>
       </w:rPr>
     </w:lvl>
@@ -2244,7 +3216,7 @@
         <w:ind w:left="3600" w:hanging="360"/>
       </w:pPr>
       <w:rPr>
-        <w:rFonts w:hint="default" w:ascii="Wingdings" w:hAnsi="Wingdings"/>
+        <w:rFonts w:ascii="Wingdings" w:hAnsi="Wingdings" w:hint="default"/>
         <w:sz w:val="20"/>
       </w:rPr>
     </w:lvl>
@@ -2260,7 +3232,7 @@
         <w:ind w:left="4320" w:hanging="360"/>
       </w:pPr>
       <w:rPr>
-        <w:rFonts w:hint="default" w:ascii="Wingdings" w:hAnsi="Wingdings"/>
+        <w:rFonts w:ascii="Wingdings" w:hAnsi="Wingdings" w:hint="default"/>
         <w:sz w:val="20"/>
       </w:rPr>
     </w:lvl>
@@ -2276,7 +3248,7 @@
         <w:ind w:left="5040" w:hanging="360"/>
       </w:pPr>
       <w:rPr>
-        <w:rFonts w:hint="default" w:ascii="Wingdings" w:hAnsi="Wingdings"/>
+        <w:rFonts w:ascii="Wingdings" w:hAnsi="Wingdings" w:hint="default"/>
         <w:sz w:val="20"/>
       </w:rPr>
     </w:lvl>
@@ -2292,7 +3264,7 @@
         <w:ind w:left="5760" w:hanging="360"/>
       </w:pPr>
       <w:rPr>
-        <w:rFonts w:hint="default" w:ascii="Wingdings" w:hAnsi="Wingdings"/>
+        <w:rFonts w:ascii="Wingdings" w:hAnsi="Wingdings" w:hint="default"/>
         <w:sz w:val="20"/>
       </w:rPr>
     </w:lvl>
@@ -2308,7 +3280,7 @@
         <w:ind w:left="6480" w:hanging="360"/>
       </w:pPr>
       <w:rPr>
-        <w:rFonts w:hint="default" w:ascii="Wingdings" w:hAnsi="Wingdings"/>
+        <w:rFonts w:ascii="Wingdings" w:hAnsi="Wingdings" w:hint="default"/>
         <w:sz w:val="20"/>
       </w:rPr>
     </w:lvl>
@@ -2329,7 +3301,7 @@
         <w:ind w:left="720" w:hanging="360"/>
       </w:pPr>
       <w:rPr>
-        <w:rFonts w:hint="default" w:ascii="Symbol" w:hAnsi="Symbol"/>
+        <w:rFonts w:ascii="Symbol" w:hAnsi="Symbol" w:hint="default"/>
         <w:sz w:val="20"/>
       </w:rPr>
     </w:lvl>
@@ -2345,7 +3317,7 @@
         <w:ind w:left="1440" w:hanging="360"/>
       </w:pPr>
       <w:rPr>
-        <w:rFonts w:hint="default" w:ascii="Courier New" w:hAnsi="Courier New"/>
+        <w:rFonts w:ascii="Courier New" w:hAnsi="Courier New" w:hint="default"/>
         <w:sz w:val="20"/>
       </w:rPr>
     </w:lvl>
@@ -2361,7 +3333,7 @@
         <w:ind w:left="2160" w:hanging="360"/>
       </w:pPr>
       <w:rPr>
-        <w:rFonts w:hint="default" w:ascii="Wingdings" w:hAnsi="Wingdings"/>
+        <w:rFonts w:ascii="Wingdings" w:hAnsi="Wingdings" w:hint="default"/>
         <w:sz w:val="20"/>
       </w:rPr>
     </w:lvl>
@@ -2377,7 +3349,7 @@
         <w:ind w:left="2880" w:hanging="360"/>
       </w:pPr>
       <w:rPr>
-        <w:rFonts w:hint="default" w:ascii="Wingdings" w:hAnsi="Wingdings"/>
+        <w:rFonts w:ascii="Wingdings" w:hAnsi="Wingdings" w:hint="default"/>
         <w:sz w:val="20"/>
       </w:rPr>
     </w:lvl>
@@ -2393,7 +3365,7 @@
         <w:ind w:left="3600" w:hanging="360"/>
       </w:pPr>
       <w:rPr>
-        <w:rFonts w:hint="default" w:ascii="Wingdings" w:hAnsi="Wingdings"/>
+        <w:rFonts w:ascii="Wingdings" w:hAnsi="Wingdings" w:hint="default"/>
         <w:sz w:val="20"/>
       </w:rPr>
     </w:lvl>
@@ -2409,7 +3381,7 @@
         <w:ind w:left="4320" w:hanging="360"/>
       </w:pPr>
       <w:rPr>
-        <w:rFonts w:hint="default" w:ascii="Wingdings" w:hAnsi="Wingdings"/>
+        <w:rFonts w:ascii="Wingdings" w:hAnsi="Wingdings" w:hint="default"/>
         <w:sz w:val="20"/>
       </w:rPr>
     </w:lvl>
@@ -2425,7 +3397,7 @@
         <w:ind w:left="5040" w:hanging="360"/>
       </w:pPr>
       <w:rPr>
-        <w:rFonts w:hint="default" w:ascii="Wingdings" w:hAnsi="Wingdings"/>
+        <w:rFonts w:ascii="Wingdings" w:hAnsi="Wingdings" w:hint="default"/>
         <w:sz w:val="20"/>
       </w:rPr>
     </w:lvl>
@@ -2441,7 +3413,7 @@
         <w:ind w:left="5760" w:hanging="360"/>
       </w:pPr>
       <w:rPr>
-        <w:rFonts w:hint="default" w:ascii="Wingdings" w:hAnsi="Wingdings"/>
+        <w:rFonts w:ascii="Wingdings" w:hAnsi="Wingdings" w:hint="default"/>
         <w:sz w:val="20"/>
       </w:rPr>
     </w:lvl>
@@ -2457,7 +3429,7 @@
         <w:ind w:left="6480" w:hanging="360"/>
       </w:pPr>
       <w:rPr>
-        <w:rFonts w:hint="default" w:ascii="Wingdings" w:hAnsi="Wingdings"/>
+        <w:rFonts w:ascii="Wingdings" w:hAnsi="Wingdings" w:hint="default"/>
         <w:sz w:val="20"/>
       </w:rPr>
     </w:lvl>
@@ -2665,7 +3637,7 @@
         <w:ind w:left="1440" w:hanging="360"/>
       </w:pPr>
       <w:rPr>
-        <w:rFonts w:hint="default" w:ascii="Courier New" w:hAnsi="Courier New"/>
+        <w:rFonts w:ascii="Courier New" w:hAnsi="Courier New" w:hint="default"/>
         <w:sz w:val="20"/>
       </w:rPr>
     </w:lvl>
@@ -2767,7 +3739,7 @@
         <w:ind w:left="720" w:hanging="360"/>
       </w:pPr>
       <w:rPr>
-        <w:rFonts w:hint="default" w:ascii="Symbol" w:hAnsi="Symbol"/>
+        <w:rFonts w:ascii="Symbol" w:hAnsi="Symbol" w:hint="default"/>
       </w:rPr>
     </w:lvl>
     <w:lvl w:ilvl="1" w:tplc="140A0003" w:tentative="1">
@@ -2779,7 +3751,7 @@
         <w:ind w:left="1440" w:hanging="360"/>
       </w:pPr>
       <w:rPr>
-        <w:rFonts w:hint="default" w:ascii="Courier New" w:hAnsi="Courier New" w:cs="Courier New"/>
+        <w:rFonts w:ascii="Courier New" w:hAnsi="Courier New" w:cs="Courier New" w:hint="default"/>
       </w:rPr>
     </w:lvl>
     <w:lvl w:ilvl="2" w:tplc="140A0005" w:tentative="1">
@@ -2791,7 +3763,7 @@
         <w:ind w:left="2160" w:hanging="360"/>
       </w:pPr>
       <w:rPr>
-        <w:rFonts w:hint="default" w:ascii="Wingdings" w:hAnsi="Wingdings"/>
+        <w:rFonts w:ascii="Wingdings" w:hAnsi="Wingdings" w:hint="default"/>
       </w:rPr>
     </w:lvl>
     <w:lvl w:ilvl="3" w:tplc="140A0001" w:tentative="1">
@@ -2803,7 +3775,7 @@
         <w:ind w:left="2880" w:hanging="360"/>
       </w:pPr>
       <w:rPr>
-        <w:rFonts w:hint="default" w:ascii="Symbol" w:hAnsi="Symbol"/>
+        <w:rFonts w:ascii="Symbol" w:hAnsi="Symbol" w:hint="default"/>
       </w:rPr>
     </w:lvl>
     <w:lvl w:ilvl="4" w:tplc="140A0003" w:tentative="1">
@@ -2815,7 +3787,7 @@
         <w:ind w:left="3600" w:hanging="360"/>
       </w:pPr>
       <w:rPr>
-        <w:rFonts w:hint="default" w:ascii="Courier New" w:hAnsi="Courier New" w:cs="Courier New"/>
+        <w:rFonts w:ascii="Courier New" w:hAnsi="Courier New" w:cs="Courier New" w:hint="default"/>
       </w:rPr>
     </w:lvl>
     <w:lvl w:ilvl="5" w:tplc="140A0005" w:tentative="1">
@@ -2827,7 +3799,7 @@
         <w:ind w:left="4320" w:hanging="360"/>
       </w:pPr>
       <w:rPr>
-        <w:rFonts w:hint="default" w:ascii="Wingdings" w:hAnsi="Wingdings"/>
+        <w:rFonts w:ascii="Wingdings" w:hAnsi="Wingdings" w:hint="default"/>
       </w:rPr>
     </w:lvl>
     <w:lvl w:ilvl="6" w:tplc="140A0001" w:tentative="1">
@@ -2839,7 +3811,7 @@
         <w:ind w:left="5040" w:hanging="360"/>
       </w:pPr>
       <w:rPr>
-        <w:rFonts w:hint="default" w:ascii="Symbol" w:hAnsi="Symbol"/>
+        <w:rFonts w:ascii="Symbol" w:hAnsi="Symbol" w:hint="default"/>
       </w:rPr>
     </w:lvl>
     <w:lvl w:ilvl="7" w:tplc="140A0003" w:tentative="1">
@@ -2851,7 +3823,7 @@
         <w:ind w:left="5760" w:hanging="360"/>
       </w:pPr>
       <w:rPr>
-        <w:rFonts w:hint="default" w:ascii="Courier New" w:hAnsi="Courier New" w:cs="Courier New"/>
+        <w:rFonts w:ascii="Courier New" w:hAnsi="Courier New" w:cs="Courier New" w:hint="default"/>
       </w:rPr>
     </w:lvl>
     <w:lvl w:ilvl="8" w:tplc="140A0005" w:tentative="1">
@@ -2863,7 +3835,7 @@
         <w:ind w:left="6480" w:hanging="360"/>
       </w:pPr>
       <w:rPr>
-        <w:rFonts w:hint="default" w:ascii="Wingdings" w:hAnsi="Wingdings"/>
+        <w:rFonts w:ascii="Wingdings" w:hAnsi="Wingdings" w:hint="default"/>
       </w:rPr>
     </w:lvl>
   </w:abstractNum>
@@ -2883,7 +3855,7 @@
         <w:ind w:left="720" w:hanging="360"/>
       </w:pPr>
       <w:rPr>
-        <w:rFonts w:hint="default" w:ascii="Symbol" w:hAnsi="Symbol"/>
+        <w:rFonts w:ascii="Symbol" w:hAnsi="Symbol" w:hint="default"/>
         <w:sz w:val="20"/>
       </w:rPr>
     </w:lvl>
@@ -2899,7 +3871,7 @@
         <w:ind w:left="1440" w:hanging="360"/>
       </w:pPr>
       <w:rPr>
-        <w:rFonts w:hint="default" w:ascii="Courier New" w:hAnsi="Courier New"/>
+        <w:rFonts w:ascii="Courier New" w:hAnsi="Courier New" w:hint="default"/>
         <w:sz w:val="20"/>
       </w:rPr>
     </w:lvl>
@@ -2915,7 +3887,7 @@
         <w:ind w:left="2160" w:hanging="360"/>
       </w:pPr>
       <w:rPr>
-        <w:rFonts w:hint="default" w:ascii="Wingdings" w:hAnsi="Wingdings"/>
+        <w:rFonts w:ascii="Wingdings" w:hAnsi="Wingdings" w:hint="default"/>
         <w:sz w:val="20"/>
       </w:rPr>
     </w:lvl>
@@ -2931,7 +3903,7 @@
         <w:ind w:left="2880" w:hanging="360"/>
       </w:pPr>
       <w:rPr>
-        <w:rFonts w:hint="default" w:ascii="Wingdings" w:hAnsi="Wingdings"/>
+        <w:rFonts w:ascii="Wingdings" w:hAnsi="Wingdings" w:hint="default"/>
         <w:sz w:val="20"/>
       </w:rPr>
     </w:lvl>
@@ -2947,7 +3919,7 @@
         <w:ind w:left="3600" w:hanging="360"/>
       </w:pPr>
       <w:rPr>
-        <w:rFonts w:hint="default" w:ascii="Wingdings" w:hAnsi="Wingdings"/>
+        <w:rFonts w:ascii="Wingdings" w:hAnsi="Wingdings" w:hint="default"/>
         <w:sz w:val="20"/>
       </w:rPr>
     </w:lvl>
@@ -2963,7 +3935,7 @@
         <w:ind w:left="4320" w:hanging="360"/>
       </w:pPr>
       <w:rPr>
-        <w:rFonts w:hint="default" w:ascii="Wingdings" w:hAnsi="Wingdings"/>
+        <w:rFonts w:ascii="Wingdings" w:hAnsi="Wingdings" w:hint="default"/>
         <w:sz w:val="20"/>
       </w:rPr>
     </w:lvl>
@@ -2979,7 +3951,7 @@
         <w:ind w:left="5040" w:hanging="360"/>
       </w:pPr>
       <w:rPr>
-        <w:rFonts w:hint="default" w:ascii="Wingdings" w:hAnsi="Wingdings"/>
+        <w:rFonts w:ascii="Wingdings" w:hAnsi="Wingdings" w:hint="default"/>
         <w:sz w:val="20"/>
       </w:rPr>
     </w:lvl>
@@ -2995,7 +3967,7 @@
         <w:ind w:left="5760" w:hanging="360"/>
       </w:pPr>
       <w:rPr>
-        <w:rFonts w:hint="default" w:ascii="Wingdings" w:hAnsi="Wingdings"/>
+        <w:rFonts w:ascii="Wingdings" w:hAnsi="Wingdings" w:hint="default"/>
         <w:sz w:val="20"/>
       </w:rPr>
     </w:lvl>
@@ -3011,12 +3983,125 @@
         <w:ind w:left="6480" w:hanging="360"/>
       </w:pPr>
       <w:rPr>
-        <w:rFonts w:hint="default" w:ascii="Wingdings" w:hAnsi="Wingdings"/>
+        <w:rFonts w:ascii="Wingdings" w:hAnsi="Wingdings" w:hint="default"/>
         <w:sz w:val="20"/>
       </w:rPr>
     </w:lvl>
   </w:abstractNum>
   <w:abstractNum w:abstractNumId="8" w15:restartNumberingAfterBreak="0">
+    <w:nsid w:val="5D0BEE26"/>
+    <w:multiLevelType w:val="hybridMultilevel"/>
+    <w:tmpl w:val="0CB86936"/>
+    <w:lvl w:ilvl="0" w:tplc="9F609E0A">
+      <w:start w:val="1"/>
+      <w:numFmt w:val="bullet"/>
+      <w:lvlText w:val=""/>
+      <w:lvlJc w:val="left"/>
+      <w:pPr>
+        <w:ind w:left="720" w:hanging="360"/>
+      </w:pPr>
+      <w:rPr>
+        <w:rFonts w:ascii="Symbol" w:hAnsi="Symbol" w:hint="default"/>
+      </w:rPr>
+    </w:lvl>
+    <w:lvl w:ilvl="1" w:tplc="6592FCB8">
+      <w:start w:val="1"/>
+      <w:numFmt w:val="bullet"/>
+      <w:lvlText w:val="o"/>
+      <w:lvlJc w:val="left"/>
+      <w:pPr>
+        <w:ind w:left="1440" w:hanging="360"/>
+      </w:pPr>
+      <w:rPr>
+        <w:rFonts w:ascii="Courier New" w:hAnsi="Courier New" w:hint="default"/>
+      </w:rPr>
+    </w:lvl>
+    <w:lvl w:ilvl="2" w:tplc="C220FEC6">
+      <w:start w:val="1"/>
+      <w:numFmt w:val="bullet"/>
+      <w:lvlText w:val=""/>
+      <w:lvlJc w:val="left"/>
+      <w:pPr>
+        <w:ind w:left="2160" w:hanging="360"/>
+      </w:pPr>
+      <w:rPr>
+        <w:rFonts w:ascii="Wingdings" w:hAnsi="Wingdings" w:hint="default"/>
+      </w:rPr>
+    </w:lvl>
+    <w:lvl w:ilvl="3" w:tplc="75328466">
+      <w:start w:val="1"/>
+      <w:numFmt w:val="bullet"/>
+      <w:lvlText w:val=""/>
+      <w:lvlJc w:val="left"/>
+      <w:pPr>
+        <w:ind w:left="2880" w:hanging="360"/>
+      </w:pPr>
+      <w:rPr>
+        <w:rFonts w:ascii="Symbol" w:hAnsi="Symbol" w:hint="default"/>
+      </w:rPr>
+    </w:lvl>
+    <w:lvl w:ilvl="4" w:tplc="B0B80EF8">
+      <w:start w:val="1"/>
+      <w:numFmt w:val="bullet"/>
+      <w:lvlText w:val="o"/>
+      <w:lvlJc w:val="left"/>
+      <w:pPr>
+        <w:ind w:left="3600" w:hanging="360"/>
+      </w:pPr>
+      <w:rPr>
+        <w:rFonts w:ascii="Courier New" w:hAnsi="Courier New" w:hint="default"/>
+      </w:rPr>
+    </w:lvl>
+    <w:lvl w:ilvl="5" w:tplc="BFCED98E">
+      <w:start w:val="1"/>
+      <w:numFmt w:val="bullet"/>
+      <w:lvlText w:val=""/>
+      <w:lvlJc w:val="left"/>
+      <w:pPr>
+        <w:ind w:left="4320" w:hanging="360"/>
+      </w:pPr>
+      <w:rPr>
+        <w:rFonts w:ascii="Wingdings" w:hAnsi="Wingdings" w:hint="default"/>
+      </w:rPr>
+    </w:lvl>
+    <w:lvl w:ilvl="6" w:tplc="9CA4A69A">
+      <w:start w:val="1"/>
+      <w:numFmt w:val="bullet"/>
+      <w:lvlText w:val=""/>
+      <w:lvlJc w:val="left"/>
+      <w:pPr>
+        <w:ind w:left="5040" w:hanging="360"/>
+      </w:pPr>
+      <w:rPr>
+        <w:rFonts w:ascii="Symbol" w:hAnsi="Symbol" w:hint="default"/>
+      </w:rPr>
+    </w:lvl>
+    <w:lvl w:ilvl="7" w:tplc="DA7EB7FC">
+      <w:start w:val="1"/>
+      <w:numFmt w:val="bullet"/>
+      <w:lvlText w:val="o"/>
+      <w:lvlJc w:val="left"/>
+      <w:pPr>
+        <w:ind w:left="5760" w:hanging="360"/>
+      </w:pPr>
+      <w:rPr>
+        <w:rFonts w:ascii="Courier New" w:hAnsi="Courier New" w:hint="default"/>
+      </w:rPr>
+    </w:lvl>
+    <w:lvl w:ilvl="8" w:tplc="F4CE4330">
+      <w:start w:val="1"/>
+      <w:numFmt w:val="bullet"/>
+      <w:lvlText w:val=""/>
+      <w:lvlJc w:val="left"/>
+      <w:pPr>
+        <w:ind w:left="6480" w:hanging="360"/>
+      </w:pPr>
+      <w:rPr>
+        <w:rFonts w:ascii="Wingdings" w:hAnsi="Wingdings" w:hint="default"/>
+      </w:rPr>
+    </w:lvl>
+  </w:abstractNum>
+  <w:abstractNum w:abstractNumId="9" w15:restartNumberingAfterBreak="0">
     <w:nsid w:val="60D34523"/>
     <w:multiLevelType w:val="multilevel"/>
     <w:tmpl w:val="2ED2BBA2"/>
@@ -3032,7 +4117,7 @@
         <w:ind w:left="720" w:hanging="360"/>
       </w:pPr>
       <w:rPr>
-        <w:rFonts w:hint="default" w:ascii="Symbol" w:hAnsi="Symbol"/>
+        <w:rFonts w:ascii="Symbol" w:hAnsi="Symbol" w:hint="default"/>
         <w:sz w:val="20"/>
       </w:rPr>
     </w:lvl>
@@ -3048,7 +4133,7 @@
         <w:ind w:left="1440" w:hanging="360"/>
       </w:pPr>
       <w:rPr>
-        <w:rFonts w:hint="default" w:ascii="Courier New" w:hAnsi="Courier New"/>
+        <w:rFonts w:ascii="Courier New" w:hAnsi="Courier New" w:hint="default"/>
         <w:sz w:val="20"/>
       </w:rPr>
     </w:lvl>
@@ -3064,7 +4149,7 @@
         <w:ind w:left="2160" w:hanging="360"/>
       </w:pPr>
       <w:rPr>
-        <w:rFonts w:hint="default" w:ascii="Wingdings" w:hAnsi="Wingdings"/>
+        <w:rFonts w:ascii="Wingdings" w:hAnsi="Wingdings" w:hint="default"/>
         <w:sz w:val="20"/>
       </w:rPr>
     </w:lvl>
@@ -3080,7 +4165,7 @@
         <w:ind w:left="2880" w:hanging="360"/>
       </w:pPr>
       <w:rPr>
-        <w:rFonts w:hint="default" w:ascii="Wingdings" w:hAnsi="Wingdings"/>
+        <w:rFonts w:ascii="Wingdings" w:hAnsi="Wingdings" w:hint="default"/>
         <w:sz w:val="20"/>
       </w:rPr>
     </w:lvl>
@@ -3096,7 +4181,7 @@
         <w:ind w:left="3600" w:hanging="360"/>
       </w:pPr>
       <w:rPr>
-        <w:rFonts w:hint="default" w:ascii="Wingdings" w:hAnsi="Wingdings"/>
+        <w:rFonts w:ascii="Wingdings" w:hAnsi="Wingdings" w:hint="default"/>
         <w:sz w:val="20"/>
       </w:rPr>
     </w:lvl>
@@ -3112,7 +4197,7 @@
         <w:ind w:left="4320" w:hanging="360"/>
       </w:pPr>
       <w:rPr>
-        <w:rFonts w:hint="default" w:ascii="Wingdings" w:hAnsi="Wingdings"/>
+        <w:rFonts w:ascii="Wingdings" w:hAnsi="Wingdings" w:hint="default"/>
         <w:sz w:val="20"/>
       </w:rPr>
     </w:lvl>
@@ -3128,7 +4213,7 @@
         <w:ind w:left="5040" w:hanging="360"/>
       </w:pPr>
       <w:rPr>
-        <w:rFonts w:hint="default" w:ascii="Wingdings" w:hAnsi="Wingdings"/>
+        <w:rFonts w:ascii="Wingdings" w:hAnsi="Wingdings" w:hint="default"/>
         <w:sz w:val="20"/>
       </w:rPr>
     </w:lvl>
@@ -3144,7 +4229,7 @@
         <w:ind w:left="5760" w:hanging="360"/>
       </w:pPr>
       <w:rPr>
-        <w:rFonts w:hint="default" w:ascii="Wingdings" w:hAnsi="Wingdings"/>
+        <w:rFonts w:ascii="Wingdings" w:hAnsi="Wingdings" w:hint="default"/>
         <w:sz w:val="20"/>
       </w:rPr>
     </w:lvl>
@@ -3160,12 +4245,12 @@
         <w:ind w:left="6480" w:hanging="360"/>
       </w:pPr>
       <w:rPr>
-        <w:rFonts w:hint="default" w:ascii="Wingdings" w:hAnsi="Wingdings"/>
+        <w:rFonts w:ascii="Wingdings" w:hAnsi="Wingdings" w:hint="default"/>
         <w:sz w:val="20"/>
       </w:rPr>
     </w:lvl>
   </w:abstractNum>
-  <w:abstractNum w:abstractNumId="9" w15:restartNumberingAfterBreak="0">
+  <w:abstractNum w:abstractNumId="10" w15:restartNumberingAfterBreak="0">
     <w:nsid w:val="65067144"/>
     <w:multiLevelType w:val="multilevel"/>
     <w:tmpl w:val="096CBD6A"/>
@@ -3181,7 +4266,7 @@
         <w:ind w:left="720" w:hanging="360"/>
       </w:pPr>
       <w:rPr>
-        <w:rFonts w:hint="default" w:ascii="Symbol" w:hAnsi="Symbol"/>
+        <w:rFonts w:ascii="Symbol" w:hAnsi="Symbol" w:hint="default"/>
         <w:sz w:val="20"/>
       </w:rPr>
     </w:lvl>
@@ -3197,7 +4282,7 @@
         <w:ind w:left="1440" w:hanging="360"/>
       </w:pPr>
       <w:rPr>
-        <w:rFonts w:hint="default" w:ascii="Courier New" w:hAnsi="Courier New"/>
+        <w:rFonts w:ascii="Courier New" w:hAnsi="Courier New" w:hint="default"/>
         <w:sz w:val="20"/>
       </w:rPr>
     </w:lvl>
@@ -3213,7 +4298,7 @@
         <w:ind w:left="2160" w:hanging="360"/>
       </w:pPr>
       <w:rPr>
-        <w:rFonts w:hint="default" w:ascii="Wingdings" w:hAnsi="Wingdings"/>
+        <w:rFonts w:ascii="Wingdings" w:hAnsi="Wingdings" w:hint="default"/>
         <w:sz w:val="20"/>
       </w:rPr>
     </w:lvl>
@@ -3229,7 +4314,7 @@
         <w:ind w:left="2880" w:hanging="360"/>
       </w:pPr>
       <w:rPr>
-        <w:rFonts w:hint="default" w:ascii="Wingdings" w:hAnsi="Wingdings"/>
+        <w:rFonts w:ascii="Wingdings" w:hAnsi="Wingdings" w:hint="default"/>
         <w:sz w:val="20"/>
       </w:rPr>
     </w:lvl>
@@ -3245,7 +4330,7 @@
         <w:ind w:left="3600" w:hanging="360"/>
       </w:pPr>
       <w:rPr>
-        <w:rFonts w:hint="default" w:ascii="Wingdings" w:hAnsi="Wingdings"/>
+        <w:rFonts w:ascii="Wingdings" w:hAnsi="Wingdings" w:hint="default"/>
         <w:sz w:val="20"/>
       </w:rPr>
     </w:lvl>
@@ -3261,7 +4346,7 @@
         <w:ind w:left="4320" w:hanging="360"/>
       </w:pPr>
       <w:rPr>
-        <w:rFonts w:hint="default" w:ascii="Wingdings" w:hAnsi="Wingdings"/>
+        <w:rFonts w:ascii="Wingdings" w:hAnsi="Wingdings" w:hint="default"/>
         <w:sz w:val="20"/>
       </w:rPr>
     </w:lvl>
@@ -3277,7 +4362,7 @@
         <w:ind w:left="5040" w:hanging="360"/>
       </w:pPr>
       <w:rPr>
-        <w:rFonts w:hint="default" w:ascii="Wingdings" w:hAnsi="Wingdings"/>
+        <w:rFonts w:ascii="Wingdings" w:hAnsi="Wingdings" w:hint="default"/>
         <w:sz w:val="20"/>
       </w:rPr>
     </w:lvl>
@@ -3293,7 +4378,7 @@
         <w:ind w:left="5760" w:hanging="360"/>
       </w:pPr>
       <w:rPr>
-        <w:rFonts w:hint="default" w:ascii="Wingdings" w:hAnsi="Wingdings"/>
+        <w:rFonts w:ascii="Wingdings" w:hAnsi="Wingdings" w:hint="default"/>
         <w:sz w:val="20"/>
       </w:rPr>
     </w:lvl>
@@ -3309,12 +4394,12 @@
         <w:ind w:left="6480" w:hanging="360"/>
       </w:pPr>
       <w:rPr>
-        <w:rFonts w:hint="default" w:ascii="Wingdings" w:hAnsi="Wingdings"/>
+        <w:rFonts w:ascii="Wingdings" w:hAnsi="Wingdings" w:hint="default"/>
         <w:sz w:val="20"/>
       </w:rPr>
     </w:lvl>
   </w:abstractNum>
-  <w:abstractNum w:abstractNumId="10" w15:restartNumberingAfterBreak="0">
+  <w:abstractNum w:abstractNumId="11" w15:restartNumberingAfterBreak="0">
     <w:nsid w:val="704D14F0"/>
     <w:multiLevelType w:val="multilevel"/>
     <w:tmpl w:val="BE78BBDE"/>
@@ -3342,7 +4427,7 @@
         <w:ind w:left="1440" w:hanging="360"/>
       </w:pPr>
       <w:rPr>
-        <w:rFonts w:hint="default" w:ascii="Courier New" w:hAnsi="Courier New"/>
+        <w:rFonts w:ascii="Courier New" w:hAnsi="Courier New" w:hint="default"/>
         <w:sz w:val="20"/>
       </w:rPr>
     </w:lvl>
@@ -3431,7 +4516,93 @@
       </w:pPr>
     </w:lvl>
   </w:abstractNum>
-  <w:abstractNum w:abstractNumId="11" w15:restartNumberingAfterBreak="0">
+  <w:abstractNum w:abstractNumId="12" w15:restartNumberingAfterBreak="0">
+    <w:nsid w:val="72DBADB2"/>
+    <w:multiLevelType w:val="hybridMultilevel"/>
+    <w:tmpl w:val="AE4AF9D6"/>
+    <w:lvl w:ilvl="0" w:tplc="4BD0D6BC">
+      <w:start w:val="1"/>
+      <w:numFmt w:val="decimal"/>
+      <w:lvlText w:val="%1."/>
+      <w:lvlJc w:val="left"/>
+      <w:pPr>
+        <w:ind w:left="720" w:hanging="360"/>
+      </w:pPr>
+    </w:lvl>
+    <w:lvl w:ilvl="1" w:tplc="A176DC64">
+      <w:start w:val="1"/>
+      <w:numFmt w:val="lowerLetter"/>
+      <w:lvlText w:val="%2."/>
+      <w:lvlJc w:val="left"/>
+      <w:pPr>
+        <w:ind w:left="1440" w:hanging="360"/>
+      </w:pPr>
+    </w:lvl>
+    <w:lvl w:ilvl="2" w:tplc="94B66EAA">
+      <w:start w:val="1"/>
+      <w:numFmt w:val="lowerRoman"/>
+      <w:lvlText w:val="%3."/>
+      <w:lvlJc w:val="right"/>
+      <w:pPr>
+        <w:ind w:left="2160" w:hanging="180"/>
+      </w:pPr>
+    </w:lvl>
+    <w:lvl w:ilvl="3" w:tplc="D5C4427A">
+      <w:start w:val="1"/>
+      <w:numFmt w:val="decimal"/>
+      <w:lvlText w:val="%4."/>
+      <w:lvlJc w:val="left"/>
+      <w:pPr>
+        <w:ind w:left="2880" w:hanging="360"/>
+      </w:pPr>
+    </w:lvl>
+    <w:lvl w:ilvl="4" w:tplc="D616A3F4">
+      <w:start w:val="1"/>
+      <w:numFmt w:val="lowerLetter"/>
+      <w:lvlText w:val="%5."/>
+      <w:lvlJc w:val="left"/>
+      <w:pPr>
+        <w:ind w:left="3600" w:hanging="360"/>
+      </w:pPr>
+    </w:lvl>
+    <w:lvl w:ilvl="5" w:tplc="569E867C">
+      <w:start w:val="1"/>
+      <w:numFmt w:val="lowerRoman"/>
+      <w:lvlText w:val="%6."/>
+      <w:lvlJc w:val="right"/>
+      <w:pPr>
+        <w:ind w:left="4320" w:hanging="180"/>
+      </w:pPr>
+    </w:lvl>
+    <w:lvl w:ilvl="6" w:tplc="BF9AF4F6">
+      <w:start w:val="1"/>
+      <w:numFmt w:val="decimal"/>
+      <w:lvlText w:val="%7."/>
+      <w:lvlJc w:val="left"/>
+      <w:pPr>
+        <w:ind w:left="5040" w:hanging="360"/>
+      </w:pPr>
+    </w:lvl>
+    <w:lvl w:ilvl="7" w:tplc="1502519A">
+      <w:start w:val="1"/>
+      <w:numFmt w:val="lowerLetter"/>
+      <w:lvlText w:val="%8."/>
+      <w:lvlJc w:val="left"/>
+      <w:pPr>
+        <w:ind w:left="5760" w:hanging="360"/>
+      </w:pPr>
+    </w:lvl>
+    <w:lvl w:ilvl="8" w:tplc="164A66E4">
+      <w:start w:val="1"/>
+      <w:numFmt w:val="lowerRoman"/>
+      <w:lvlText w:val="%9."/>
+      <w:lvlJc w:val="right"/>
+      <w:pPr>
+        <w:ind w:left="6480" w:hanging="180"/>
+      </w:pPr>
+    </w:lvl>
+  </w:abstractNum>
+  <w:abstractNum w:abstractNumId="13" w15:restartNumberingAfterBreak="0">
     <w:nsid w:val="7F5E15A1"/>
     <w:multiLevelType w:val="hybridMultilevel"/>
     <w:tmpl w:val="D16250E2"/>
@@ -3444,7 +4615,7 @@
         <w:ind w:left="720" w:hanging="360"/>
       </w:pPr>
       <w:rPr>
-        <w:rFonts w:hint="default" w:ascii="Symbol" w:hAnsi="Symbol"/>
+        <w:rFonts w:ascii="Symbol" w:hAnsi="Symbol" w:hint="default"/>
       </w:rPr>
     </w:lvl>
     <w:lvl w:ilvl="1" w:tplc="140A0003" w:tentative="1">
@@ -3456,7 +4627,7 @@
         <w:ind w:left="1440" w:hanging="360"/>
       </w:pPr>
       <w:rPr>
-        <w:rFonts w:hint="default" w:ascii="Courier New" w:hAnsi="Courier New" w:cs="Courier New"/>
+        <w:rFonts w:ascii="Courier New" w:hAnsi="Courier New" w:cs="Courier New" w:hint="default"/>
       </w:rPr>
     </w:lvl>
     <w:lvl w:ilvl="2" w:tplc="140A0005" w:tentative="1">
@@ -3468,7 +4639,7 @@
         <w:ind w:left="2160" w:hanging="360"/>
       </w:pPr>
       <w:rPr>
-        <w:rFonts w:hint="default" w:ascii="Wingdings" w:hAnsi="Wingdings"/>
+        <w:rFonts w:ascii="Wingdings" w:hAnsi="Wingdings" w:hint="default"/>
       </w:rPr>
     </w:lvl>
     <w:lvl w:ilvl="3" w:tplc="140A0001" w:tentative="1">
@@ -3480,7 +4651,7 @@
         <w:ind w:left="2880" w:hanging="360"/>
       </w:pPr>
       <w:rPr>
-        <w:rFonts w:hint="default" w:ascii="Symbol" w:hAnsi="Symbol"/>
+        <w:rFonts w:ascii="Symbol" w:hAnsi="Symbol" w:hint="default"/>
       </w:rPr>
     </w:lvl>
     <w:lvl w:ilvl="4" w:tplc="140A0003" w:tentative="1">
@@ -3492,7 +4663,7 @@
         <w:ind w:left="3600" w:hanging="360"/>
       </w:pPr>
       <w:rPr>
-        <w:rFonts w:hint="default" w:ascii="Courier New" w:hAnsi="Courier New" w:cs="Courier New"/>
+        <w:rFonts w:ascii="Courier New" w:hAnsi="Courier New" w:cs="Courier New" w:hint="default"/>
       </w:rPr>
     </w:lvl>
     <w:lvl w:ilvl="5" w:tplc="140A0005" w:tentative="1">
@@ -3504,7 +4675,7 @@
         <w:ind w:left="4320" w:hanging="360"/>
       </w:pPr>
       <w:rPr>
-        <w:rFonts w:hint="default" w:ascii="Wingdings" w:hAnsi="Wingdings"/>
+        <w:rFonts w:ascii="Wingdings" w:hAnsi="Wingdings" w:hint="default"/>
       </w:rPr>
     </w:lvl>
     <w:lvl w:ilvl="6" w:tplc="140A0001" w:tentative="1">
@@ -3516,7 +4687,7 @@
         <w:ind w:left="5040" w:hanging="360"/>
       </w:pPr>
       <w:rPr>
-        <w:rFonts w:hint="default" w:ascii="Symbol" w:hAnsi="Symbol"/>
+        <w:rFonts w:ascii="Symbol" w:hAnsi="Symbol" w:hint="default"/>
       </w:rPr>
     </w:lvl>
     <w:lvl w:ilvl="7" w:tplc="140A0003" w:tentative="1">
@@ -3528,7 +4699,7 @@
         <w:ind w:left="5760" w:hanging="360"/>
       </w:pPr>
       <w:rPr>
-        <w:rFonts w:hint="default" w:ascii="Courier New" w:hAnsi="Courier New" w:cs="Courier New"/>
+        <w:rFonts w:ascii="Courier New" w:hAnsi="Courier New" w:cs="Courier New" w:hint="default"/>
       </w:rPr>
     </w:lvl>
     <w:lvl w:ilvl="8" w:tplc="140A0005" w:tentative="1">
@@ -3540,55 +4711,61 @@
         <w:ind w:left="6480" w:hanging="360"/>
       </w:pPr>
       <w:rPr>
-        <w:rFonts w:hint="default" w:ascii="Wingdings" w:hAnsi="Wingdings"/>
+        <w:rFonts w:ascii="Wingdings" w:hAnsi="Wingdings" w:hint="default"/>
       </w:rPr>
     </w:lvl>
   </w:abstractNum>
-  <w:num w:numId="1" w16cid:durableId="1709866815">
+  <w:num w:numId="1" w16cid:durableId="584537043">
     <w:abstractNumId w:val="8"/>
   </w:num>
-  <w:num w:numId="2" w16cid:durableId="238558373">
+  <w:num w:numId="2" w16cid:durableId="110326727">
+    <w:abstractNumId w:val="12"/>
+  </w:num>
+  <w:num w:numId="3" w16cid:durableId="1709866815">
     <w:abstractNumId w:val="9"/>
   </w:num>
-  <w:num w:numId="3" w16cid:durableId="523401619">
+  <w:num w:numId="4" w16cid:durableId="238558373">
+    <w:abstractNumId w:val="10"/>
+  </w:num>
+  <w:num w:numId="5" w16cid:durableId="523401619">
     <w:abstractNumId w:val="2"/>
   </w:num>
-  <w:num w:numId="4" w16cid:durableId="1387266248">
+  <w:num w:numId="6" w16cid:durableId="1387266248">
     <w:abstractNumId w:val="7"/>
   </w:num>
-  <w:num w:numId="5" w16cid:durableId="302543211">
+  <w:num w:numId="7" w16cid:durableId="302543211">
     <w:abstractNumId w:val="1"/>
   </w:num>
-  <w:num w:numId="6" w16cid:durableId="1802379754">
-    <w:abstractNumId w:val="10"/>
+  <w:num w:numId="8" w16cid:durableId="1802379754">
+    <w:abstractNumId w:val="11"/>
   </w:num>
-  <w:num w:numId="7" w16cid:durableId="1620841245">
+  <w:num w:numId="9" w16cid:durableId="1620841245">
     <w:abstractNumId w:val="5"/>
   </w:num>
-  <w:num w:numId="8" w16cid:durableId="1084838446">
+  <w:num w:numId="10" w16cid:durableId="1084838446">
     <w:abstractNumId w:val="4"/>
   </w:num>
-  <w:num w:numId="9" w16cid:durableId="1803496332">
+  <w:num w:numId="11" w16cid:durableId="1803496332">
     <w:abstractNumId w:val="6"/>
   </w:num>
-  <w:num w:numId="10" w16cid:durableId="1668709520">
-    <w:abstractNumId w:val="11"/>
+  <w:num w:numId="12" w16cid:durableId="1668709520">
+    <w:abstractNumId w:val="13"/>
   </w:num>
-  <w:num w:numId="11" w16cid:durableId="1519153035">
+  <w:num w:numId="13" w16cid:durableId="1519153035">
     <w:abstractNumId w:val="0"/>
   </w:num>
-  <w:num w:numId="12" w16cid:durableId="2030175690">
+  <w:num w:numId="14" w16cid:durableId="2030175690">
     <w:abstractNumId w:val="3"/>
   </w:num>
 </w:numbering>
 </file>
 
 <file path=word/styles.xml><?xml version="1.0" encoding="utf-8"?>
-<w:styles xmlns:wp14="http://schemas.microsoft.com/office/word/2010/wordprocessingDrawing" xmlns:mc="http://schemas.openxmlformats.org/markup-compatibility/2006" xmlns:r="http://schemas.openxmlformats.org/officeDocument/2006/relationships" xmlns:w="http://schemas.openxmlformats.org/wordprocessingml/2006/main" xmlns:w14="http://schemas.microsoft.com/office/word/2010/wordml" xmlns:w15="http://schemas.microsoft.com/office/word/2012/wordml" xmlns:w16cex="http://schemas.microsoft.com/office/word/2018/wordml/cex" xmlns:w16cid="http://schemas.microsoft.com/office/word/2016/wordml/cid" xmlns:w16="http://schemas.microsoft.com/office/word/2018/wordml" xmlns:w16du="http://schemas.microsoft.com/office/word/2023/wordml/word16du" xmlns:w16sdtdh="http://schemas.microsoft.com/office/word/2020/wordml/sdtdatahash" xmlns:w16sdtfl="http://schemas.microsoft.com/office/word/2024/wordml/sdtformatlock" xmlns:w16se="http://schemas.microsoft.com/office/word/2015/wordml/symex" mc:Ignorable="w14 w15 w16se w16cid w16 w16cex w16sdtdh w16sdtfl w16du wp14">
+<w:styles xmlns:mc="http://schemas.openxmlformats.org/markup-compatibility/2006" xmlns:r="http://schemas.openxmlformats.org/officeDocument/2006/relationships" xmlns:w="http://schemas.openxmlformats.org/wordprocessingml/2006/main" xmlns:w14="http://schemas.microsoft.com/office/word/2010/wordml" xmlns:w15="http://schemas.microsoft.com/office/word/2012/wordml" xmlns:w16cex="http://schemas.microsoft.com/office/word/2018/wordml/cex" xmlns:w16cid="http://schemas.microsoft.com/office/word/2016/wordml/cid" xmlns:w16="http://schemas.microsoft.com/office/word/2018/wordml" xmlns:w16du="http://schemas.microsoft.com/office/word/2023/wordml/word16du" xmlns:w16sdtdh="http://schemas.microsoft.com/office/word/2020/wordml/sdtdatahash" xmlns:w16sdtfl="http://schemas.microsoft.com/office/word/2024/wordml/sdtformatlock" xmlns:w16se="http://schemas.microsoft.com/office/word/2015/wordml/symex" mc:Ignorable="w14 w15 w16se w16cid w16 w16cex w16sdtdh w16sdtfl w16du">
   <w:docDefaults>
     <w:rPrDefault>
       <w:rPr>
-        <w:rFonts w:asciiTheme="minorHAnsi" w:hAnsiTheme="minorHAnsi" w:eastAsiaTheme="minorHAnsi" w:cstheme="minorBidi"/>
+        <w:rFonts w:asciiTheme="minorHAnsi" w:eastAsiaTheme="minorHAnsi" w:hAnsiTheme="minorHAnsi" w:cstheme="minorBidi"/>
         <w:kern w:val="2"/>
         <w:sz w:val="24"/>
         <w:szCs w:val="24"/>
@@ -3605,14 +4782,14 @@
   <w:latentStyles w:defLockedState="0" w:defUIPriority="99" w:defSemiHidden="0" w:defUnhideWhenUsed="0" w:defQFormat="0" w:count="376">
     <w:lsdException w:name="Normal" w:uiPriority="0" w:qFormat="1"/>
     <w:lsdException w:name="heading 1" w:uiPriority="9" w:qFormat="1"/>
-    <w:lsdException w:name="heading 2" w:uiPriority="9" w:semiHidden="1" w:unhideWhenUsed="1" w:qFormat="1"/>
-    <w:lsdException w:name="heading 3" w:uiPriority="9" w:semiHidden="1" w:unhideWhenUsed="1" w:qFormat="1"/>
-    <w:lsdException w:name="heading 4" w:uiPriority="9" w:semiHidden="1" w:unhideWhenUsed="1" w:qFormat="1"/>
-    <w:lsdException w:name="heading 5" w:uiPriority="9" w:semiHidden="1" w:unhideWhenUsed="1" w:qFormat="1"/>
-    <w:lsdException w:name="heading 6" w:uiPriority="9" w:semiHidden="1" w:unhideWhenUsed="1" w:qFormat="1"/>
-    <w:lsdException w:name="heading 7" w:uiPriority="9" w:semiHidden="1" w:unhideWhenUsed="1" w:qFormat="1"/>
-    <w:lsdException w:name="heading 8" w:uiPriority="9" w:semiHidden="1" w:unhideWhenUsed="1" w:qFormat="1"/>
-    <w:lsdException w:name="heading 9" w:uiPriority="9" w:semiHidden="1" w:unhideWhenUsed="1" w:qFormat="1"/>
+    <w:lsdException w:name="heading 2" w:semiHidden="1" w:uiPriority="9" w:unhideWhenUsed="1" w:qFormat="1"/>
+    <w:lsdException w:name="heading 3" w:semiHidden="1" w:uiPriority="9" w:unhideWhenUsed="1" w:qFormat="1"/>
+    <w:lsdException w:name="heading 4" w:semiHidden="1" w:uiPriority="9" w:unhideWhenUsed="1" w:qFormat="1"/>
+    <w:lsdException w:name="heading 5" w:semiHidden="1" w:uiPriority="9" w:unhideWhenUsed="1" w:qFormat="1"/>
+    <w:lsdException w:name="heading 6" w:semiHidden="1" w:uiPriority="9" w:unhideWhenUsed="1" w:qFormat="1"/>
+    <w:lsdException w:name="heading 7" w:semiHidden="1" w:uiPriority="9" w:unhideWhenUsed="1" w:qFormat="1"/>
+    <w:lsdException w:name="heading 8" w:semiHidden="1" w:uiPriority="9" w:unhideWhenUsed="1" w:qFormat="1"/>
+    <w:lsdException w:name="heading 9" w:semiHidden="1" w:uiPriority="9" w:unhideWhenUsed="1" w:qFormat="1"/>
     <w:lsdException w:name="index 1" w:semiHidden="1" w:unhideWhenUsed="1"/>
     <w:lsdException w:name="index 2" w:semiHidden="1" w:unhideWhenUsed="1"/>
     <w:lsdException w:name="index 3" w:semiHidden="1" w:unhideWhenUsed="1"/>
@@ -3622,22 +4799,22 @@
     <w:lsdException w:name="index 7" w:semiHidden="1" w:unhideWhenUsed="1"/>
     <w:lsdException w:name="index 8" w:semiHidden="1" w:unhideWhenUsed="1"/>
     <w:lsdException w:name="index 9" w:semiHidden="1" w:unhideWhenUsed="1"/>
-    <w:lsdException w:name="toc 1" w:uiPriority="39" w:semiHidden="1" w:unhideWhenUsed="1"/>
-    <w:lsdException w:name="toc 2" w:uiPriority="39" w:semiHidden="1" w:unhideWhenUsed="1"/>
-    <w:lsdException w:name="toc 3" w:uiPriority="39" w:semiHidden="1" w:unhideWhenUsed="1"/>
-    <w:lsdException w:name="toc 4" w:uiPriority="39" w:semiHidden="1" w:unhideWhenUsed="1"/>
-    <w:lsdException w:name="toc 5" w:uiPriority="39" w:semiHidden="1" w:unhideWhenUsed="1"/>
-    <w:lsdException w:name="toc 6" w:uiPriority="39" w:semiHidden="1" w:unhideWhenUsed="1"/>
-    <w:lsdException w:name="toc 7" w:uiPriority="39" w:semiHidden="1" w:unhideWhenUsed="1"/>
-    <w:lsdException w:name="toc 8" w:uiPriority="39" w:semiHidden="1" w:unhideWhenUsed="1"/>
-    <w:lsdException w:name="toc 9" w:uiPriority="39" w:semiHidden="1" w:unhideWhenUsed="1"/>
+    <w:lsdException w:name="toc 1" w:semiHidden="1" w:uiPriority="39" w:unhideWhenUsed="1"/>
+    <w:lsdException w:name="toc 2" w:semiHidden="1" w:uiPriority="39" w:unhideWhenUsed="1"/>
+    <w:lsdException w:name="toc 3" w:semiHidden="1" w:uiPriority="39" w:unhideWhenUsed="1"/>
+    <w:lsdException w:name="toc 4" w:semiHidden="1" w:uiPriority="39" w:unhideWhenUsed="1"/>
+    <w:lsdException w:name="toc 5" w:semiHidden="1" w:uiPriority="39" w:unhideWhenUsed="1"/>
+    <w:lsdException w:name="toc 6" w:semiHidden="1" w:uiPriority="39" w:unhideWhenUsed="1"/>
+    <w:lsdException w:name="toc 7" w:semiHidden="1" w:uiPriority="39" w:unhideWhenUsed="1"/>
+    <w:lsdException w:name="toc 8" w:semiHidden="1" w:uiPriority="39" w:unhideWhenUsed="1"/>
+    <w:lsdException w:name="toc 9" w:semiHidden="1" w:uiPriority="39" w:unhideWhenUsed="1"/>
     <w:lsdException w:name="Normal Indent" w:semiHidden="1" w:unhideWhenUsed="1"/>
     <w:lsdException w:name="footnote text" w:semiHidden="1" w:unhideWhenUsed="1"/>
     <w:lsdException w:name="annotation text" w:semiHidden="1" w:unhideWhenUsed="1"/>
     <w:lsdException w:name="header" w:semiHidden="1" w:unhideWhenUsed="1"/>
     <w:lsdException w:name="footer" w:semiHidden="1" w:unhideWhenUsed="1"/>
     <w:lsdException w:name="index heading" w:semiHidden="1" w:unhideWhenUsed="1"/>
-    <w:lsdException w:name="caption" w:uiPriority="35" w:semiHidden="1" w:unhideWhenUsed="1" w:qFormat="1"/>
+    <w:lsdException w:name="caption" w:semiHidden="1" w:uiPriority="35" w:unhideWhenUsed="1" w:qFormat="1"/>
     <w:lsdException w:name="table of figures" w:semiHidden="1" w:unhideWhenUsed="1"/>
     <w:lsdException w:name="envelope address" w:semiHidden="1" w:unhideWhenUsed="1"/>
     <w:lsdException w:name="envelope return" w:semiHidden="1" w:unhideWhenUsed="1"/>
@@ -3668,7 +4845,7 @@
     <w:lsdException w:name="Title" w:uiPriority="10" w:qFormat="1"/>
     <w:lsdException w:name="Closing" w:semiHidden="1" w:unhideWhenUsed="1"/>
     <w:lsdException w:name="Signature" w:semiHidden="1" w:unhideWhenUsed="1"/>
-    <w:lsdException w:name="Default Paragraph Font" w:uiPriority="1" w:semiHidden="1" w:unhideWhenUsed="1"/>
+    <w:lsdException w:name="Default Paragraph Font" w:semiHidden="1" w:uiPriority="1" w:unhideWhenUsed="1"/>
     <w:lsdException w:name="Body Text" w:semiHidden="1" w:unhideWhenUsed="1"/>
     <w:lsdException w:name="Body Text Indent" w:semiHidden="1" w:unhideWhenUsed="1"/>
     <w:lsdException w:name="List Continue" w:semiHidden="1" w:unhideWhenUsed="1"/>
@@ -3868,8 +5045,8 @@
     <w:lsdException w:name="Subtle Reference" w:uiPriority="31" w:qFormat="1"/>
     <w:lsdException w:name="Intense Reference" w:uiPriority="32" w:qFormat="1"/>
     <w:lsdException w:name="Book Title" w:uiPriority="33" w:qFormat="1"/>
-    <w:lsdException w:name="Bibliography" w:uiPriority="37" w:semiHidden="1" w:unhideWhenUsed="1"/>
-    <w:lsdException w:name="TOC Heading" w:uiPriority="39" w:semiHidden="1" w:unhideWhenUsed="1" w:qFormat="1"/>
+    <w:lsdException w:name="Bibliography" w:semiHidden="1" w:uiPriority="37" w:unhideWhenUsed="1"/>
+    <w:lsdException w:name="TOC Heading" w:semiHidden="1" w:uiPriority="39" w:unhideWhenUsed="1" w:qFormat="1"/>
     <w:lsdException w:name="Plain Table 1" w:uiPriority="41"/>
     <w:lsdException w:name="Plain Table 2" w:uiPriority="42"/>
     <w:lsdException w:name="Plain Table 3" w:uiPriority="43"/>
@@ -3980,7 +5157,7 @@
     <w:lsdException w:name="Unresolved Mention" w:semiHidden="1" w:unhideWhenUsed="1"/>
     <w:lsdException w:name="Smart Link" w:semiHidden="1" w:unhideWhenUsed="1"/>
   </w:latentStyles>
-  <w:style w:type="paragraph" w:styleId="Normal" w:default="1">
+  <w:style w:type="paragraph" w:default="1" w:styleId="Normal">
     <w:name w:val="Normal"/>
     <w:qFormat/>
   </w:style>
@@ -3999,7 +5176,7 @@
       <w:outlineLvl w:val="0"/>
     </w:pPr>
     <w:rPr>
-      <w:rFonts w:asciiTheme="majorHAnsi" w:hAnsiTheme="majorHAnsi" w:eastAsiaTheme="majorEastAsia" w:cstheme="majorBidi"/>
+      <w:rFonts w:asciiTheme="majorHAnsi" w:eastAsiaTheme="majorEastAsia" w:hAnsiTheme="majorHAnsi" w:cstheme="majorBidi"/>
       <w:color w:val="0F4761" w:themeColor="accent1" w:themeShade="BF"/>
       <w:sz w:val="40"/>
       <w:szCs w:val="40"/>
@@ -4021,7 +5198,7 @@
       <w:outlineLvl w:val="1"/>
     </w:pPr>
     <w:rPr>
-      <w:rFonts w:asciiTheme="majorHAnsi" w:hAnsiTheme="majorHAnsi" w:eastAsiaTheme="majorEastAsia" w:cstheme="majorBidi"/>
+      <w:rFonts w:asciiTheme="majorHAnsi" w:eastAsiaTheme="majorEastAsia" w:hAnsiTheme="majorHAnsi" w:cstheme="majorBidi"/>
       <w:color w:val="0F4761" w:themeColor="accent1" w:themeShade="BF"/>
       <w:sz w:val="32"/>
       <w:szCs w:val="32"/>
@@ -4182,13 +5359,13 @@
       <w:color w:val="272727" w:themeColor="text1" w:themeTint="D8"/>
     </w:rPr>
   </w:style>
-  <w:style w:type="character" w:styleId="DefaultParagraphFont" w:default="1">
+  <w:style w:type="character" w:default="1" w:styleId="DefaultParagraphFont">
     <w:name w:val="Default Paragraph Font"/>
     <w:uiPriority w:val="1"/>
     <w:semiHidden/>
     <w:unhideWhenUsed/>
   </w:style>
-  <w:style w:type="table" w:styleId="TableNormal" w:default="1">
+  <w:style w:type="table" w:default="1" w:styleId="TableNormal">
     <w:name w:val="Normal Table"/>
     <w:uiPriority w:val="99"/>
     <w:semiHidden/>
@@ -4203,39 +5380,39 @@
       </w:tblCellMar>
     </w:tblPr>
   </w:style>
-  <w:style w:type="numbering" w:styleId="NoList" w:default="1">
+  <w:style w:type="numbering" w:default="1" w:styleId="NoList">
     <w:name w:val="No List"/>
     <w:uiPriority w:val="99"/>
     <w:semiHidden/>
     <w:unhideWhenUsed/>
   </w:style>
-  <w:style w:type="character" w:styleId="Heading1Char" w:customStyle="1">
+  <w:style w:type="character" w:customStyle="1" w:styleId="Heading1Char">
     <w:name w:val="Heading 1 Char"/>
     <w:basedOn w:val="DefaultParagraphFont"/>
     <w:link w:val="Heading1"/>
     <w:uiPriority w:val="9"/>
     <w:rsid w:val="008558FF"/>
     <w:rPr>
-      <w:rFonts w:asciiTheme="majorHAnsi" w:hAnsiTheme="majorHAnsi" w:eastAsiaTheme="majorEastAsia" w:cstheme="majorBidi"/>
+      <w:rFonts w:asciiTheme="majorHAnsi" w:eastAsiaTheme="majorEastAsia" w:hAnsiTheme="majorHAnsi" w:cstheme="majorBidi"/>
       <w:color w:val="0F4761" w:themeColor="accent1" w:themeShade="BF"/>
       <w:sz w:val="40"/>
       <w:szCs w:val="40"/>
     </w:rPr>
   </w:style>
-  <w:style w:type="character" w:styleId="Heading2Char" w:customStyle="1">
+  <w:style w:type="character" w:customStyle="1" w:styleId="Heading2Char">
     <w:name w:val="Heading 2 Char"/>
     <w:basedOn w:val="DefaultParagraphFont"/>
     <w:link w:val="Heading2"/>
     <w:uiPriority w:val="9"/>
     <w:rsid w:val="008558FF"/>
     <w:rPr>
-      <w:rFonts w:asciiTheme="majorHAnsi" w:hAnsiTheme="majorHAnsi" w:eastAsiaTheme="majorEastAsia" w:cstheme="majorBidi"/>
+      <w:rFonts w:asciiTheme="majorHAnsi" w:eastAsiaTheme="majorEastAsia" w:hAnsiTheme="majorHAnsi" w:cstheme="majorBidi"/>
       <w:color w:val="0F4761" w:themeColor="accent1" w:themeShade="BF"/>
       <w:sz w:val="32"/>
       <w:szCs w:val="32"/>
     </w:rPr>
   </w:style>
-  <w:style w:type="character" w:styleId="Heading3Char" w:customStyle="1">
+  <w:style w:type="character" w:customStyle="1" w:styleId="Heading3Char">
     <w:name w:val="Heading 3 Char"/>
     <w:basedOn w:val="DefaultParagraphFont"/>
     <w:link w:val="Heading3"/>
@@ -4249,7 +5426,7 @@
       <w:szCs w:val="28"/>
     </w:rPr>
   </w:style>
-  <w:style w:type="character" w:styleId="Heading4Char" w:customStyle="1">
+  <w:style w:type="character" w:customStyle="1" w:styleId="Heading4Char">
     <w:name w:val="Heading 4 Char"/>
     <w:basedOn w:val="DefaultParagraphFont"/>
     <w:link w:val="Heading4"/>
@@ -4263,7 +5440,7 @@
       <w:color w:val="0F4761" w:themeColor="accent1" w:themeShade="BF"/>
     </w:rPr>
   </w:style>
-  <w:style w:type="character" w:styleId="Heading5Char" w:customStyle="1">
+  <w:style w:type="character" w:customStyle="1" w:styleId="Heading5Char">
     <w:name w:val="Heading 5 Char"/>
     <w:basedOn w:val="DefaultParagraphFont"/>
     <w:link w:val="Heading5"/>
@@ -4275,7 +5452,7 @@
       <w:color w:val="0F4761" w:themeColor="accent1" w:themeShade="BF"/>
     </w:rPr>
   </w:style>
-  <w:style w:type="character" w:styleId="Heading6Char" w:customStyle="1">
+  <w:style w:type="character" w:customStyle="1" w:styleId="Heading6Char">
     <w:name w:val="Heading 6 Char"/>
     <w:basedOn w:val="DefaultParagraphFont"/>
     <w:link w:val="Heading6"/>
@@ -4289,7 +5466,7 @@
       <w:color w:val="595959" w:themeColor="text1" w:themeTint="A6"/>
     </w:rPr>
   </w:style>
-  <w:style w:type="character" w:styleId="Heading7Char" w:customStyle="1">
+  <w:style w:type="character" w:customStyle="1" w:styleId="Heading7Char">
     <w:name w:val="Heading 7 Char"/>
     <w:basedOn w:val="DefaultParagraphFont"/>
     <w:link w:val="Heading7"/>
@@ -4301,7 +5478,7 @@
       <w:color w:val="595959" w:themeColor="text1" w:themeTint="A6"/>
     </w:rPr>
   </w:style>
-  <w:style w:type="character" w:styleId="Heading8Char" w:customStyle="1">
+  <w:style w:type="character" w:customStyle="1" w:styleId="Heading8Char">
     <w:name w:val="Heading 8 Char"/>
     <w:basedOn w:val="DefaultParagraphFont"/>
     <w:link w:val="Heading8"/>
@@ -4315,7 +5492,7 @@
       <w:color w:val="272727" w:themeColor="text1" w:themeTint="D8"/>
     </w:rPr>
   </w:style>
-  <w:style w:type="character" w:styleId="Heading9Char" w:customStyle="1">
+  <w:style w:type="character" w:customStyle="1" w:styleId="Heading9Char">
     <w:name w:val="Heading 9 Char"/>
     <w:basedOn w:val="DefaultParagraphFont"/>
     <w:link w:val="Heading9"/>
@@ -4340,21 +5517,21 @@
       <w:contextualSpacing/>
     </w:pPr>
     <w:rPr>
-      <w:rFonts w:asciiTheme="majorHAnsi" w:hAnsiTheme="majorHAnsi" w:eastAsiaTheme="majorEastAsia" w:cstheme="majorBidi"/>
+      <w:rFonts w:asciiTheme="majorHAnsi" w:eastAsiaTheme="majorEastAsia" w:hAnsiTheme="majorHAnsi" w:cstheme="majorBidi"/>
       <w:spacing w:val="-10"/>
       <w:kern w:val="28"/>
       <w:sz w:val="56"/>
       <w:szCs w:val="56"/>
     </w:rPr>
   </w:style>
-  <w:style w:type="character" w:styleId="TitleChar" w:customStyle="1">
+  <w:style w:type="character" w:customStyle="1" w:styleId="TitleChar">
     <w:name w:val="Title Char"/>
     <w:basedOn w:val="DefaultParagraphFont"/>
     <w:link w:val="Title"/>
     <w:uiPriority w:val="10"/>
     <w:rsid w:val="008558FF"/>
     <w:rPr>
-      <w:rFonts w:asciiTheme="majorHAnsi" w:hAnsiTheme="majorHAnsi" w:eastAsiaTheme="majorEastAsia" w:cstheme="majorBidi"/>
+      <w:rFonts w:asciiTheme="majorHAnsi" w:eastAsiaTheme="majorEastAsia" w:hAnsiTheme="majorHAnsi" w:cstheme="majorBidi"/>
       <w:spacing w:val="-10"/>
       <w:kern w:val="28"/>
       <w:sz w:val="56"/>
@@ -4382,7 +5559,7 @@
       <w:szCs w:val="28"/>
     </w:rPr>
   </w:style>
-  <w:style w:type="character" w:styleId="SubtitleChar" w:customStyle="1">
+  <w:style w:type="character" w:customStyle="1" w:styleId="SubtitleChar">
     <w:name w:val="Subtitle Char"/>
     <w:basedOn w:val="DefaultParagraphFont"/>
     <w:link w:val="Subtitle"/>
@@ -4414,7 +5591,7 @@
       <w:color w:val="404040" w:themeColor="text1" w:themeTint="BF"/>
     </w:rPr>
   </w:style>
-  <w:style w:type="character" w:styleId="QuoteChar" w:customStyle="1">
+  <w:style w:type="character" w:customStyle="1" w:styleId="QuoteChar">
     <w:name w:val="Quote Char"/>
     <w:basedOn w:val="DefaultParagraphFont"/>
     <w:link w:val="Quote"/>
@@ -4459,8 +5636,8 @@
     <w:rsid w:val="008558FF"/>
     <w:pPr>
       <w:pBdr>
-        <w:top w:val="single" w:color="0F4761" w:themeColor="accent1" w:themeShade="BF" w:sz="4" w:space="10"/>
-        <w:bottom w:val="single" w:color="0F4761" w:themeColor="accent1" w:themeShade="BF" w:sz="4" w:space="10"/>
+        <w:top w:val="single" w:sz="4" w:space="10" w:color="0F4761" w:themeColor="accent1" w:themeShade="BF"/>
+        <w:bottom w:val="single" w:sz="4" w:space="10" w:color="0F4761" w:themeColor="accent1" w:themeShade="BF"/>
       </w:pBdr>
       <w:spacing w:before="360" w:after="360"/>
       <w:ind w:left="864" w:right="864"/>
@@ -4472,7 +5649,7 @@
       <w:color w:val="0F4761" w:themeColor="accent1" w:themeShade="BF"/>
     </w:rPr>
   </w:style>
-  <w:style w:type="character" w:styleId="IntenseQuoteChar" w:customStyle="1">
+  <w:style w:type="character" w:customStyle="1" w:styleId="IntenseQuoteChar">
     <w:name w:val="Intense Quote Char"/>
     <w:basedOn w:val="DefaultParagraphFont"/>
     <w:link w:val="IntenseQuote"/>
@@ -4509,7 +5686,7 @@
       <w:spacing w:before="100" w:beforeAutospacing="1" w:after="100" w:afterAutospacing="1" w:line="240" w:lineRule="auto"/>
     </w:pPr>
     <w:rPr>
-      <w:rFonts w:ascii="Times New Roman" w:hAnsi="Times New Roman" w:eastAsia="Times New Roman" w:cs="Times New Roman"/>
+      <w:rFonts w:ascii="Times New Roman" w:eastAsia="Times New Roman" w:hAnsi="Times New Roman" w:cs="Times New Roman"/>
       <w:kern w:val="0"/>
       <w14:ligatures w14:val="none"/>
     </w:rPr>
@@ -4552,7 +5729,7 @@
 </file>
 
 <file path=word/theme/theme1.xml><?xml version="1.0" encoding="utf-8"?>
-<a:theme xmlns:a="http://schemas.openxmlformats.org/drawingml/2006/main" xmlns:thm15="http://schemas.microsoft.com/office/thememl/2012/main" name="Office Theme">
+<a:theme xmlns:a="http://schemas.openxmlformats.org/drawingml/2006/main" name="Office Theme">
   <a:themeElements>
     <a:clrScheme name="Office">
       <a:dk1>

</xml_diff>